<commit_message>
Guide: roles and admins, ☰ menu, Users page, rolling 24-hour FLUX limit; one docx + one PDF
</commit_message>
<xml_diff>
--- a/Vid Studio — инструкция от А до Я.docx
+++ b/Vid Studio — инструкция от А до Я.docx
@@ -81,7 +81,7 @@
         <w:jc w:val="center"/>
       </w:pPr>
       <w:r>
-        <w:t>Версия от 29.10.2026 (аккаунты Студии и каналы, шаблон «Спорт и Здоровье», кнопки в Telegram) · n8n 2.45.4</w:t>
+        <w:t>Версия от 29.10.2026 (аккаунты Студии, роли и админы, каналы, шаблон «Спорт и Здоровье», кнопки в Telegram) · n8n 2.45.4</w:t>
       </w:r>
     </w:p>
     <w:p>
@@ -101,14 +101,13 @@
           <w:sz w:val="34"/>
           <w:szCs w:val="34"/>
         </w:rPr>
-        <w:lastRenderedPageBreak/>
         <w:t>Содержание</w:t>
       </w:r>
     </w:p>
     <w:sdt>
       <w:sdtPr>
         <w:alias w:val="Содержание"/>
-        <w:id w:val="722565493"/>
+        <w:id w:val="685800070"/>
         <w:docPartObj>
           <w:docPartGallery w:val="Table of Contents"/>
           <w:docPartUnique/>
@@ -140,7 +139,7 @@
           <w:r>
             <w:fldChar w:fldCharType="separate"/>
           </w:r>
-          <w:hyperlink w:anchor="_Toc244131536" w:history="1">
+          <w:hyperlink w:anchor="_Toc244133843" w:history="1">
             <w:r>
               <w:rPr>
                 <w:rStyle w:val="Hyperlink"/>
@@ -164,7 +163,7 @@
               <w:rPr>
                 <w:noProof/>
               </w:rPr>
-              <w:instrText xml:space="preserve"> PAGEREF _Toc244131536 \h </w:instrText>
+              <w:instrText xml:space="preserve"> PAGEREF _Toc244133843 \h </w:instrText>
             </w:r>
             <w:r>
               <w:rPr>
@@ -206,7 +205,7 @@
               <w14:ligatures w14:val="standardContextual"/>
             </w:rPr>
           </w:pPr>
-          <w:hyperlink w:anchor="_Toc244131537" w:history="1">
+          <w:hyperlink w:anchor="_Toc244133844" w:history="1">
             <w:r>
               <w:rPr>
                 <w:rStyle w:val="Hyperlink"/>
@@ -230,7 +229,7 @@
               <w:rPr>
                 <w:noProof/>
               </w:rPr>
-              <w:instrText xml:space="preserve"> PAGEREF _Toc244131537 \h </w:instrText>
+              <w:instrText xml:space="preserve"> PAGEREF _Toc244133844 \h </w:instrText>
             </w:r>
             <w:r>
               <w:rPr>
@@ -272,7 +271,7 @@
               <w14:ligatures w14:val="standardContextual"/>
             </w:rPr>
           </w:pPr>
-          <w:hyperlink w:anchor="_Toc244131538" w:history="1">
+          <w:hyperlink w:anchor="_Toc244133845" w:history="1">
             <w:r>
               <w:rPr>
                 <w:rStyle w:val="Hyperlink"/>
@@ -296,7 +295,7 @@
               <w:rPr>
                 <w:noProof/>
               </w:rPr>
-              <w:instrText xml:space="preserve"> PAGEREF _Toc244131538 \h </w:instrText>
+              <w:instrText xml:space="preserve"> PAGEREF _Toc244133845 \h </w:instrText>
             </w:r>
             <w:r>
               <w:rPr>
@@ -338,7 +337,7 @@
               <w14:ligatures w14:val="standardContextual"/>
             </w:rPr>
           </w:pPr>
-          <w:hyperlink w:anchor="_Toc244131539" w:history="1">
+          <w:hyperlink w:anchor="_Toc244133846" w:history="1">
             <w:r>
               <w:rPr>
                 <w:rStyle w:val="Hyperlink"/>
@@ -362,7 +361,7 @@
               <w:rPr>
                 <w:noProof/>
               </w:rPr>
-              <w:instrText xml:space="preserve"> PAGEREF _Toc244131539 \h </w:instrText>
+              <w:instrText xml:space="preserve"> PAGEREF _Toc244133846 \h </w:instrText>
             </w:r>
             <w:r>
               <w:rPr>
@@ -404,7 +403,7 @@
               <w14:ligatures w14:val="standardContextual"/>
             </w:rPr>
           </w:pPr>
-          <w:hyperlink w:anchor="_Toc244131540" w:history="1">
+          <w:hyperlink w:anchor="_Toc244133847" w:history="1">
             <w:r>
               <w:rPr>
                 <w:rStyle w:val="Hyperlink"/>
@@ -428,7 +427,7 @@
               <w:rPr>
                 <w:noProof/>
               </w:rPr>
-              <w:instrText xml:space="preserve"> PAGEREF _Toc244131540 \h </w:instrText>
+              <w:instrText xml:space="preserve"> PAGEREF _Toc244133847 \h </w:instrText>
             </w:r>
             <w:r>
               <w:rPr>
@@ -470,7 +469,7 @@
               <w14:ligatures w14:val="standardContextual"/>
             </w:rPr>
           </w:pPr>
-          <w:hyperlink w:anchor="_Toc244131541" w:history="1">
+          <w:hyperlink w:anchor="_Toc244133848" w:history="1">
             <w:r>
               <w:rPr>
                 <w:rStyle w:val="Hyperlink"/>
@@ -494,7 +493,7 @@
               <w:rPr>
                 <w:noProof/>
               </w:rPr>
-              <w:instrText xml:space="preserve"> PAGEREF _Toc244131541 \h </w:instrText>
+              <w:instrText xml:space="preserve"> PAGEREF _Toc244133848 \h </w:instrText>
             </w:r>
             <w:r>
               <w:rPr>
@@ -536,7 +535,7 @@
               <w14:ligatures w14:val="standardContextual"/>
             </w:rPr>
           </w:pPr>
-          <w:hyperlink w:anchor="_Toc244131542" w:history="1">
+          <w:hyperlink w:anchor="_Toc244133849" w:history="1">
             <w:r>
               <w:rPr>
                 <w:rStyle w:val="Hyperlink"/>
@@ -560,7 +559,7 @@
               <w:rPr>
                 <w:noProof/>
               </w:rPr>
-              <w:instrText xml:space="preserve"> PAGEREF _Toc244131542 \h </w:instrText>
+              <w:instrText xml:space="preserve"> PAGEREF _Toc244133849 \h </w:instrText>
             </w:r>
             <w:r>
               <w:rPr>
@@ -602,7 +601,7 @@
               <w14:ligatures w14:val="standardContextual"/>
             </w:rPr>
           </w:pPr>
-          <w:hyperlink w:anchor="_Toc244131543" w:history="1">
+          <w:hyperlink w:anchor="_Toc244133850" w:history="1">
             <w:r>
               <w:rPr>
                 <w:rStyle w:val="Hyperlink"/>
@@ -626,7 +625,7 @@
               <w:rPr>
                 <w:noProof/>
               </w:rPr>
-              <w:instrText xml:space="preserve"> PAGEREF _Toc244131543 \h </w:instrText>
+              <w:instrText xml:space="preserve"> PAGEREF _Toc244133850 \h </w:instrText>
             </w:r>
             <w:r>
               <w:rPr>
@@ -643,7 +642,7 @@
               <w:rPr>
                 <w:noProof/>
               </w:rPr>
-              <w:t>10</w:t>
+              <w:t>11</w:t>
             </w:r>
             <w:r>
               <w:rPr>
@@ -668,7 +667,7 @@
               <w14:ligatures w14:val="standardContextual"/>
             </w:rPr>
           </w:pPr>
-          <w:hyperlink w:anchor="_Toc244131544" w:history="1">
+          <w:hyperlink w:anchor="_Toc244133851" w:history="1">
             <w:r>
               <w:rPr>
                 <w:rStyle w:val="Hyperlink"/>
@@ -692,7 +691,7 @@
               <w:rPr>
                 <w:noProof/>
               </w:rPr>
-              <w:instrText xml:space="preserve"> PAGEREF _Toc244131544 \h </w:instrText>
+              <w:instrText xml:space="preserve"> PAGEREF _Toc244133851 \h </w:instrText>
             </w:r>
             <w:r>
               <w:rPr>
@@ -734,7 +733,7 @@
               <w14:ligatures w14:val="standardContextual"/>
             </w:rPr>
           </w:pPr>
-          <w:hyperlink w:anchor="_Toc244131545" w:history="1">
+          <w:hyperlink w:anchor="_Toc244133852" w:history="1">
             <w:r>
               <w:rPr>
                 <w:rStyle w:val="Hyperlink"/>
@@ -758,7 +757,7 @@
               <w:rPr>
                 <w:noProof/>
               </w:rPr>
-              <w:instrText xml:space="preserve"> PAGEREF _Toc244131545 \h </w:instrText>
+              <w:instrText xml:space="preserve"> PAGEREF _Toc244133852 \h </w:instrText>
             </w:r>
             <w:r>
               <w:rPr>
@@ -800,7 +799,7 @@
               <w14:ligatures w14:val="standardContextual"/>
             </w:rPr>
           </w:pPr>
-          <w:hyperlink w:anchor="_Toc244131546" w:history="1">
+          <w:hyperlink w:anchor="_Toc244133853" w:history="1">
             <w:r>
               <w:rPr>
                 <w:rStyle w:val="Hyperlink"/>
@@ -824,7 +823,7 @@
               <w:rPr>
                 <w:noProof/>
               </w:rPr>
-              <w:instrText xml:space="preserve"> PAGEREF _Toc244131546 \h </w:instrText>
+              <w:instrText xml:space="preserve"> PAGEREF _Toc244133853 \h </w:instrText>
             </w:r>
             <w:r>
               <w:rPr>
@@ -866,7 +865,7 @@
               <w14:ligatures w14:val="standardContextual"/>
             </w:rPr>
           </w:pPr>
-          <w:hyperlink w:anchor="_Toc244131547" w:history="1">
+          <w:hyperlink w:anchor="_Toc244133854" w:history="1">
             <w:r>
               <w:rPr>
                 <w:rStyle w:val="Hyperlink"/>
@@ -890,7 +889,7 @@
               <w:rPr>
                 <w:noProof/>
               </w:rPr>
-              <w:instrText xml:space="preserve"> PAGEREF _Toc244131547 \h </w:instrText>
+              <w:instrText xml:space="preserve"> PAGEREF _Toc244133854 \h </w:instrText>
             </w:r>
             <w:r>
               <w:rPr>
@@ -907,7 +906,7 @@
               <w:rPr>
                 <w:noProof/>
               </w:rPr>
-              <w:t>15</w:t>
+              <w:t>16</w:t>
             </w:r>
             <w:r>
               <w:rPr>
@@ -932,7 +931,7 @@
               <w14:ligatures w14:val="standardContextual"/>
             </w:rPr>
           </w:pPr>
-          <w:hyperlink w:anchor="_Toc244131548" w:history="1">
+          <w:hyperlink w:anchor="_Toc244133855" w:history="1">
             <w:r>
               <w:rPr>
                 <w:rStyle w:val="Hyperlink"/>
@@ -956,7 +955,7 @@
               <w:rPr>
                 <w:noProof/>
               </w:rPr>
-              <w:instrText xml:space="preserve"> PAGEREF _Toc244131548 \h </w:instrText>
+              <w:instrText xml:space="preserve"> PAGEREF _Toc244133855 \h </w:instrText>
             </w:r>
             <w:r>
               <w:rPr>
@@ -973,7 +972,7 @@
               <w:rPr>
                 <w:noProof/>
               </w:rPr>
-              <w:t>16</w:t>
+              <w:t>17</w:t>
             </w:r>
             <w:r>
               <w:rPr>
@@ -998,7 +997,7 @@
               <w14:ligatures w14:val="standardContextual"/>
             </w:rPr>
           </w:pPr>
-          <w:hyperlink w:anchor="_Toc244131549" w:history="1">
+          <w:hyperlink w:anchor="_Toc244133856" w:history="1">
             <w:r>
               <w:rPr>
                 <w:rStyle w:val="Hyperlink"/>
@@ -1022,7 +1021,7 @@
               <w:rPr>
                 <w:noProof/>
               </w:rPr>
-              <w:instrText xml:space="preserve"> PAGEREF _Toc244131549 \h </w:instrText>
+              <w:instrText xml:space="preserve"> PAGEREF _Toc244133856 \h </w:instrText>
             </w:r>
             <w:r>
               <w:rPr>
@@ -1064,7 +1063,7 @@
               <w14:ligatures w14:val="standardContextual"/>
             </w:rPr>
           </w:pPr>
-          <w:hyperlink w:anchor="_Toc244131550" w:history="1">
+          <w:hyperlink w:anchor="_Toc244133857" w:history="1">
             <w:r>
               <w:rPr>
                 <w:rStyle w:val="Hyperlink"/>
@@ -1088,7 +1087,7 @@
               <w:rPr>
                 <w:noProof/>
               </w:rPr>
-              <w:instrText xml:space="preserve"> PAGEREF _Toc244131550 \h </w:instrText>
+              <w:instrText xml:space="preserve"> PAGEREF _Toc244133857 \h </w:instrText>
             </w:r>
             <w:r>
               <w:rPr>
@@ -1130,7 +1129,7 @@
               <w14:ligatures w14:val="standardContextual"/>
             </w:rPr>
           </w:pPr>
-          <w:hyperlink w:anchor="_Toc244131551" w:history="1">
+          <w:hyperlink w:anchor="_Toc244133858" w:history="1">
             <w:r>
               <w:rPr>
                 <w:rStyle w:val="Hyperlink"/>
@@ -1154,7 +1153,7 @@
               <w:rPr>
                 <w:noProof/>
               </w:rPr>
-              <w:instrText xml:space="preserve"> PAGEREF _Toc244131551 \h </w:instrText>
+              <w:instrText xml:space="preserve"> PAGEREF _Toc244133858 \h </w:instrText>
             </w:r>
             <w:r>
               <w:rPr>
@@ -1196,7 +1195,7 @@
               <w14:ligatures w14:val="standardContextual"/>
             </w:rPr>
           </w:pPr>
-          <w:hyperlink w:anchor="_Toc244131552" w:history="1">
+          <w:hyperlink w:anchor="_Toc244133859" w:history="1">
             <w:r>
               <w:rPr>
                 <w:rStyle w:val="Hyperlink"/>
@@ -1220,7 +1219,7 @@
               <w:rPr>
                 <w:noProof/>
               </w:rPr>
-              <w:instrText xml:space="preserve"> PAGEREF _Toc244131552 \h </w:instrText>
+              <w:instrText xml:space="preserve"> PAGEREF _Toc244133859 \h </w:instrText>
             </w:r>
             <w:r>
               <w:rPr>
@@ -1237,7 +1236,7 @@
               <w:rPr>
                 <w:noProof/>
               </w:rPr>
-              <w:t>21</w:t>
+              <w:t>22</w:t>
             </w:r>
             <w:r>
               <w:rPr>
@@ -1262,7 +1261,7 @@
               <w14:ligatures w14:val="standardContextual"/>
             </w:rPr>
           </w:pPr>
-          <w:hyperlink w:anchor="_Toc244131553" w:history="1">
+          <w:hyperlink w:anchor="_Toc244133860" w:history="1">
             <w:r>
               <w:rPr>
                 <w:rStyle w:val="Hyperlink"/>
@@ -1286,7 +1285,7 @@
               <w:rPr>
                 <w:noProof/>
               </w:rPr>
-              <w:instrText xml:space="preserve"> PAGEREF _Toc244131553 \h </w:instrText>
+              <w:instrText xml:space="preserve"> PAGEREF _Toc244133860 \h </w:instrText>
             </w:r>
             <w:r>
               <w:rPr>
@@ -1303,7 +1302,7 @@
               <w:rPr>
                 <w:noProof/>
               </w:rPr>
-              <w:t>21</w:t>
+              <w:t>22</w:t>
             </w:r>
             <w:r>
               <w:rPr>
@@ -1328,7 +1327,7 @@
               <w14:ligatures w14:val="standardContextual"/>
             </w:rPr>
           </w:pPr>
-          <w:hyperlink w:anchor="_Toc244131554" w:history="1">
+          <w:hyperlink w:anchor="_Toc244133861" w:history="1">
             <w:r>
               <w:rPr>
                 <w:rStyle w:val="Hyperlink"/>
@@ -1352,7 +1351,7 @@
               <w:rPr>
                 <w:noProof/>
               </w:rPr>
-              <w:instrText xml:space="preserve"> PAGEREF _Toc244131554 \h </w:instrText>
+              <w:instrText xml:space="preserve"> PAGEREF _Toc244133861 \h </w:instrText>
             </w:r>
             <w:r>
               <w:rPr>
@@ -1394,7 +1393,7 @@
               <w14:ligatures w14:val="standardContextual"/>
             </w:rPr>
           </w:pPr>
-          <w:hyperlink w:anchor="_Toc244131555" w:history="1">
+          <w:hyperlink w:anchor="_Toc244133862" w:history="1">
             <w:r>
               <w:rPr>
                 <w:rStyle w:val="Hyperlink"/>
@@ -1418,7 +1417,7 @@
               <w:rPr>
                 <w:noProof/>
               </w:rPr>
-              <w:instrText xml:space="preserve"> PAGEREF _Toc244131555 \h </w:instrText>
+              <w:instrText xml:space="preserve"> PAGEREF _Toc244133862 \h </w:instrText>
             </w:r>
             <w:r>
               <w:rPr>
@@ -1435,7 +1434,7 @@
               <w:rPr>
                 <w:noProof/>
               </w:rPr>
-              <w:t>22</w:t>
+              <w:t>23</w:t>
             </w:r>
             <w:r>
               <w:rPr>
@@ -1460,7 +1459,7 @@
               <w14:ligatures w14:val="standardContextual"/>
             </w:rPr>
           </w:pPr>
-          <w:hyperlink w:anchor="_Toc244131556" w:history="1">
+          <w:hyperlink w:anchor="_Toc244133863" w:history="1">
             <w:r>
               <w:rPr>
                 <w:rStyle w:val="Hyperlink"/>
@@ -1484,7 +1483,7 @@
               <w:rPr>
                 <w:noProof/>
               </w:rPr>
-              <w:instrText xml:space="preserve"> PAGEREF _Toc244131556 \h </w:instrText>
+              <w:instrText xml:space="preserve"> PAGEREF _Toc244133863 \h </w:instrText>
             </w:r>
             <w:r>
               <w:rPr>
@@ -1527,9 +1526,8 @@
       <w:pPr>
         <w:pStyle w:val="Heading1"/>
       </w:pPr>
-      <w:bookmarkStart w:id="0" w:name="_Toc244131536"/>
-      <w:r>
-        <w:lastRenderedPageBreak/>
+      <w:bookmarkStart w:id="0" w:name="_Toc244133843"/>
+      <w:r>
         <w:t>1. Что это и как работает</w:t>
       </w:r>
       <w:bookmarkEnd w:id="0"/>
@@ -1955,7 +1953,7 @@
           </w:tcPr>
           <w:p>
             <w:r>
-              <w:t>AI-картинка на каждую сцену, сверху плашка «BUSINESS #N» и главная цифра. Если дневной лимит кончился — настоящее фото, если и его нет — карточка с цифрой</w:t>
+              <w:t>AI-картинка на каждую сцену, сверху плашка «BUSINESS #N» и главная цифра. Если лимит FLUX кончился — настоящее фото, если и его нет — карточка с цифрой</w:t>
             </w:r>
           </w:p>
         </w:tc>
@@ -2071,7 +2069,6 @@
           </w:tcPr>
           <w:p>
             <w:r>
-              <w:lastRenderedPageBreak/>
               <w:t>6. Publish</w:t>
             </w:r>
           </w:p>
@@ -2432,7 +2429,7 @@
       <w:pPr>
         <w:pStyle w:val="Heading1"/>
       </w:pPr>
-      <w:bookmarkStart w:id="1" w:name="_Toc244131537"/>
+      <w:bookmarkStart w:id="1" w:name="_Toc244133844"/>
       <w:r>
         <w:t>2. Запуск одной кнопкой</w:t>
       </w:r>
@@ -2668,9 +2665,8 @@
       <w:pPr>
         <w:pStyle w:val="Heading1"/>
       </w:pPr>
-      <w:bookmarkStart w:id="2" w:name="_Toc244131538"/>
-      <w:r>
-        <w:lastRenderedPageBreak/>
+      <w:bookmarkStart w:id="2" w:name="_Toc244133845"/>
+      <w:r>
         <w:t>3. Где хранится проект — все файлы</w:t>
       </w:r>
       <w:bookmarkEnd w:id="2"/>
@@ -3583,7 +3579,6 @@
                 <w:szCs w:val="20"/>
                 <w:shd w:val="clear" w:color="auto" w:fill="EFEFEF"/>
               </w:rPr>
-              <w:lastRenderedPageBreak/>
               <w:t>PROJECT_STATE.md</w:t>
             </w:r>
             <w:r>
@@ -3752,7 +3747,7 @@
       <w:pPr>
         <w:pStyle w:val="Heading1"/>
       </w:pPr>
-      <w:bookmarkStart w:id="3" w:name="_Toc244131539"/>
+      <w:bookmarkStart w:id="3" w:name="_Toc244133846"/>
       <w:r>
         <w:t>4. Что сделано и что осталось</w:t>
       </w:r>
@@ -3971,8 +3966,20 @@
         <w:spacing w:after="80"/>
       </w:pPr>
       <w:r>
-        <w:lastRenderedPageBreak/>
         <w:t>Аккаунты Студии (почта + пароль, согласие на рассылку, список подписчиков), несколько каналов с отдельными входами и настройками, шаблон «Спорт и Здоровье», кнопки «Publish now» / «Delete from YouTube» в Telegram.</w:t>
+      </w:r>
+    </w:p>
+    <w:p>
+      <w:pPr>
+        <w:pStyle w:val="ListParagraph"/>
+        <w:numPr>
+          <w:ilvl w:val="0"/>
+          <w:numId w:val="2"/>
+        </w:numPr>
+        <w:spacing w:after="80"/>
+      </w:pPr>
+      <w:r>
+        <w:t>Роли: супер-админ, владелец, админ и пользователь; страница Users с поиском по почте и ID, сменой пароля, блокировкой, выходом из Студии и удалением; меню ☰ с Users, My account и Log out.</w:t>
       </w:r>
     </w:p>
     <w:p>
@@ -4124,7 +4131,7 @@
           </w:tcPr>
           <w:p>
             <w:r>
-              <w:t>Создать аккаунт владельца на странице входа Студии</w:t>
+              <w:t>Аккаунт супер-админа создан (nikita1994p@gmail.com). Сделать админами помощников, если нужно: ☰ → Users → Role</w:t>
             </w:r>
           </w:p>
         </w:tc>
@@ -4140,7 +4147,7 @@
           </w:tcPr>
           <w:p>
             <w:r>
-              <w:t>21</w:t>
+              <w:t>21.5</w:t>
             </w:r>
           </w:p>
         </w:tc>
@@ -4592,17 +4599,14 @@
         <w:t>⚠</w:t>
       </w:r>
       <w:r>
-        <w:t xml:space="preserve"> </w:t>
-      </w:r>
-      <w:r>
-        <w:t>Код публикации в соцсети написан по документации платформ, но настоящая проверка — первый пост с вашим аккаунтом. Если платформа ответит ошибкой, текст ошибки появится на странице ролика — пришлите его мне.</w:t>
+        <w:t xml:space="preserve"> Код публикации в соцсети написан по документации платформ, но настоящая проверка — первый пост с вашим аккаунтом. Если платформа ответит ошибкой, текст ошибки появится на странице ролика — пришлите его мне.</w:t>
       </w:r>
     </w:p>
     <w:p>
       <w:pPr>
         <w:pStyle w:val="Heading1"/>
       </w:pPr>
-      <w:bookmarkStart w:id="4" w:name="_Toc244131540"/>
+      <w:bookmarkStart w:id="4" w:name="_Toc244133847"/>
       <w:r>
         <w:t>5. Ниша: что выбрано и почему</w:t>
       </w:r>
@@ -4736,7 +4740,6 @@
           <w:b/>
           <w:bCs/>
         </w:rPr>
-        <w:lastRenderedPageBreak/>
         <w:t>Обещания дохода</w:t>
       </w:r>
       <w:r>
@@ -4805,7 +4808,7 @@
       <w:pPr>
         <w:pStyle w:val="Heading1"/>
       </w:pPr>
-      <w:bookmarkStart w:id="5" w:name="_Toc244131541"/>
+      <w:bookmarkStart w:id="5" w:name="_Toc244133848"/>
       <w:r>
         <w:t>6. Как строится сценарий</w:t>
       </w:r>
@@ -5357,7 +5360,6 @@
                 <w:b/>
                 <w:bCs/>
               </w:rPr>
-              <w:lastRenderedPageBreak/>
               <w:t>Любопытство</w:t>
             </w:r>
           </w:p>
@@ -5756,7 +5758,7 @@
       <w:pPr>
         <w:pStyle w:val="Heading1"/>
       </w:pPr>
-      <w:bookmarkStart w:id="6" w:name="_Toc244131542"/>
+      <w:bookmarkStart w:id="6" w:name="_Toc244133849"/>
       <w:r>
         <w:t>7. Картинки: бесплатно</w:t>
       </w:r>
@@ -5903,7 +5905,17 @@
           </w:tcPr>
           <w:p>
             <w:r>
-              <w:t xml:space="preserve">Автоматически. Бесплатно 10 000 «нейронов» в день ≈ 100 картинок (≈ 15 роликов). Лимит сбрасывается в 00:00 UTC = 02:00 по Киеву (летом 03:00). Лицензия Apache 2.0. Ключи </w:t>
+              <w:t xml:space="preserve">Автоматически. Бесплатно 10 000 «нейронов» за </w:t>
+            </w:r>
+            <w:r>
+              <w:rPr>
+                <w:b/>
+                <w:bCs/>
+              </w:rPr>
+              <w:t>скользящие 24 часа</w:t>
+            </w:r>
+            <w:r>
+              <w:t xml:space="preserve"> ≈ 130 картинок (≈ 20 роликов) на все каналы вместе. Лимит не обнуляется в полночь: картинки снова рисуются, когда самые старые из последних 24 часов выходят из окна. Лицензия Apache 2.0. Ключи </w:t>
             </w:r>
             <w:r>
               <w:rPr>
@@ -5990,7 +6002,7 @@
           </w:tcPr>
           <w:p>
             <w:r>
-              <w:t>Если лимит FLUX на сегодня кончился. Автор фото указывается в описании автоматически</w:t>
+              <w:t>Если лимит FLUX кончился. Автор фото указывается в описании автоматически</w:t>
             </w:r>
           </w:p>
         </w:tc>
@@ -6117,7 +6129,6 @@
         <w:spacing w:after="120"/>
       </w:pPr>
       <w:r>
-        <w:lastRenderedPageBreak/>
         <w:t xml:space="preserve">Стиль картинок (например «photorealistic, cinematic light» или «3D cartoon») — </w:t>
       </w:r>
       <w:r>
@@ -6147,7 +6158,85 @@
         <w:t xml:space="preserve"> </w:t>
       </w:r>
       <w:r>
-        <w:t>Если в Telegram пришло «⚠ FLUX pictures stopped working today», значит, дневной лимит кончился (обычно из-за большого числа тестовых роликов за день). Это не поломка: ролик всё равно делается — с фото или карточками с цифрами. После 02:00 по Киеву картинки снова рисуются; у готового ролика их можно заменить вручную (ниже).</w:t>
+        <w:t xml:space="preserve">Если в Telegram пришло «⚠ FLUX pictures stopped working», значит, лимит за последние 24 часа кончился (обычно из-за большого числа тестовых роликов). Это не поломка: ролик всё равно делается — с фото или карточками с цифрами. Лимит считается за </w:t>
+      </w:r>
+      <w:r>
+        <w:rPr>
+          <w:b/>
+          <w:bCs/>
+        </w:rPr>
+        <w:t>скользящие 24 часа</w:t>
+      </w:r>
+      <w:r>
+        <w:t>, а не по календарным суткам: панель Cloudflare может показывать «0/10k today», а картинки всё ещё не рисуются. Они вернутся сами, когда из окна выйдут вчерашние картинки. У готового ролика картинки можно заменить вручную (ниже).</w:t>
+      </w:r>
+    </w:p>
+    <w:p>
+      <w:pPr>
+        <w:pStyle w:val="Heading2"/>
+      </w:pPr>
+      <w:r>
+        <w:t>Если картинок не хватает</w:t>
+      </w:r>
+    </w:p>
+    <w:p>
+      <w:pPr>
+        <w:pStyle w:val="ListParagraph"/>
+        <w:numPr>
+          <w:ilvl w:val="0"/>
+          <w:numId w:val="3"/>
+        </w:numPr>
+        <w:spacing w:after="60"/>
+      </w:pPr>
+      <w:r>
+        <w:rPr>
+          <w:b/>
+          <w:bCs/>
+        </w:rPr>
+        <w:t>Второй бесплатный аккаунт Cloudflare — не вариант.</w:t>
+      </w:r>
+      <w:r>
+        <w:t xml:space="preserve"> Заводить несколько аккаунтов, чтобы обойти бесплатный лимит, против правил Cloudflare: можно потерять оба аккаунта вместе с ключами.</w:t>
+      </w:r>
+    </w:p>
+    <w:p>
+      <w:pPr>
+        <w:pStyle w:val="ListParagraph"/>
+        <w:numPr>
+          <w:ilvl w:val="0"/>
+          <w:numId w:val="3"/>
+        </w:numPr>
+        <w:spacing w:after="60"/>
+      </w:pPr>
+      <w:r>
+        <w:rPr>
+          <w:b/>
+          <w:bCs/>
+        </w:rPr>
+        <w:t>Меньше шагов FLUX</w:t>
+      </w:r>
+      <w:r>
+        <w:t>: Settings → Picture → FLUX quality steps с 6 до 4. Картинка дешевле примерно на четверть — около 170 картинок за 24 часа, детализация чуть ниже.</w:t>
+      </w:r>
+    </w:p>
+    <w:p>
+      <w:pPr>
+        <w:pStyle w:val="ListParagraph"/>
+        <w:numPr>
+          <w:ilvl w:val="0"/>
+          <w:numId w:val="3"/>
+        </w:numPr>
+        <w:spacing w:after="60"/>
+      </w:pPr>
+      <w:r>
+        <w:rPr>
+          <w:b/>
+          <w:bCs/>
+        </w:rPr>
+        <w:t>Cloudflare Workers Paid</w:t>
+      </w:r>
+      <w:r>
+        <w:t xml:space="preserve"> — $5 в месяц, когда каналов станет много: те же 10 000 нейронов бесплатно, дальше примерно $0,011 за 1000 нейронов — около полцента за ролик.</w:t>
       </w:r>
     </w:p>
     <w:p>
@@ -6388,7 +6477,7 @@
       <w:pPr>
         <w:pStyle w:val="Heading1"/>
       </w:pPr>
-      <w:bookmarkStart w:id="7" w:name="_Toc244131543"/>
+      <w:bookmarkStart w:id="7" w:name="_Toc244133850"/>
       <w:r>
         <w:t>8. Создать ролик вручную и версии для A/B-теста</w:t>
       </w:r>
@@ -6764,7 +6853,7 @@
       <w:pPr>
         <w:pStyle w:val="Heading1"/>
       </w:pPr>
-      <w:bookmarkStart w:id="8" w:name="_Toc244131544"/>
+      <w:bookmarkStart w:id="8" w:name="_Toc244133851"/>
       <w:r>
         <w:t>9. Настройки в Студии (Settings)</w:t>
       </w:r>
@@ -7283,7 +7372,6 @@
                 <w:b/>
                 <w:bCs/>
               </w:rPr>
-              <w:lastRenderedPageBreak/>
               <w:t>AI models</w:t>
             </w:r>
           </w:p>
@@ -7331,7 +7419,7 @@
       <w:pPr>
         <w:pStyle w:val="Heading1"/>
       </w:pPr>
-      <w:bookmarkStart w:id="9" w:name="_Toc244131545"/>
+      <w:bookmarkStart w:id="9" w:name="_Toc244133852"/>
       <w:r>
         <w:t>10. Соцсети: вход, выход, смена аккаунта</w:t>
       </w:r>
@@ -7866,7 +7954,6 @@
         <w:spacing w:after="120"/>
       </w:pPr>
       <w:r>
-        <w:lastRenderedPageBreak/>
         <w:t xml:space="preserve">Для статуса In production Google требует главную страницу и политику конфиденциальности на вашем домене. Они уже опубликованы бесплатно через GitHub Pages (папка </w:t>
       </w:r>
       <w:r>
@@ -8519,11 +8606,7 @@
         <w:t>Facebook Login for Business</w:t>
       </w:r>
       <w:r>
-        <w:t xml:space="preserve"> → Valid OAuth </w:t>
-      </w:r>
-      <w:r>
-        <w:lastRenderedPageBreak/>
-        <w:t xml:space="preserve">Redirect URIs → адрес с карточки → App ID и App secret → в Студию → Connect. Если страниц несколько — выберите нужную в списке </w:t>
+        <w:t xml:space="preserve"> → Valid OAuth Redirect URIs → адрес с карточки → App ID и App secret → в Студию → Connect. Если страниц несколько — выберите нужную в списке </w:t>
       </w:r>
       <w:r>
         <w:rPr>
@@ -8718,7 +8801,7 @@
       <w:pPr>
         <w:pStyle w:val="Heading1"/>
       </w:pPr>
-      <w:bookmarkStart w:id="10" w:name="_Toc244131546"/>
+      <w:bookmarkStart w:id="10" w:name="_Toc244133853"/>
       <w:r>
         <w:t>11. Публикация и n8n</w:t>
       </w:r>
@@ -9056,7 +9139,6 @@
         <w:ind w:left="200" w:right="100"/>
       </w:pPr>
       <w:r>
-        <w:lastRenderedPageBreak/>
         <w:t>💡</w:t>
       </w:r>
       <w:r>
@@ -9390,7 +9472,7 @@
       <w:pPr>
         <w:pStyle w:val="Heading1"/>
       </w:pPr>
-      <w:bookmarkStart w:id="11" w:name="_Toc244131547"/>
+      <w:bookmarkStart w:id="11" w:name="_Toc244133854"/>
       <w:r>
         <w:t>12. Заработок и монетизация (Earnings)</w:t>
       </w:r>
@@ -9668,11 +9750,7 @@
           </w:tcPr>
           <w:p>
             <w:r>
-              <w:t xml:space="preserve">Насколько близко к партнёрской программе YouTube: 500 подписчиков + 3 млн просмотров Shorts за 90 дней </w:t>
-            </w:r>
-            <w:r>
-              <w:lastRenderedPageBreak/>
-              <w:t>(донаты, Shopping) и 1 000 + 10 млн (реклама)</w:t>
+              <w:t>Насколько близко к партнёрской программе YouTube: 500 подписчиков + 3 млн просмотров Shorts за 90 дней (донаты, Shopping) и 1 000 + 10 млн (реклама)</w:t>
             </w:r>
           </w:p>
         </w:tc>
@@ -9688,7 +9766,6 @@
           </w:tcPr>
           <w:p>
             <w:r>
-              <w:lastRenderedPageBreak/>
               <w:t>YouTube Analytics. Пороги YouTube 2025 года — могут измениться</w:t>
             </w:r>
           </w:p>
@@ -10020,7 +10097,7 @@
       <w:pPr>
         <w:pStyle w:val="Heading1"/>
       </w:pPr>
-      <w:bookmarkStart w:id="12" w:name="_Toc244131548"/>
+      <w:bookmarkStart w:id="12" w:name="_Toc244133855"/>
       <w:r>
         <w:t>13. Очередь тем, проверка фактов, обложки, Telegram, итоги A/B</w:t>
       </w:r>
@@ -10229,11 +10306,7 @@
           </w:tcPr>
           <w:p>
             <w:r>
-              <w:t xml:space="preserve">ИИ придумывает 30 новых бизнесов, которых нет ни в списке, ни среди снятых. Новые идеи сразу проверяются, сомнительные </w:t>
-            </w:r>
-            <w:r>
-              <w:lastRenderedPageBreak/>
-              <w:t>отбрасываются — их список показывается во всплывающем сообщении</w:t>
+              <w:t>ИИ придумывает 30 новых бизнесов, которых нет ни в списке, ни среди снятых. Новые идеи сразу проверяются, сомнительные отбрасываются — их список показывается во всплывающем сообщении</w:t>
             </w:r>
           </w:p>
         </w:tc>
@@ -10255,7 +10328,6 @@
                 <w:b/>
                 <w:bCs/>
               </w:rPr>
-              <w:lastRenderedPageBreak/>
               <w:t>✔</w:t>
             </w:r>
             <w:r>
@@ -10778,7 +10850,6 @@
                 <w:b/>
                 <w:bCs/>
               </w:rPr>
-              <w:lastRenderedPageBreak/>
               <w:t>off</w:t>
             </w:r>
           </w:p>
@@ -11348,7 +11419,24 @@
         <w:t>Send test</w:t>
       </w:r>
       <w:r>
-        <w:t xml:space="preserve"> — придёт проверочное сообщение.</w:t>
+        <w:t xml:space="preserve"> — придёт проверочное сообщение с кнопкой </w:t>
+      </w:r>
+      <w:r>
+        <w:rPr>
+          <w:b/>
+          <w:bCs/>
+        </w:rPr>
+        <w:t>👆</w:t>
+      </w:r>
+      <w:r>
+        <w:rPr>
+          <w:b/>
+          <w:bCs/>
+        </w:rPr>
+        <w:t xml:space="preserve"> Test button</w:t>
+      </w:r>
+      <w:r>
+        <w:t>. Нажмите её: через несколько секунд Студия допишет в сообщение «✅ The button works…». Значит, нажатия кнопок доходят до Студии.</w:t>
       </w:r>
     </w:p>
     <w:tbl>
@@ -11390,7 +11478,6 @@
                 <w:bCs/>
                 <w:color w:val="FFFFFF"/>
               </w:rPr>
-              <w:lastRenderedPageBreak/>
               <w:t>Событие</w:t>
             </w:r>
           </w:p>
@@ -11524,7 +11611,7 @@
               <w:t>⚠</w:t>
             </w:r>
             <w:r>
-              <w:t xml:space="preserve"> кончился бесплатный дневной лимит картинок (не чаще раза в день)</w:t>
+              <w:t xml:space="preserve"> кончился бесплатный лимит картинок за последние 24 часа (не чаще раза в день)</w:t>
             </w:r>
           </w:p>
         </w:tc>
@@ -11901,7 +11988,29 @@
         <w:spacing w:after="60"/>
       </w:pPr>
       <w:r>
-        <w:t xml:space="preserve">Кнопкам нужно новое разрешение YouTube — «управлять загруженными видео». Поэтому один раз переподключите вход: Студия → </w:t>
+        <w:t xml:space="preserve">Тестовая кнопка из </w:t>
+      </w:r>
+      <w:r>
+        <w:rPr>
+          <w:b/>
+          <w:bCs/>
+        </w:rPr>
+        <w:t>Send test</w:t>
+      </w:r>
+      <w:r>
+        <w:t xml:space="preserve"> работает сразу, а кнопкам </w:t>
+      </w:r>
+      <w:r>
+        <w:t>🌍</w:t>
+      </w:r>
+      <w:r>
+        <w:t xml:space="preserve"> и </w:t>
+      </w:r>
+      <w:r>
+        <w:t>🗑</w:t>
+      </w:r>
+      <w:r>
+        <w:t xml:space="preserve"> нужно новое разрешение YouTube — «управлять загруженными видео». Поэтому один раз переподключите вход: Студия → </w:t>
       </w:r>
       <w:r>
         <w:rPr>
@@ -12042,7 +12151,6 @@
           <w:b/>
           <w:bCs/>
         </w:rPr>
-        <w:lastRenderedPageBreak/>
         <w:t>Hook types</w:t>
       </w:r>
       <w:r>
@@ -12169,7 +12277,7 @@
       <w:pPr>
         <w:pStyle w:val="Heading1"/>
       </w:pPr>
-      <w:bookmarkStart w:id="13" w:name="_Toc244131549"/>
+      <w:bookmarkStart w:id="13" w:name="_Toc244133856"/>
       <w:r>
         <w:t>14. Включить автопилот и настроить Windows</w:t>
       </w:r>
@@ -12553,7 +12661,6 @@
         <w:pStyle w:val="Heading2"/>
       </w:pPr>
       <w:r>
-        <w:lastRenderedPageBreak/>
         <w:t>14.3. Код на GitHub</w:t>
       </w:r>
     </w:p>
@@ -12638,7 +12745,7 @@
       <w:pPr>
         <w:pStyle w:val="Heading1"/>
       </w:pPr>
-      <w:bookmarkStart w:id="14" w:name="_Toc244131550"/>
+      <w:bookmarkStart w:id="14" w:name="_Toc244133857"/>
       <w:r>
         <w:t>15. Музыка и звуки</w:t>
       </w:r>
@@ -12786,7 +12893,7 @@
       <w:pPr>
         <w:pStyle w:val="Heading1"/>
       </w:pPr>
-      <w:bookmarkStart w:id="15" w:name="_Toc244131551"/>
+      <w:bookmarkStart w:id="15" w:name="_Toc244133858"/>
       <w:r>
         <w:t>16. Озвучка</w:t>
       </w:r>
@@ -12884,7 +12991,7 @@
       <w:pPr>
         <w:pStyle w:val="Heading1"/>
       </w:pPr>
-      <w:bookmarkStart w:id="16" w:name="_Toc244131552"/>
+      <w:bookmarkStart w:id="16" w:name="_Toc244133859"/>
       <w:r>
         <w:t>17. Ключ Gemini и платные возможности</w:t>
       </w:r>
@@ -13027,7 +13134,7 @@
       <w:pPr>
         <w:pStyle w:val="Heading1"/>
       </w:pPr>
-      <w:bookmarkStart w:id="17" w:name="_Toc244131553"/>
+      <w:bookmarkStart w:id="17" w:name="_Toc244133860"/>
       <w:r>
         <w:t>18. Что осталось в .env</w:t>
       </w:r>
@@ -13092,7 +13199,6 @@
                 <w:bCs/>
                 <w:color w:val="FFFFFF"/>
               </w:rPr>
-              <w:lastRenderedPageBreak/>
               <w:t>Настройка</w:t>
             </w:r>
           </w:p>
@@ -13590,7 +13696,7 @@
       <w:pPr>
         <w:pStyle w:val="Heading1"/>
       </w:pPr>
-      <w:bookmarkStart w:id="18" w:name="_Toc244131554"/>
+      <w:bookmarkStart w:id="18" w:name="_Toc244133861"/>
       <w:r>
         <w:t>19. Советы: что улучшить дальше</w:t>
       </w:r>
@@ -13762,7 +13868,7 @@
       <w:pPr>
         <w:pStyle w:val="Heading1"/>
       </w:pPr>
-      <w:bookmarkStart w:id="19" w:name="_Toc244131555"/>
+      <w:bookmarkStart w:id="19" w:name="_Toc244133862"/>
       <w:r>
         <w:t>20. Если что-то не работает</w:t>
       </w:r>
@@ -13915,7 +14021,6 @@
           </w:tcPr>
           <w:p>
             <w:r>
-              <w:lastRenderedPageBreak/>
               <w:t>«Failed: interrupted»</w:t>
             </w:r>
           </w:p>
@@ -14000,7 +14105,7 @@
           </w:tcPr>
           <w:p>
             <w:r>
-              <w:t xml:space="preserve">Закончился дневной лимит Cloudflare (сбрасывается в 00:00 UTC = 02:00 по Киеву, летом 03:00) или неверный токен — проверьте </w:t>
+              <w:t xml:space="preserve">Кончился лимит Cloudflare за последние 24 часа (≈130 картинок; освобождается постепенно, а не в полночь) или неверный токен — проверьте </w:t>
             </w:r>
             <w:r>
               <w:rPr>
@@ -14027,6 +14132,40 @@
           </w:tcPr>
           <w:p>
             <w:r>
+              <w:t>FLUX: «used up your daily free allocation», а в Cloudflare «0/10k today»</w:t>
+            </w:r>
+          </w:p>
+        </w:tc>
+        <w:tc>
+          <w:tcPr>
+            <w:tcW w:w="5638" w:type="dxa"/>
+            <w:tcMar>
+              <w:top w:w="60" w:type="dxa"/>
+              <w:left w:w="100" w:type="dxa"/>
+              <w:bottom w:w="60" w:type="dxa"/>
+              <w:right w:w="100" w:type="dxa"/>
+            </w:tcMar>
+          </w:tcPr>
+          <w:p>
+            <w:r>
+              <w:t>Лимит считается за скользящие 24 часа, а не по календарным суткам. Подождите несколько часов — картинки вернутся сами; до этого ролики делаются с фото или карточками</w:t>
+            </w:r>
+          </w:p>
+        </w:tc>
+      </w:tr>
+      <w:tr>
+        <w:tc>
+          <w:tcPr>
+            <w:tcW w:w="4000" w:type="dxa"/>
+            <w:tcMar>
+              <w:top w:w="60" w:type="dxa"/>
+              <w:left w:w="100" w:type="dxa"/>
+              <w:bottom w:w="60" w:type="dxa"/>
+              <w:right w:w="100" w:type="dxa"/>
+            </w:tcMar>
+          </w:tcPr>
+          <w:p>
+            <w:r>
               <w:t>Сценарий пишется 3–6 минут или «all text models failed»</w:t>
             </w:r>
           </w:p>
@@ -14571,11 +14710,7 @@
           </w:tcPr>
           <w:p>
             <w:r>
-              <w:t xml:space="preserve">ПК спал, не был выполнен вход в Windows или не было интернета (раздел 14.2). Проверьте и галочку «Make a </w:t>
-            </w:r>
-            <w:r>
-              <w:lastRenderedPageBreak/>
-              <w:t>video every day at 9:00» у канала (Manage channels). Журнал запуска — n8n → Executions</w:t>
+              <w:t>ПК спал, не был выполнен вход в Windows или не было интернета (раздел 14.2). Проверьте и галочку «Make a video every day at 9:00» у канала (Manage channels). Журнал запуска — n8n → Executions</w:t>
             </w:r>
           </w:p>
         </w:tc>
@@ -14593,7 +14728,6 @@
           </w:tcPr>
           <w:p>
             <w:r>
-              <w:lastRenderedPageBreak/>
               <w:t>Студия открывает страницу входа / «sign in first»</w:t>
             </w:r>
           </w:p>
@@ -14644,17 +14778,34 @@
           </w:tcPr>
           <w:p>
             <w:r>
-              <w:t xml:space="preserve">Владелец Студии: Users → </w:t>
+              <w:t xml:space="preserve">Супер-админ, владелец или админ: ☰ → </w:t>
             </w:r>
             <w:r>
               <w:rPr>
                 <w:b/>
                 <w:bCs/>
               </w:rPr>
-              <w:t>New password</w:t>
-            </w:r>
-            <w:r>
-              <w:t xml:space="preserve"> у нужного человека. Если забыл сам владелец — напишите мне</w:t>
+              <w:t>Users</w:t>
+            </w:r>
+            <w:r>
+              <w:t xml:space="preserve"> → </w:t>
+            </w:r>
+            <w:r>
+              <w:rPr>
+                <w:b/>
+                <w:bCs/>
+              </w:rPr>
+              <w:t>🔑</w:t>
+            </w:r>
+            <w:r>
+              <w:rPr>
+                <w:b/>
+                <w:bCs/>
+              </w:rPr>
+              <w:t xml:space="preserve"> Password</w:t>
+            </w:r>
+            <w:r>
+              <w:t xml:space="preserve"> у нужного человека. Если забыл сам супер-админ — напишите мне</w:t>
             </w:r>
           </w:p>
         </w:tc>
@@ -14774,6 +14925,108 @@
           <w:p>
             <w:r>
               <w:t>Кнопку нажали не в том чате, куда пришло сообщение канала</w:t>
+            </w:r>
+          </w:p>
+        </w:tc>
+      </w:tr>
+      <w:tr>
+        <w:tc>
+          <w:tcPr>
+            <w:tcW w:w="4000" w:type="dxa"/>
+            <w:tcMar>
+              <w:top w:w="60" w:type="dxa"/>
+              <w:left w:w="100" w:type="dxa"/>
+              <w:bottom w:w="60" w:type="dxa"/>
+              <w:right w:w="100" w:type="dxa"/>
+            </w:tcMar>
+          </w:tcPr>
+          <w:p>
+            <w:r>
+              <w:t>Админ: «your role cannot do this»</w:t>
+            </w:r>
+          </w:p>
+        </w:tc>
+        <w:tc>
+          <w:tcPr>
+            <w:tcW w:w="5638" w:type="dxa"/>
+            <w:tcMar>
+              <w:top w:w="60" w:type="dxa"/>
+              <w:left w:w="100" w:type="dxa"/>
+              <w:bottom w:w="60" w:type="dxa"/>
+              <w:right w:w="100" w:type="dxa"/>
+            </w:tcMar>
+          </w:tcPr>
+          <w:p>
+            <w:r>
+              <w:t>У роли Admin нет права на это действие: удалять, менять роли, трогать других админов. Попросите супер-админа</w:t>
+            </w:r>
+          </w:p>
+        </w:tc>
+      </w:tr>
+      <w:tr>
+        <w:tc>
+          <w:tcPr>
+            <w:tcW w:w="4000" w:type="dxa"/>
+            <w:tcMar>
+              <w:top w:w="60" w:type="dxa"/>
+              <w:left w:w="100" w:type="dxa"/>
+              <w:bottom w:w="60" w:type="dxa"/>
+              <w:right w:w="100" w:type="dxa"/>
+            </w:tcMar>
+          </w:tcPr>
+          <w:p>
+            <w:r>
+              <w:t>Админ: «no such user»</w:t>
+            </w:r>
+          </w:p>
+        </w:tc>
+        <w:tc>
+          <w:tcPr>
+            <w:tcW w:w="5638" w:type="dxa"/>
+            <w:tcMar>
+              <w:top w:w="60" w:type="dxa"/>
+              <w:left w:w="100" w:type="dxa"/>
+              <w:bottom w:w="60" w:type="dxa"/>
+              <w:right w:w="100" w:type="dxa"/>
+            </w:tcMar>
+          </w:tcPr>
+          <w:p>
+            <w:r>
+              <w:t>Админ не видит супер-админа — так задумано</w:t>
+            </w:r>
+          </w:p>
+        </w:tc>
+      </w:tr>
+      <w:tr>
+        <w:tc>
+          <w:tcPr>
+            <w:tcW w:w="4000" w:type="dxa"/>
+            <w:tcMar>
+              <w:top w:w="60" w:type="dxa"/>
+              <w:left w:w="100" w:type="dxa"/>
+              <w:bottom w:w="60" w:type="dxa"/>
+              <w:right w:w="100" w:type="dxa"/>
+            </w:tcMar>
+          </w:tcPr>
+          <w:p>
+            <w:r>
+              <w:t>В меню ☰ нет пункта Users</w:t>
+            </w:r>
+          </w:p>
+        </w:tc>
+        <w:tc>
+          <w:tcPr>
+            <w:tcW w:w="5638" w:type="dxa"/>
+            <w:tcMar>
+              <w:top w:w="60" w:type="dxa"/>
+              <w:left w:w="100" w:type="dxa"/>
+              <w:bottom w:w="60" w:type="dxa"/>
+              <w:right w:w="100" w:type="dxa"/>
+            </w:tcMar>
+          </w:tcPr>
+          <w:p>
+            <w:r>
+              <w:t>Users видят только админы. Роль даёт супер-админ или владелец: ☰ → Users → колонка Role</w:t>
             </w:r>
           </w:p>
         </w:tc>
@@ -14808,7 +15061,7 @@
       <w:pPr>
         <w:pStyle w:val="Heading1"/>
       </w:pPr>
-      <w:bookmarkStart w:id="20" w:name="_Toc244131556"/>
+      <w:bookmarkStart w:id="20" w:name="_Toc244133863"/>
       <w:r>
         <w:t>21. Аккаунты Студии и каналы</w:t>
       </w:r>
@@ -14927,6 +15180,40 @@
         <w:t>владелец Студии</w:t>
       </w:r>
       <w:r>
+        <w:t xml:space="preserve">; если же его почта указана в </w:t>
+      </w:r>
+      <w:r>
+        <w:rPr>
+          <w:rFonts w:ascii="Consolas" w:eastAsia="Consolas" w:hAnsi="Consolas" w:cs="Consolas"/>
+          <w:sz w:val="20"/>
+          <w:szCs w:val="20"/>
+          <w:shd w:val="clear" w:color="auto" w:fill="EFEFEF"/>
+        </w:rPr>
+        <w:t>SUPERADMIN_EMAILS</w:t>
+      </w:r>
+      <w:r>
+        <w:t xml:space="preserve"> в </w:t>
+      </w:r>
+      <w:r>
+        <w:rPr>
+          <w:rFonts w:ascii="Consolas" w:eastAsia="Consolas" w:hAnsi="Consolas" w:cs="Consolas"/>
+          <w:sz w:val="20"/>
+          <w:szCs w:val="20"/>
+          <w:shd w:val="clear" w:color="auto" w:fill="EFEFEF"/>
+        </w:rPr>
+        <w:t>.env</w:t>
+      </w:r>
+      <w:r>
+        <w:t xml:space="preserve"> (у вас — nikita1994p@gmail.com), он становится </w:t>
+      </w:r>
+      <w:r>
+        <w:rPr>
+          <w:b/>
+          <w:bCs/>
+        </w:rPr>
+        <w:t>супер-админом</w:t>
+      </w:r>
+      <w:r>
         <w:t>. Ему достаётся уже готовый канал «365 Businesses That Make Money» со всеми роликами, темами, настройками и входом в YouTube.</w:t>
       </w:r>
     </w:p>
@@ -14978,14 +15265,31 @@
         <w:t>не отмечена</w:t>
       </w:r>
       <w:r>
-        <w:t xml:space="preserve"> заранее и не нужна для работы Студии. Снять или поставить её можно в любой момент: кружок с буквой справа вверху → </w:t>
-      </w:r>
-      <w:r>
-        <w:rPr>
-          <w:b/>
-          <w:bCs/>
-        </w:rPr>
-        <w:t>My account</w:t>
+        <w:t xml:space="preserve"> заранее и не нужна для работы Студии. Снять или поставить её можно в любой момент: </w:t>
+      </w:r>
+      <w:r>
+        <w:rPr>
+          <w:b/>
+          <w:bCs/>
+        </w:rPr>
+        <w:t>☰</w:t>
+      </w:r>
+      <w:r>
+        <w:t xml:space="preserve"> (три полоски слева вверху) → </w:t>
+      </w:r>
+      <w:r>
+        <w:rPr>
+          <w:b/>
+          <w:bCs/>
+        </w:rPr>
+        <w:t>🔑</w:t>
+      </w:r>
+      <w:r>
+        <w:rPr>
+          <w:b/>
+          <w:bCs/>
+        </w:rPr>
+        <w:t xml:space="preserve"> My account</w:t>
       </w:r>
       <w:r>
         <w:t>.</w:t>
@@ -14996,27 +15300,68 @@
         <w:spacing w:after="120"/>
       </w:pPr>
       <w:r>
-        <w:t xml:space="preserve">В том же меню: </w:t>
-      </w:r>
-      <w:r>
-        <w:rPr>
-          <w:b/>
-          <w:bCs/>
-        </w:rPr>
-        <w:t>My account</w:t>
-      </w:r>
-      <w:r>
-        <w:t xml:space="preserve"> — смена пароля (после смены все другие устройства выходят из аккаунта), </w:t>
-      </w:r>
-      <w:r>
-        <w:rPr>
-          <w:b/>
-          <w:bCs/>
-        </w:rPr>
-        <w:t>Sign out</w:t>
-      </w:r>
-      <w:r>
-        <w:t xml:space="preserve"> — выход.</w:t>
+        <w:t xml:space="preserve">Меню </w:t>
+      </w:r>
+      <w:r>
+        <w:rPr>
+          <w:b/>
+          <w:bCs/>
+        </w:rPr>
+        <w:t>☰</w:t>
+      </w:r>
+      <w:r>
+        <w:t xml:space="preserve"> (три полоски слева вверху): ваша почта, </w:t>
+      </w:r>
+      <w:r>
+        <w:rPr>
+          <w:b/>
+          <w:bCs/>
+        </w:rPr>
+        <w:t>👥</w:t>
+      </w:r>
+      <w:r>
+        <w:rPr>
+          <w:b/>
+          <w:bCs/>
+        </w:rPr>
+        <w:t xml:space="preserve"> Users</w:t>
+      </w:r>
+      <w:r>
+        <w:t xml:space="preserve"> (только для админов), </w:t>
+      </w:r>
+      <w:r>
+        <w:rPr>
+          <w:b/>
+          <w:bCs/>
+        </w:rPr>
+        <w:t>🔑</w:t>
+      </w:r>
+      <w:r>
+        <w:rPr>
+          <w:b/>
+          <w:bCs/>
+        </w:rPr>
+        <w:t xml:space="preserve"> My account</w:t>
+      </w:r>
+      <w:r>
+        <w:t xml:space="preserve"> — смена пароля (после смены все другие устройства выходят из аккаунта) и галочка новостей, </w:t>
+      </w:r>
+      <w:r>
+        <w:rPr>
+          <w:b/>
+          <w:bCs/>
+        </w:rPr>
+        <w:t>↪</w:t>
+      </w:r>
+      <w:r>
+        <w:rPr>
+          <w:b/>
+          <w:bCs/>
+        </w:rPr>
+        <w:t xml:space="preserve"> Log out</w:t>
+      </w:r>
+      <w:r>
+        <w:t xml:space="preserve"> — выход на страницу входа. В узком окне ☰ заодно выдвигает левую панель с разделами.</w:t>
       </w:r>
     </w:p>
     <w:p>
@@ -15053,6 +15398,54 @@
       </w:r>
       <w:r>
         <w:t xml:space="preserve"> — страница каналов.</w:t>
+      </w:r>
+    </w:p>
+    <w:p>
+      <w:pPr>
+        <w:spacing w:after="120"/>
+      </w:pPr>
+      <w:r>
+        <w:t xml:space="preserve">Под списком — одна короткая строка, например </w:t>
+      </w:r>
+      <w:r>
+        <w:rPr>
+          <w:b/>
+          <w:bCs/>
+        </w:rPr>
+        <w:t>Business · EN · manual publish</w:t>
+      </w:r>
+      <w:r>
+        <w:t>: тип ниши (</w:t>
+      </w:r>
+      <w:r>
+        <w:rPr>
+          <w:b/>
+          <w:bCs/>
+        </w:rPr>
+        <w:t>Business</w:t>
+      </w:r>
+      <w:r>
+        <w:t xml:space="preserve"> или </w:t>
+      </w:r>
+      <w:r>
+        <w:rPr>
+          <w:b/>
+          <w:bCs/>
+        </w:rPr>
+        <w:t>Sport &amp; Health</w:t>
+      </w:r>
+      <w:r>
+        <w:t xml:space="preserve">), язык и режим публикации (вручную или auto-publish). Полное описание ниши видно при наведении на эту строку и в </w:t>
+      </w:r>
+      <w:r>
+        <w:rPr>
+          <w:b/>
+          <w:bCs/>
+        </w:rPr>
+        <w:t>Settings → Content → Channel niche</w:t>
+      </w:r>
+      <w:r>
+        <w:t>.</w:t>
       </w:r>
     </w:p>
     <w:tbl>
@@ -15094,7 +15487,6 @@
                 <w:bCs/>
                 <w:color w:val="FFFFFF"/>
               </w:rPr>
-              <w:lastRenderedPageBreak/>
               <w:t>Действие</w:t>
             </w:r>
           </w:p>
@@ -15464,10 +15856,10 @@
                 <w:b/>
                 <w:bCs/>
               </w:rPr>
-              <w:t>дневной лимит FLUX</w:t>
-            </w:r>
-            <w:r>
-              <w:t xml:space="preserve"> — около 100 картинок в сутки на все каналы вместе, это примерно 15 роликов</w:t>
+              <w:t>лимит FLUX</w:t>
+            </w:r>
+            <w:r>
+              <w:t xml:space="preserve"> — около 130 картинок за скользящие 24 часа на все каналы вместе, это примерно 20 роликов</w:t>
             </w:r>
           </w:p>
         </w:tc>
@@ -15491,10 +15883,7 @@
         <w:t>⚠</w:t>
       </w:r>
       <w:r>
-        <w:t xml:space="preserve"> </w:t>
-      </w:r>
-      <w:r>
-        <w:t xml:space="preserve">Новому каналу нужен свой YouTube: откройте этот канал в левой панели → Accounts → YouTube → </w:t>
+        <w:t xml:space="preserve"> Новому каналу нужен свой YouTube: откройте этот канал в левой панели → Accounts → YouTube → </w:t>
       </w:r>
       <w:r>
         <w:rPr>
@@ -15761,7 +16150,6 @@
         <w:spacing w:after="60"/>
       </w:pPr>
       <w:r>
-        <w:lastRenderedPageBreak/>
         <w:t xml:space="preserve">YouTube строго следит за медицинской информацией (правила о медицинской дезинформации). Ролики канала </w:t>
       </w:r>
       <w:r>
@@ -15819,15 +16207,705 @@
         <w:pStyle w:val="Heading2"/>
       </w:pPr>
       <w:r>
-        <w:t>21.5. Пользователи и список подписчиков (только владелец)</w:t>
-      </w:r>
-    </w:p>
+        <w:t>21.5. Роли</w:t>
+      </w:r>
+    </w:p>
+    <w:tbl>
+      <w:tblPr>
+        <w:tblW w:w="9638" w:type="dxa"/>
+        <w:tblBorders>
+          <w:top w:val="single" w:sz="4" w:space="0" w:color="auto"/>
+          <w:left w:val="single" w:sz="4" w:space="0" w:color="auto"/>
+          <w:bottom w:val="single" w:sz="4" w:space="0" w:color="auto"/>
+          <w:right w:val="single" w:sz="4" w:space="0" w:color="auto"/>
+          <w:insideH w:val="single" w:sz="4" w:space="0" w:color="auto"/>
+          <w:insideV w:val="single" w:sz="4" w:space="0" w:color="auto"/>
+        </w:tblBorders>
+        <w:tblLook w:val="04A0" w:firstRow="1" w:lastRow="0" w:firstColumn="1" w:lastColumn="0" w:noHBand="0" w:noVBand="1"/>
+      </w:tblPr>
+      <w:tblGrid>
+        <w:gridCol w:w="1500"/>
+        <w:gridCol w:w="1900"/>
+        <w:gridCol w:w="2338"/>
+        <w:gridCol w:w="1000"/>
+        <w:gridCol w:w="1300"/>
+        <w:gridCol w:w="1600"/>
+      </w:tblGrid>
+      <w:tr>
+        <w:trPr>
+          <w:tblHeader/>
+        </w:trPr>
+        <w:tc>
+          <w:tcPr>
+            <w:tcW w:w="1500" w:type="dxa"/>
+            <w:shd w:val="clear" w:color="auto" w:fill="282828"/>
+            <w:tcMar>
+              <w:top w:w="60" w:type="dxa"/>
+              <w:left w:w="100" w:type="dxa"/>
+              <w:bottom w:w="60" w:type="dxa"/>
+              <w:right w:w="100" w:type="dxa"/>
+            </w:tcMar>
+          </w:tcPr>
+          <w:p>
+            <w:r>
+              <w:rPr>
+                <w:b/>
+                <w:bCs/>
+                <w:color w:val="FFFFFF"/>
+              </w:rPr>
+              <w:t>Роль</w:t>
+            </w:r>
+          </w:p>
+        </w:tc>
+        <w:tc>
+          <w:tcPr>
+            <w:tcW w:w="1900" w:type="dxa"/>
+            <w:shd w:val="clear" w:color="auto" w:fill="282828"/>
+            <w:tcMar>
+              <w:top w:w="60" w:type="dxa"/>
+              <w:left w:w="100" w:type="dxa"/>
+              <w:bottom w:w="60" w:type="dxa"/>
+              <w:right w:w="100" w:type="dxa"/>
+            </w:tcMar>
+          </w:tcPr>
+          <w:p>
+            <w:r>
+              <w:rPr>
+                <w:b/>
+                <w:bCs/>
+                <w:color w:val="FFFFFF"/>
+              </w:rPr>
+              <w:t>Видит в списке Users</w:t>
+            </w:r>
+          </w:p>
+        </w:tc>
+        <w:tc>
+          <w:tcPr>
+            <w:tcW w:w="2338" w:type="dxa"/>
+            <w:shd w:val="clear" w:color="auto" w:fill="282828"/>
+            <w:tcMar>
+              <w:top w:w="60" w:type="dxa"/>
+              <w:left w:w="100" w:type="dxa"/>
+              <w:bottom w:w="60" w:type="dxa"/>
+              <w:right w:w="100" w:type="dxa"/>
+            </w:tcMar>
+          </w:tcPr>
+          <w:p>
+            <w:r>
+              <w:rPr>
+                <w:b/>
+                <w:bCs/>
+                <w:color w:val="FFFFFF"/>
+              </w:rPr>
+              <w:t>Пароль · блок · Log out</w:t>
+            </w:r>
+          </w:p>
+        </w:tc>
+        <w:tc>
+          <w:tcPr>
+            <w:tcW w:w="1000" w:type="dxa"/>
+            <w:shd w:val="clear" w:color="auto" w:fill="282828"/>
+            <w:tcMar>
+              <w:top w:w="60" w:type="dxa"/>
+              <w:left w:w="100" w:type="dxa"/>
+              <w:bottom w:w="60" w:type="dxa"/>
+              <w:right w:w="100" w:type="dxa"/>
+            </w:tcMar>
+          </w:tcPr>
+          <w:p>
+            <w:r>
+              <w:rPr>
+                <w:b/>
+                <w:bCs/>
+                <w:color w:val="FFFFFF"/>
+              </w:rPr>
+              <w:t>Удалить</w:t>
+            </w:r>
+          </w:p>
+        </w:tc>
+        <w:tc>
+          <w:tcPr>
+            <w:tcW w:w="1300" w:type="dxa"/>
+            <w:shd w:val="clear" w:color="auto" w:fill="282828"/>
+            <w:tcMar>
+              <w:top w:w="60" w:type="dxa"/>
+              <w:left w:w="100" w:type="dxa"/>
+              <w:bottom w:w="60" w:type="dxa"/>
+              <w:right w:w="100" w:type="dxa"/>
+            </w:tcMar>
+          </w:tcPr>
+          <w:p>
+            <w:r>
+              <w:rPr>
+                <w:b/>
+                <w:bCs/>
+                <w:color w:val="FFFFFF"/>
+              </w:rPr>
+              <w:t>Менять роль</w:t>
+            </w:r>
+          </w:p>
+        </w:tc>
+        <w:tc>
+          <w:tcPr>
+            <w:tcW w:w="1600" w:type="dxa"/>
+            <w:shd w:val="clear" w:color="auto" w:fill="282828"/>
+            <w:tcMar>
+              <w:top w:w="60" w:type="dxa"/>
+              <w:left w:w="100" w:type="dxa"/>
+              <w:bottom w:w="60" w:type="dxa"/>
+              <w:right w:w="100" w:type="dxa"/>
+            </w:tcMar>
+          </w:tcPr>
+          <w:p>
+            <w:r>
+              <w:rPr>
+                <w:b/>
+                <w:bCs/>
+                <w:color w:val="FFFFFF"/>
+              </w:rPr>
+              <w:t>CSV подписчиков</w:t>
+            </w:r>
+          </w:p>
+        </w:tc>
+      </w:tr>
+      <w:tr>
+        <w:tc>
+          <w:tcPr>
+            <w:tcW w:w="1500" w:type="dxa"/>
+            <w:tcMar>
+              <w:top w:w="60" w:type="dxa"/>
+              <w:left w:w="100" w:type="dxa"/>
+              <w:bottom w:w="60" w:type="dxa"/>
+              <w:right w:w="100" w:type="dxa"/>
+            </w:tcMar>
+          </w:tcPr>
+          <w:p>
+            <w:r>
+              <w:rPr>
+                <w:b/>
+                <w:bCs/>
+              </w:rPr>
+              <w:t>Super admin</w:t>
+            </w:r>
+          </w:p>
+        </w:tc>
+        <w:tc>
+          <w:tcPr>
+            <w:tcW w:w="1900" w:type="dxa"/>
+            <w:tcMar>
+              <w:top w:w="60" w:type="dxa"/>
+              <w:left w:w="100" w:type="dxa"/>
+              <w:bottom w:w="60" w:type="dxa"/>
+              <w:right w:w="100" w:type="dxa"/>
+            </w:tcMar>
+          </w:tcPr>
+          <w:p>
+            <w:r>
+              <w:t>всех</w:t>
+            </w:r>
+          </w:p>
+        </w:tc>
+        <w:tc>
+          <w:tcPr>
+            <w:tcW w:w="2338" w:type="dxa"/>
+            <w:tcMar>
+              <w:top w:w="60" w:type="dxa"/>
+              <w:left w:w="100" w:type="dxa"/>
+              <w:bottom w:w="60" w:type="dxa"/>
+              <w:right w:w="100" w:type="dxa"/>
+            </w:tcMar>
+          </w:tcPr>
+          <w:p>
+            <w:r>
+              <w:t>всем, кроме себя и других супер-админов</w:t>
+            </w:r>
+          </w:p>
+        </w:tc>
+        <w:tc>
+          <w:tcPr>
+            <w:tcW w:w="1000" w:type="dxa"/>
+            <w:tcMar>
+              <w:top w:w="60" w:type="dxa"/>
+              <w:left w:w="100" w:type="dxa"/>
+              <w:bottom w:w="60" w:type="dxa"/>
+              <w:right w:w="100" w:type="dxa"/>
+            </w:tcMar>
+          </w:tcPr>
+          <w:p>
+            <w:r>
+              <w:t>✓</w:t>
+            </w:r>
+          </w:p>
+        </w:tc>
+        <w:tc>
+          <w:tcPr>
+            <w:tcW w:w="1300" w:type="dxa"/>
+            <w:tcMar>
+              <w:top w:w="60" w:type="dxa"/>
+              <w:left w:w="100" w:type="dxa"/>
+              <w:bottom w:w="60" w:type="dxa"/>
+              <w:right w:w="100" w:type="dxa"/>
+            </w:tcMar>
+          </w:tcPr>
+          <w:p>
+            <w:r>
+              <w:t>✓</w:t>
+            </w:r>
+          </w:p>
+        </w:tc>
+        <w:tc>
+          <w:tcPr>
+            <w:tcW w:w="1600" w:type="dxa"/>
+            <w:tcMar>
+              <w:top w:w="60" w:type="dxa"/>
+              <w:left w:w="100" w:type="dxa"/>
+              <w:bottom w:w="60" w:type="dxa"/>
+              <w:right w:w="100" w:type="dxa"/>
+            </w:tcMar>
+          </w:tcPr>
+          <w:p>
+            <w:r>
+              <w:t>✓</w:t>
+            </w:r>
+          </w:p>
+        </w:tc>
+      </w:tr>
+      <w:tr>
+        <w:tc>
+          <w:tcPr>
+            <w:tcW w:w="1500" w:type="dxa"/>
+            <w:tcMar>
+              <w:top w:w="60" w:type="dxa"/>
+              <w:left w:w="100" w:type="dxa"/>
+              <w:bottom w:w="60" w:type="dxa"/>
+              <w:right w:w="100" w:type="dxa"/>
+            </w:tcMar>
+          </w:tcPr>
+          <w:p>
+            <w:r>
+              <w:rPr>
+                <w:b/>
+                <w:bCs/>
+              </w:rPr>
+              <w:t>Studio owner</w:t>
+            </w:r>
+          </w:p>
+        </w:tc>
+        <w:tc>
+          <w:tcPr>
+            <w:tcW w:w="1900" w:type="dxa"/>
+            <w:tcMar>
+              <w:top w:w="60" w:type="dxa"/>
+              <w:left w:w="100" w:type="dxa"/>
+              <w:bottom w:w="60" w:type="dxa"/>
+              <w:right w:w="100" w:type="dxa"/>
+            </w:tcMar>
+          </w:tcPr>
+          <w:p>
+            <w:r>
+              <w:t>всех</w:t>
+            </w:r>
+          </w:p>
+        </w:tc>
+        <w:tc>
+          <w:tcPr>
+            <w:tcW w:w="2338" w:type="dxa"/>
+            <w:tcMar>
+              <w:top w:w="60" w:type="dxa"/>
+              <w:left w:w="100" w:type="dxa"/>
+              <w:bottom w:w="60" w:type="dxa"/>
+              <w:right w:w="100" w:type="dxa"/>
+            </w:tcMar>
+          </w:tcPr>
+          <w:p>
+            <w:r>
+              <w:t>всем, кроме супер-админов и других владельцев</w:t>
+            </w:r>
+          </w:p>
+        </w:tc>
+        <w:tc>
+          <w:tcPr>
+            <w:tcW w:w="1000" w:type="dxa"/>
+            <w:tcMar>
+              <w:top w:w="60" w:type="dxa"/>
+              <w:left w:w="100" w:type="dxa"/>
+              <w:bottom w:w="60" w:type="dxa"/>
+              <w:right w:w="100" w:type="dxa"/>
+            </w:tcMar>
+          </w:tcPr>
+          <w:p>
+            <w:r>
+              <w:t>✓</w:t>
+            </w:r>
+          </w:p>
+        </w:tc>
+        <w:tc>
+          <w:tcPr>
+            <w:tcW w:w="1300" w:type="dxa"/>
+            <w:tcMar>
+              <w:top w:w="60" w:type="dxa"/>
+              <w:left w:w="100" w:type="dxa"/>
+              <w:bottom w:w="60" w:type="dxa"/>
+              <w:right w:w="100" w:type="dxa"/>
+            </w:tcMar>
+          </w:tcPr>
+          <w:p>
+            <w:r>
+              <w:t>✓</w:t>
+            </w:r>
+          </w:p>
+        </w:tc>
+        <w:tc>
+          <w:tcPr>
+            <w:tcW w:w="1600" w:type="dxa"/>
+            <w:tcMar>
+              <w:top w:w="60" w:type="dxa"/>
+              <w:left w:w="100" w:type="dxa"/>
+              <w:bottom w:w="60" w:type="dxa"/>
+              <w:right w:w="100" w:type="dxa"/>
+            </w:tcMar>
+          </w:tcPr>
+          <w:p>
+            <w:r>
+              <w:t>✓</w:t>
+            </w:r>
+          </w:p>
+        </w:tc>
+      </w:tr>
+      <w:tr>
+        <w:tc>
+          <w:tcPr>
+            <w:tcW w:w="1500" w:type="dxa"/>
+            <w:tcMar>
+              <w:top w:w="60" w:type="dxa"/>
+              <w:left w:w="100" w:type="dxa"/>
+              <w:bottom w:w="60" w:type="dxa"/>
+              <w:right w:w="100" w:type="dxa"/>
+            </w:tcMar>
+          </w:tcPr>
+          <w:p>
+            <w:r>
+              <w:rPr>
+                <w:b/>
+                <w:bCs/>
+              </w:rPr>
+              <w:t>Admin</w:t>
+            </w:r>
+          </w:p>
+        </w:tc>
+        <w:tc>
+          <w:tcPr>
+            <w:tcW w:w="1900" w:type="dxa"/>
+            <w:tcMar>
+              <w:top w:w="60" w:type="dxa"/>
+              <w:left w:w="100" w:type="dxa"/>
+              <w:bottom w:w="60" w:type="dxa"/>
+              <w:right w:w="100" w:type="dxa"/>
+            </w:tcMar>
+          </w:tcPr>
+          <w:p>
+            <w:r>
+              <w:t xml:space="preserve">всех, </w:t>
+            </w:r>
+            <w:r>
+              <w:rPr>
+                <w:b/>
+                <w:bCs/>
+              </w:rPr>
+              <w:t>кроме супер-админов</w:t>
+            </w:r>
+          </w:p>
+        </w:tc>
+        <w:tc>
+          <w:tcPr>
+            <w:tcW w:w="2338" w:type="dxa"/>
+            <w:tcMar>
+              <w:top w:w="60" w:type="dxa"/>
+              <w:left w:w="100" w:type="dxa"/>
+              <w:bottom w:w="60" w:type="dxa"/>
+              <w:right w:w="100" w:type="dxa"/>
+            </w:tcMar>
+          </w:tcPr>
+          <w:p>
+            <w:r>
+              <w:t>только обычным пользователям</w:t>
+            </w:r>
+          </w:p>
+        </w:tc>
+        <w:tc>
+          <w:tcPr>
+            <w:tcW w:w="1000" w:type="dxa"/>
+            <w:tcMar>
+              <w:top w:w="60" w:type="dxa"/>
+              <w:left w:w="100" w:type="dxa"/>
+              <w:bottom w:w="60" w:type="dxa"/>
+              <w:right w:w="100" w:type="dxa"/>
+            </w:tcMar>
+          </w:tcPr>
+          <w:p>
+            <w:r>
+              <w:t>—</w:t>
+            </w:r>
+          </w:p>
+        </w:tc>
+        <w:tc>
+          <w:tcPr>
+            <w:tcW w:w="1300" w:type="dxa"/>
+            <w:tcMar>
+              <w:top w:w="60" w:type="dxa"/>
+              <w:left w:w="100" w:type="dxa"/>
+              <w:bottom w:w="60" w:type="dxa"/>
+              <w:right w:w="100" w:type="dxa"/>
+            </w:tcMar>
+          </w:tcPr>
+          <w:p>
+            <w:r>
+              <w:t>—</w:t>
+            </w:r>
+          </w:p>
+        </w:tc>
+        <w:tc>
+          <w:tcPr>
+            <w:tcW w:w="1600" w:type="dxa"/>
+            <w:tcMar>
+              <w:top w:w="60" w:type="dxa"/>
+              <w:left w:w="100" w:type="dxa"/>
+              <w:bottom w:w="60" w:type="dxa"/>
+              <w:right w:w="100" w:type="dxa"/>
+            </w:tcMar>
+          </w:tcPr>
+          <w:p>
+            <w:r>
+              <w:t>—</w:t>
+            </w:r>
+          </w:p>
+        </w:tc>
+      </w:tr>
+      <w:tr>
+        <w:tc>
+          <w:tcPr>
+            <w:tcW w:w="1500" w:type="dxa"/>
+            <w:tcMar>
+              <w:top w:w="60" w:type="dxa"/>
+              <w:left w:w="100" w:type="dxa"/>
+              <w:bottom w:w="60" w:type="dxa"/>
+              <w:right w:w="100" w:type="dxa"/>
+            </w:tcMar>
+          </w:tcPr>
+          <w:p>
+            <w:r>
+              <w:rPr>
+                <w:b/>
+                <w:bCs/>
+              </w:rPr>
+              <w:t>User</w:t>
+            </w:r>
+          </w:p>
+        </w:tc>
+        <w:tc>
+          <w:tcPr>
+            <w:tcW w:w="1900" w:type="dxa"/>
+            <w:tcMar>
+              <w:top w:w="60" w:type="dxa"/>
+              <w:left w:w="100" w:type="dxa"/>
+              <w:bottom w:w="60" w:type="dxa"/>
+              <w:right w:w="100" w:type="dxa"/>
+            </w:tcMar>
+          </w:tcPr>
+          <w:p>
+            <w:r>
+              <w:t>страница закрыта</w:t>
+            </w:r>
+          </w:p>
+        </w:tc>
+        <w:tc>
+          <w:tcPr>
+            <w:tcW w:w="2338" w:type="dxa"/>
+            <w:tcMar>
+              <w:top w:w="60" w:type="dxa"/>
+              <w:left w:w="100" w:type="dxa"/>
+              <w:bottom w:w="60" w:type="dxa"/>
+              <w:right w:w="100" w:type="dxa"/>
+            </w:tcMar>
+          </w:tcPr>
+          <w:p>
+            <w:r>
+              <w:t>—</w:t>
+            </w:r>
+          </w:p>
+        </w:tc>
+        <w:tc>
+          <w:tcPr>
+            <w:tcW w:w="1000" w:type="dxa"/>
+            <w:tcMar>
+              <w:top w:w="60" w:type="dxa"/>
+              <w:left w:w="100" w:type="dxa"/>
+              <w:bottom w:w="60" w:type="dxa"/>
+              <w:right w:w="100" w:type="dxa"/>
+            </w:tcMar>
+          </w:tcPr>
+          <w:p>
+            <w:r>
+              <w:t>—</w:t>
+            </w:r>
+          </w:p>
+        </w:tc>
+        <w:tc>
+          <w:tcPr>
+            <w:tcW w:w="1300" w:type="dxa"/>
+            <w:tcMar>
+              <w:top w:w="60" w:type="dxa"/>
+              <w:left w:w="100" w:type="dxa"/>
+              <w:bottom w:w="60" w:type="dxa"/>
+              <w:right w:w="100" w:type="dxa"/>
+            </w:tcMar>
+          </w:tcPr>
+          <w:p>
+            <w:r>
+              <w:t>—</w:t>
+            </w:r>
+          </w:p>
+        </w:tc>
+        <w:tc>
+          <w:tcPr>
+            <w:tcW w:w="1600" w:type="dxa"/>
+            <w:tcMar>
+              <w:top w:w="60" w:type="dxa"/>
+              <w:left w:w="100" w:type="dxa"/>
+              <w:bottom w:w="60" w:type="dxa"/>
+              <w:right w:w="100" w:type="dxa"/>
+            </w:tcMar>
+          </w:tcPr>
+          <w:p>
+            <w:r>
+              <w:t>—</w:t>
+            </w:r>
+          </w:p>
+        </w:tc>
+      </w:tr>
+    </w:tbl>
     <w:p>
       <w:pPr>
         <w:spacing w:after="120"/>
       </w:pPr>
-      <w:r>
-        <w:t xml:space="preserve">Кружок справа вверху → </w:t>
+    </w:p>
+    <w:p>
+      <w:pPr>
+        <w:pStyle w:val="ListParagraph"/>
+        <w:numPr>
+          <w:ilvl w:val="0"/>
+          <w:numId w:val="3"/>
+        </w:numPr>
+        <w:spacing w:after="60"/>
+      </w:pPr>
+      <w:r>
+        <w:rPr>
+          <w:b/>
+          <w:bCs/>
+        </w:rPr>
+        <w:t>Super admin</w:t>
+      </w:r>
+      <w:r>
+        <w:t xml:space="preserve"> — почта из </w:t>
+      </w:r>
+      <w:r>
+        <w:rPr>
+          <w:rFonts w:ascii="Consolas" w:eastAsia="Consolas" w:hAnsi="Consolas" w:cs="Consolas"/>
+          <w:sz w:val="20"/>
+          <w:szCs w:val="20"/>
+          <w:shd w:val="clear" w:color="auto" w:fill="EFEFEF"/>
+        </w:rPr>
+        <w:t>SUPERADMIN_EMAILS</w:t>
+      </w:r>
+      <w:r>
+        <w:t xml:space="preserve"> в </w:t>
+      </w:r>
+      <w:r>
+        <w:rPr>
+          <w:rFonts w:ascii="Consolas" w:eastAsia="Consolas" w:hAnsi="Consolas" w:cs="Consolas"/>
+          <w:sz w:val="20"/>
+          <w:szCs w:val="20"/>
+          <w:shd w:val="clear" w:color="auto" w:fill="EFEFEF"/>
+        </w:rPr>
+        <w:t>.env</w:t>
+      </w:r>
+      <w:r>
+        <w:t xml:space="preserve"> (у вас — nikita1994p@gmail.com; несколько адресов — через запятую). Его нельзя заблокировать или удалить, он видит всех.</w:t>
+      </w:r>
+    </w:p>
+    <w:p>
+      <w:pPr>
+        <w:pStyle w:val="ListParagraph"/>
+        <w:numPr>
+          <w:ilvl w:val="0"/>
+          <w:numId w:val="3"/>
+        </w:numPr>
+        <w:spacing w:after="60"/>
+      </w:pPr>
+      <w:r>
+        <w:rPr>
+          <w:b/>
+          <w:bCs/>
+        </w:rPr>
+        <w:t>Studio owner</w:t>
+      </w:r>
+      <w:r>
+        <w:t xml:space="preserve"> — первый аккаунт Студии, когда супер-админа нет. Права те же, но другого владельца он не трогает.</w:t>
+      </w:r>
+    </w:p>
+    <w:p>
+      <w:pPr>
+        <w:pStyle w:val="ListParagraph"/>
+        <w:numPr>
+          <w:ilvl w:val="0"/>
+          <w:numId w:val="3"/>
+        </w:numPr>
+        <w:spacing w:after="60"/>
+      </w:pPr>
+      <w:r>
+        <w:rPr>
+          <w:b/>
+          <w:bCs/>
+        </w:rPr>
+        <w:t>Admin</w:t>
+      </w:r>
+      <w:r>
+        <w:t xml:space="preserve"> видит всех, кроме супер-админов. Обычным пользователям может задать пароль, заблокировать и разблокировать, выкинуть из Студии. Других админов видит, но ничего с ними сделать не может. Удалять аккаунты, менять роли и скачивать список подписчиков не может.</w:t>
+      </w:r>
+    </w:p>
+    <w:p>
+      <w:pPr>
+        <w:pStyle w:val="ListParagraph"/>
+        <w:numPr>
+          <w:ilvl w:val="0"/>
+          <w:numId w:val="3"/>
+        </w:numPr>
+        <w:spacing w:after="60"/>
+      </w:pPr>
+      <w:r>
+        <w:rPr>
+          <w:b/>
+          <w:bCs/>
+        </w:rPr>
+        <w:t>User</w:t>
+      </w:r>
+      <w:r>
+        <w:t xml:space="preserve"> — обычный пользователь: свои каналы, страницы Users у него нет.</w:t>
+      </w:r>
+    </w:p>
+    <w:p>
+      <w:pPr>
+        <w:spacing w:after="120"/>
+      </w:pPr>
+      <w:r>
+        <w:rPr>
+          <w:b/>
+          <w:bCs/>
+        </w:rPr>
+        <w:t>Как сделать человека админом:</w:t>
+      </w:r>
+      <w:r>
+        <w:t xml:space="preserve"> ☰ → </w:t>
       </w:r>
       <w:r>
         <w:rPr>
@@ -15837,8 +16915,417 @@
         <w:t>Users</w:t>
       </w:r>
       <w:r>
-        <w:t>. Видно всех, кто зарегистрировался: почта, роль, сколько каналов, согласие на рассылку и последний вход.</w:t>
-      </w:r>
+        <w:t xml:space="preserve"> → в колонке </w:t>
+      </w:r>
+      <w:r>
+        <w:rPr>
+          <w:b/>
+          <w:bCs/>
+        </w:rPr>
+        <w:t>Role</w:t>
+      </w:r>
+      <w:r>
+        <w:t xml:space="preserve"> у нужного человека выберите </w:t>
+      </w:r>
+      <w:r>
+        <w:rPr>
+          <w:b/>
+          <w:bCs/>
+        </w:rPr>
+        <w:t>Admin</w:t>
+      </w:r>
+      <w:r>
+        <w:t xml:space="preserve"> (или </w:t>
+      </w:r>
+      <w:r>
+        <w:rPr>
+          <w:b/>
+          <w:bCs/>
+        </w:rPr>
+        <w:t>User</w:t>
+      </w:r>
+      <w:r>
+        <w:t xml:space="preserve"> — вернуть обратно, </w:t>
+      </w:r>
+      <w:r>
+        <w:rPr>
+          <w:b/>
+          <w:bCs/>
+        </w:rPr>
+        <w:t>Studio owner</w:t>
+      </w:r>
+      <w:r>
+        <w:t xml:space="preserve"> — дать полные права). Менять роли может только супер-админ или владелец.</w:t>
+      </w:r>
+    </w:p>
+    <w:p>
+      <w:pPr>
+        <w:pStyle w:val="Heading2"/>
+      </w:pPr>
+      <w:r>
+        <w:t>21.6. Страница Users и список подписчиков</w:t>
+      </w:r>
+    </w:p>
+    <w:p>
+      <w:pPr>
+        <w:spacing w:after="120"/>
+      </w:pPr>
+      <w:r>
+        <w:t>☰</w:t>
+      </w:r>
+      <w:r>
+        <w:t xml:space="preserve"> → </w:t>
+      </w:r>
+      <w:r>
+        <w:rPr>
+          <w:b/>
+          <w:bCs/>
+        </w:rPr>
+        <w:t>👥</w:t>
+      </w:r>
+      <w:r>
+        <w:rPr>
+          <w:b/>
+          <w:bCs/>
+        </w:rPr>
+        <w:t xml:space="preserve"> Users</w:t>
+      </w:r>
+      <w:r>
+        <w:t xml:space="preserve">. Сверху — поиск </w:t>
+      </w:r>
+      <w:r>
+        <w:rPr>
+          <w:b/>
+          <w:bCs/>
+        </w:rPr>
+        <w:t>Search by e-mail or ID</w:t>
+      </w:r>
+      <w:r>
+        <w:t>: список фильтруется прямо во время набора, по части почты или ID.</w:t>
+      </w:r>
+    </w:p>
+    <w:tbl>
+      <w:tblPr>
+        <w:tblW w:w="9638" w:type="dxa"/>
+        <w:tblBorders>
+          <w:top w:val="single" w:sz="4" w:space="0" w:color="auto"/>
+          <w:left w:val="single" w:sz="4" w:space="0" w:color="auto"/>
+          <w:bottom w:val="single" w:sz="4" w:space="0" w:color="auto"/>
+          <w:right w:val="single" w:sz="4" w:space="0" w:color="auto"/>
+          <w:insideH w:val="single" w:sz="4" w:space="0" w:color="auto"/>
+          <w:insideV w:val="single" w:sz="4" w:space="0" w:color="auto"/>
+        </w:tblBorders>
+        <w:tblLook w:val="04A0" w:firstRow="1" w:lastRow="0" w:firstColumn="1" w:lastColumn="0" w:noHBand="0" w:noVBand="1"/>
+      </w:tblPr>
+      <w:tblGrid>
+        <w:gridCol w:w="2400"/>
+        <w:gridCol w:w="7238"/>
+      </w:tblGrid>
+      <w:tr>
+        <w:trPr>
+          <w:tblHeader/>
+        </w:trPr>
+        <w:tc>
+          <w:tcPr>
+            <w:tcW w:w="2400" w:type="dxa"/>
+            <w:shd w:val="clear" w:color="auto" w:fill="282828"/>
+            <w:tcMar>
+              <w:top w:w="60" w:type="dxa"/>
+              <w:left w:w="100" w:type="dxa"/>
+              <w:bottom w:w="60" w:type="dxa"/>
+              <w:right w:w="100" w:type="dxa"/>
+            </w:tcMar>
+          </w:tcPr>
+          <w:p>
+            <w:r>
+              <w:rPr>
+                <w:b/>
+                <w:bCs/>
+                <w:color w:val="FFFFFF"/>
+              </w:rPr>
+              <w:t>Колонка</w:t>
+            </w:r>
+          </w:p>
+        </w:tc>
+        <w:tc>
+          <w:tcPr>
+            <w:tcW w:w="7238" w:type="dxa"/>
+            <w:shd w:val="clear" w:color="auto" w:fill="282828"/>
+            <w:tcMar>
+              <w:top w:w="60" w:type="dxa"/>
+              <w:left w:w="100" w:type="dxa"/>
+              <w:bottom w:w="60" w:type="dxa"/>
+              <w:right w:w="100" w:type="dxa"/>
+            </w:tcMar>
+          </w:tcPr>
+          <w:p>
+            <w:r>
+              <w:rPr>
+                <w:b/>
+                <w:bCs/>
+                <w:color w:val="FFFFFF"/>
+              </w:rPr>
+              <w:t>Что показывает</w:t>
+            </w:r>
+          </w:p>
+        </w:tc>
+      </w:tr>
+      <w:tr>
+        <w:tc>
+          <w:tcPr>
+            <w:tcW w:w="2400" w:type="dxa"/>
+            <w:tcMar>
+              <w:top w:w="60" w:type="dxa"/>
+              <w:left w:w="100" w:type="dxa"/>
+              <w:bottom w:w="60" w:type="dxa"/>
+              <w:right w:w="100" w:type="dxa"/>
+            </w:tcMar>
+          </w:tcPr>
+          <w:p>
+            <w:r>
+              <w:rPr>
+                <w:b/>
+                <w:bCs/>
+              </w:rPr>
+              <w:t>E-mail / ID</w:t>
+            </w:r>
+          </w:p>
+        </w:tc>
+        <w:tc>
+          <w:tcPr>
+            <w:tcW w:w="7238" w:type="dxa"/>
+            <w:tcMar>
+              <w:top w:w="60" w:type="dxa"/>
+              <w:left w:w="100" w:type="dxa"/>
+              <w:bottom w:w="60" w:type="dxa"/>
+              <w:right w:w="100" w:type="dxa"/>
+            </w:tcMar>
+          </w:tcPr>
+          <w:p>
+            <w:r>
+              <w:t xml:space="preserve">Почта и под ней ID аккаунта (щелчок по ID копирует его). Пометки: </w:t>
+            </w:r>
+            <w:r>
+              <w:rPr>
+                <w:b/>
+                <w:bCs/>
+              </w:rPr>
+              <w:t>blocked</w:t>
+            </w:r>
+            <w:r>
+              <w:t xml:space="preserve"> — заблокирован, </w:t>
+            </w:r>
+            <w:r>
+              <w:rPr>
+                <w:b/>
+                <w:bCs/>
+              </w:rPr>
+              <w:t>you</w:t>
+            </w:r>
+            <w:r>
+              <w:t xml:space="preserve"> — это вы</w:t>
+            </w:r>
+          </w:p>
+        </w:tc>
+      </w:tr>
+      <w:tr>
+        <w:tc>
+          <w:tcPr>
+            <w:tcW w:w="2400" w:type="dxa"/>
+            <w:tcMar>
+              <w:top w:w="60" w:type="dxa"/>
+              <w:left w:w="100" w:type="dxa"/>
+              <w:bottom w:w="60" w:type="dxa"/>
+              <w:right w:w="100" w:type="dxa"/>
+            </w:tcMar>
+          </w:tcPr>
+          <w:p>
+            <w:r>
+              <w:rPr>
+                <w:b/>
+                <w:bCs/>
+              </w:rPr>
+              <w:t>Role</w:t>
+            </w:r>
+          </w:p>
+        </w:tc>
+        <w:tc>
+          <w:tcPr>
+            <w:tcW w:w="7238" w:type="dxa"/>
+            <w:tcMar>
+              <w:top w:w="60" w:type="dxa"/>
+              <w:left w:w="100" w:type="dxa"/>
+              <w:bottom w:w="60" w:type="dxa"/>
+              <w:right w:w="100" w:type="dxa"/>
+            </w:tcMar>
+          </w:tcPr>
+          <w:p>
+            <w:r>
+              <w:t>Роль; у супер-админа и владельца — выпадающий список для смены роли</w:t>
+            </w:r>
+          </w:p>
+        </w:tc>
+      </w:tr>
+      <w:tr>
+        <w:tc>
+          <w:tcPr>
+            <w:tcW w:w="2400" w:type="dxa"/>
+            <w:tcMar>
+              <w:top w:w="60" w:type="dxa"/>
+              <w:left w:w="100" w:type="dxa"/>
+              <w:bottom w:w="60" w:type="dxa"/>
+              <w:right w:w="100" w:type="dxa"/>
+            </w:tcMar>
+          </w:tcPr>
+          <w:p>
+            <w:r>
+              <w:rPr>
+                <w:b/>
+                <w:bCs/>
+              </w:rPr>
+              <w:t>Channels</w:t>
+            </w:r>
+          </w:p>
+        </w:tc>
+        <w:tc>
+          <w:tcPr>
+            <w:tcW w:w="7238" w:type="dxa"/>
+            <w:tcMar>
+              <w:top w:w="60" w:type="dxa"/>
+              <w:left w:w="100" w:type="dxa"/>
+              <w:bottom w:w="60" w:type="dxa"/>
+              <w:right w:w="100" w:type="dxa"/>
+            </w:tcMar>
+          </w:tcPr>
+          <w:p>
+            <w:r>
+              <w:t>Названия каналов этого человека</w:t>
+            </w:r>
+          </w:p>
+        </w:tc>
+      </w:tr>
+      <w:tr>
+        <w:tc>
+          <w:tcPr>
+            <w:tcW w:w="2400" w:type="dxa"/>
+            <w:tcMar>
+              <w:top w:w="60" w:type="dxa"/>
+              <w:left w:w="100" w:type="dxa"/>
+              <w:bottom w:w="60" w:type="dxa"/>
+              <w:right w:w="100" w:type="dxa"/>
+            </w:tcMar>
+          </w:tcPr>
+          <w:p>
+            <w:r>
+              <w:rPr>
+                <w:b/>
+                <w:bCs/>
+              </w:rPr>
+              <w:t>News</w:t>
+            </w:r>
+          </w:p>
+        </w:tc>
+        <w:tc>
+          <w:tcPr>
+            <w:tcW w:w="7238" w:type="dxa"/>
+            <w:tcMar>
+              <w:top w:w="60" w:type="dxa"/>
+              <w:left w:w="100" w:type="dxa"/>
+              <w:bottom w:w="60" w:type="dxa"/>
+              <w:right w:w="100" w:type="dxa"/>
+            </w:tcMar>
+          </w:tcPr>
+          <w:p>
+            <w:r>
+              <w:t>✓</w:t>
+            </w:r>
+            <w:r>
+              <w:t xml:space="preserve"> и дата, если человек сам согласился на новости и предложения</w:t>
+            </w:r>
+          </w:p>
+        </w:tc>
+      </w:tr>
+      <w:tr>
+        <w:tc>
+          <w:tcPr>
+            <w:tcW w:w="2400" w:type="dxa"/>
+            <w:tcMar>
+              <w:top w:w="60" w:type="dxa"/>
+              <w:left w:w="100" w:type="dxa"/>
+              <w:bottom w:w="60" w:type="dxa"/>
+              <w:right w:w="100" w:type="dxa"/>
+            </w:tcMar>
+          </w:tcPr>
+          <w:p>
+            <w:r>
+              <w:rPr>
+                <w:b/>
+                <w:bCs/>
+              </w:rPr>
+              <w:t>Last sign-in</w:t>
+            </w:r>
+          </w:p>
+        </w:tc>
+        <w:tc>
+          <w:tcPr>
+            <w:tcW w:w="7238" w:type="dxa"/>
+            <w:tcMar>
+              <w:top w:w="60" w:type="dxa"/>
+              <w:left w:w="100" w:type="dxa"/>
+              <w:bottom w:w="60" w:type="dxa"/>
+              <w:right w:w="100" w:type="dxa"/>
+            </w:tcMar>
+          </w:tcPr>
+          <w:p>
+            <w:r>
+              <w:t>Когда последний раз входил</w:t>
+            </w:r>
+          </w:p>
+        </w:tc>
+      </w:tr>
+      <w:tr>
+        <w:tc>
+          <w:tcPr>
+            <w:tcW w:w="2400" w:type="dxa"/>
+            <w:tcMar>
+              <w:top w:w="60" w:type="dxa"/>
+              <w:left w:w="100" w:type="dxa"/>
+              <w:bottom w:w="60" w:type="dxa"/>
+              <w:right w:w="100" w:type="dxa"/>
+            </w:tcMar>
+          </w:tcPr>
+          <w:p>
+            <w:r>
+              <w:rPr>
+                <w:b/>
+                <w:bCs/>
+              </w:rPr>
+              <w:t>Signed in</w:t>
+            </w:r>
+          </w:p>
+        </w:tc>
+        <w:tc>
+          <w:tcPr>
+            <w:tcW w:w="7238" w:type="dxa"/>
+            <w:tcMar>
+              <w:top w:w="60" w:type="dxa"/>
+              <w:left w:w="100" w:type="dxa"/>
+              <w:bottom w:w="60" w:type="dxa"/>
+              <w:right w:w="100" w:type="dxa"/>
+            </w:tcMar>
+          </w:tcPr>
+          <w:p>
+            <w:r>
+              <w:t>На скольких устройствах сейчас открыта Студия</w:t>
+            </w:r>
+          </w:p>
+        </w:tc>
+      </w:tr>
+    </w:tbl>
+    <w:p>
+      <w:pPr>
+        <w:spacing w:after="120"/>
+      </w:pPr>
     </w:p>
     <w:tbl>
       <w:tblPr>
@@ -15923,7 +17410,14 @@
                 <w:b/>
                 <w:bCs/>
               </w:rPr>
-              <w:t>Switch off / Switch on</w:t>
+              <w:t>🔑</w:t>
+            </w:r>
+            <w:r>
+              <w:rPr>
+                <w:b/>
+                <w:bCs/>
+              </w:rPr>
+              <w:t xml:space="preserve"> Password</w:t>
             </w:r>
           </w:p>
         </w:tc>
@@ -15939,7 +17433,7 @@
           </w:tcPr>
           <w:p>
             <w:r>
-              <w:t>Временно закрывает или открывает человеку вход</w:t>
+              <w:t>Задаёт новый пароль; человек выходит из Студии на всех устройствах. Сообщите пароль сами (сброса по почте пока нет)</w:t>
             </w:r>
           </w:p>
         </w:tc>
@@ -15961,7 +17455,14 @@
                 <w:b/>
                 <w:bCs/>
               </w:rPr>
-              <w:t>New password</w:t>
+              <w:t>↪</w:t>
+            </w:r>
+            <w:r>
+              <w:rPr>
+                <w:b/>
+                <w:bCs/>
+              </w:rPr>
+              <w:t xml:space="preserve"> Log out</w:t>
             </w:r>
           </w:p>
         </w:tc>
@@ -15977,7 +17478,7 @@
           </w:tcPr>
           <w:p>
             <w:r>
-              <w:t>Задаёт новый пароль — сообщите его человеку сами (сброса по почте пока нет)</w:t>
+              <w:t>Выкидывает человека из Студии на всех устройствах; войти снова он может своим паролем</w:t>
             </w:r>
           </w:p>
         </w:tc>
@@ -15999,7 +17500,14 @@
                 <w:b/>
                 <w:bCs/>
               </w:rPr>
-              <w:t>Delete</w:t>
+              <w:t>⛔</w:t>
+            </w:r>
+            <w:r>
+              <w:rPr>
+                <w:b/>
+                <w:bCs/>
+              </w:rPr>
+              <w:t xml:space="preserve"> Block / ✅ Unblock</w:t>
             </w:r>
           </w:p>
         </w:tc>
@@ -16015,7 +17523,7 @@
           </w:tcPr>
           <w:p>
             <w:r>
-              <w:t>Удаляет аккаунт. Его каналы не пропадают — они переходят к владельцу</w:t>
+              <w:t>Блокирует вход (и сразу выкидывает) или снимает блокировку</w:t>
             </w:r>
           </w:p>
         </w:tc>
@@ -16037,14 +17545,14 @@
                 <w:b/>
                 <w:bCs/>
               </w:rPr>
-              <w:t>⬇</w:t>
+              <w:t>🗑</w:t>
             </w:r>
             <w:r>
               <w:rPr>
                 <w:b/>
                 <w:bCs/>
               </w:rPr>
-              <w:t xml:space="preserve"> Subscribers CSV</w:t>
+              <w:t xml:space="preserve"> Delete</w:t>
             </w:r>
           </w:p>
         </w:tc>
@@ -16060,13 +17568,58 @@
           </w:tcPr>
           <w:p>
             <w:r>
-              <w:t xml:space="preserve">Файл со списком тех, кто </w:t>
-            </w:r>
+              <w:t>Удаляет аккаунт. Его каналы не пропадают — переходят к тому, кто удалил</w:t>
+            </w:r>
+          </w:p>
+        </w:tc>
+      </w:tr>
+      <w:tr>
+        <w:tc>
+          <w:tcPr>
+            <w:tcW w:w="3000" w:type="dxa"/>
+            <w:tcMar>
+              <w:top w:w="60" w:type="dxa"/>
+              <w:left w:w="100" w:type="dxa"/>
+              <w:bottom w:w="60" w:type="dxa"/>
+              <w:right w:w="100" w:type="dxa"/>
+            </w:tcMar>
+          </w:tcPr>
+          <w:p>
             <w:r>
               <w:rPr>
                 <w:b/>
                 <w:bCs/>
               </w:rPr>
+              <w:t>⬇</w:t>
+            </w:r>
+            <w:r>
+              <w:rPr>
+                <w:b/>
+                <w:bCs/>
+              </w:rPr>
+              <w:t xml:space="preserve"> Subscribers CSV</w:t>
+            </w:r>
+          </w:p>
+        </w:tc>
+        <w:tc>
+          <w:tcPr>
+            <w:tcW w:w="6638" w:type="dxa"/>
+            <w:tcMar>
+              <w:top w:w="60" w:type="dxa"/>
+              <w:left w:w="100" w:type="dxa"/>
+              <w:bottom w:w="60" w:type="dxa"/>
+              <w:right w:w="100" w:type="dxa"/>
+            </w:tcMar>
+          </w:tcPr>
+          <w:p>
+            <w:r>
+              <w:t xml:space="preserve">Только у супер-админа и владельца: файл с теми, кто </w:t>
+            </w:r>
+            <w:r>
+              <w:rPr>
+                <w:b/>
+                <w:bCs/>
+              </w:rPr>
               <w:t>сам отметил</w:t>
             </w:r>
             <w:r>
@@ -16080,6 +17633,14 @@
       <w:pPr>
         <w:spacing w:after="120"/>
       </w:pPr>
+    </w:p>
+    <w:p>
+      <w:pPr>
+        <w:spacing w:after="120"/>
+      </w:pPr>
+      <w:r>
+        <w:t>Кнопки показываются только те, на которые у вашей роли есть право. Если права нет, Студия ответит «your role cannot do this».</w:t>
+      </w:r>
     </w:p>
     <w:p>
       <w:pPr>
@@ -16241,10 +17802,10 @@
 <file path=word/numbering.xml><?xml version="1.0" encoding="utf-8"?>
 <w:numbering xmlns:wpc="http://schemas.microsoft.com/office/word/2010/wordprocessingCanvas" xmlns:cx="http://schemas.microsoft.com/office/drawing/2014/chartex" xmlns:cx1="http://schemas.microsoft.com/office/drawing/2015/9/8/chartex" xmlns:cx2="http://schemas.microsoft.com/office/drawing/2015/10/21/chartex" xmlns:cx3="http://schemas.microsoft.com/office/drawing/2016/5/9/chartex" xmlns:cx4="http://schemas.microsoft.com/office/drawing/2016/5/10/chartex" xmlns:cx5="http://schemas.microsoft.com/office/drawing/2016/5/11/chartex" xmlns:cx6="http://schemas.microsoft.com/office/drawing/2016/5/12/chartex" xmlns:cx7="http://schemas.microsoft.com/office/drawing/2016/5/13/chartex" xmlns:cx8="http://schemas.microsoft.com/office/drawing/2016/5/14/chartex" xmlns:mc="http://schemas.openxmlformats.org/markup-compatibility/2006" xmlns:aink="http://schemas.microsoft.com/office/drawing/2016/ink" xmlns:am3d="http://schemas.microsoft.com/office/drawing/2017/model3d" xmlns:o="urn:schemas-microsoft-com:office:office" xmlns:oel="http://schemas.microsoft.com/office/2019/extlst" xmlns:r="http://schemas.openxmlformats.org/officeDocument/2006/relationships" xmlns:m="http://schemas.openxmlformats.org/officeDocument/2006/math" xmlns:v="urn:schemas-microsoft-com:vml" xmlns:wp14="http://schemas.microsoft.com/office/word/2010/wordprocessingDrawing" xmlns:wp="http://schemas.openxmlformats.org/drawingml/2006/wordprocessingDrawing" xmlns:w10="urn:schemas-microsoft-com:office:word" xmlns:w="http://schemas.openxmlformats.org/wordprocessingml/2006/main" xmlns:w14="http://schemas.microsoft.com/office/word/2010/wordml" xmlns:w15="http://schemas.microsoft.com/office/word/2012/wordml" xmlns:w16cex="http://schemas.microsoft.com/office/word/2018/wordml/cex" xmlns:w16cid="http://schemas.microsoft.com/office/word/2016/wordml/cid" xmlns:w16="http://schemas.microsoft.com/office/word/2018/wordml" xmlns:w16du="http://schemas.microsoft.com/office/word/2023/wordml/word16du" xmlns:w16sdtdh="http://schemas.microsoft.com/office/word/2020/wordml/sdtdatahash" xmlns:w16sdtfl="http://schemas.microsoft.com/office/word/2024/wordml/sdtformatlock" xmlns:w16se="http://schemas.microsoft.com/office/word/2015/wordml/symex" xmlns:wpg="http://schemas.microsoft.com/office/word/2010/wordprocessingGroup" xmlns:wpi="http://schemas.microsoft.com/office/word/2010/wordprocessingInk" xmlns:wne="http://schemas.microsoft.com/office/word/2006/wordml" xmlns:wps="http://schemas.microsoft.com/office/word/2010/wordprocessingShape" mc:Ignorable="w14 w15 w16se w16cid w16 w16cex w16sdtdh w16sdtfl w16du wp14">
   <w:abstractNum w:abstractNumId="0" w15:restartNumberingAfterBreak="0">
-    <w:nsid w:val="150D5A3C"/>
+    <w:nsid w:val="06B02E84"/>
     <w:multiLevelType w:val="hybridMultilevel"/>
-    <w:tmpl w:val="F63026D6"/>
-    <w:lvl w:ilvl="0" w:tplc="3E92F574">
+    <w:tmpl w:val="75B64E42"/>
+    <w:lvl w:ilvl="0" w:tplc="CB527D18">
       <w:start w:val="1"/>
       <w:numFmt w:val="decimal"/>
       <w:lvlText w:val="%1."/>
@@ -16253,52 +17814,52 @@
         <w:ind w:left="440" w:hanging="360"/>
       </w:pPr>
     </w:lvl>
-    <w:lvl w:ilvl="1" w:tplc="0D48DDCC">
+    <w:lvl w:ilvl="1" w:tplc="7FDE06A6">
       <w:numFmt w:val="decimal"/>
       <w:lvlText w:val=""/>
       <w:lvlJc w:val="left"/>
     </w:lvl>
-    <w:lvl w:ilvl="2" w:tplc="9DCE552C">
+    <w:lvl w:ilvl="2" w:tplc="6AB41628">
       <w:numFmt w:val="decimal"/>
       <w:lvlText w:val=""/>
       <w:lvlJc w:val="left"/>
     </w:lvl>
-    <w:lvl w:ilvl="3" w:tplc="E75C3BD8">
+    <w:lvl w:ilvl="3" w:tplc="64100DEC">
       <w:numFmt w:val="decimal"/>
       <w:lvlText w:val=""/>
       <w:lvlJc w:val="left"/>
     </w:lvl>
-    <w:lvl w:ilvl="4" w:tplc="2EDAE454">
+    <w:lvl w:ilvl="4" w:tplc="51DAA0EA">
       <w:numFmt w:val="decimal"/>
       <w:lvlText w:val=""/>
       <w:lvlJc w:val="left"/>
     </w:lvl>
-    <w:lvl w:ilvl="5" w:tplc="1C94D3CA">
+    <w:lvl w:ilvl="5" w:tplc="AD52CC90">
       <w:numFmt w:val="decimal"/>
       <w:lvlText w:val=""/>
       <w:lvlJc w:val="left"/>
     </w:lvl>
-    <w:lvl w:ilvl="6" w:tplc="7FE26D8E">
+    <w:lvl w:ilvl="6" w:tplc="58C85322">
       <w:numFmt w:val="decimal"/>
       <w:lvlText w:val=""/>
       <w:lvlJc w:val="left"/>
     </w:lvl>
-    <w:lvl w:ilvl="7" w:tplc="4F8CFD9A">
+    <w:lvl w:ilvl="7" w:tplc="9D462AE6">
       <w:numFmt w:val="decimal"/>
       <w:lvlText w:val=""/>
       <w:lvlJc w:val="left"/>
     </w:lvl>
-    <w:lvl w:ilvl="8" w:tplc="AF18DCFE">
+    <w:lvl w:ilvl="8" w:tplc="017404B6">
       <w:numFmt w:val="decimal"/>
       <w:lvlText w:val=""/>
       <w:lvlJc w:val="left"/>
     </w:lvl>
   </w:abstractNum>
   <w:abstractNum w:abstractNumId="1" w15:restartNumberingAfterBreak="0">
-    <w:nsid w:val="153D7146"/>
+    <w:nsid w:val="08500A70"/>
     <w:multiLevelType w:val="hybridMultilevel"/>
-    <w:tmpl w:val="9D9AA7E8"/>
-    <w:lvl w:ilvl="0" w:tplc="055AB8F2">
+    <w:tmpl w:val="570A75BC"/>
+    <w:lvl w:ilvl="0" w:tplc="52ECA40C">
       <w:start w:val="1"/>
       <w:numFmt w:val="decimal"/>
       <w:lvlText w:val="%1."/>
@@ -16307,106 +17868,106 @@
         <w:ind w:left="440" w:hanging="360"/>
       </w:pPr>
     </w:lvl>
-    <w:lvl w:ilvl="1" w:tplc="9844DEF6">
+    <w:lvl w:ilvl="1" w:tplc="CC2C7112">
       <w:numFmt w:val="decimal"/>
       <w:lvlText w:val=""/>
       <w:lvlJc w:val="left"/>
     </w:lvl>
-    <w:lvl w:ilvl="2" w:tplc="2B5CB5B6">
+    <w:lvl w:ilvl="2" w:tplc="5DDA0240">
       <w:numFmt w:val="decimal"/>
       <w:lvlText w:val=""/>
       <w:lvlJc w:val="left"/>
     </w:lvl>
-    <w:lvl w:ilvl="3" w:tplc="7930BD2C">
+    <w:lvl w:ilvl="3" w:tplc="A0E04058">
       <w:numFmt w:val="decimal"/>
       <w:lvlText w:val=""/>
       <w:lvlJc w:val="left"/>
     </w:lvl>
-    <w:lvl w:ilvl="4" w:tplc="C978A3E6">
+    <w:lvl w:ilvl="4" w:tplc="BC1621C2">
       <w:numFmt w:val="decimal"/>
       <w:lvlText w:val=""/>
       <w:lvlJc w:val="left"/>
     </w:lvl>
-    <w:lvl w:ilvl="5" w:tplc="1756AEA8">
+    <w:lvl w:ilvl="5" w:tplc="925C78E4">
       <w:numFmt w:val="decimal"/>
       <w:lvlText w:val=""/>
       <w:lvlJc w:val="left"/>
     </w:lvl>
-    <w:lvl w:ilvl="6" w:tplc="1748A3D4">
+    <w:lvl w:ilvl="6" w:tplc="3E04A1EA">
       <w:numFmt w:val="decimal"/>
       <w:lvlText w:val=""/>
       <w:lvlJc w:val="left"/>
     </w:lvl>
-    <w:lvl w:ilvl="7" w:tplc="7BAE403C">
+    <w:lvl w:ilvl="7" w:tplc="3A844F0A">
       <w:numFmt w:val="decimal"/>
       <w:lvlText w:val=""/>
       <w:lvlJc w:val="left"/>
     </w:lvl>
-    <w:lvl w:ilvl="8" w:tplc="926E021C">
+    <w:lvl w:ilvl="8" w:tplc="86563852">
       <w:numFmt w:val="decimal"/>
       <w:lvlText w:val=""/>
       <w:lvlJc w:val="left"/>
     </w:lvl>
   </w:abstractNum>
   <w:abstractNum w:abstractNumId="2" w15:restartNumberingAfterBreak="0">
-    <w:nsid w:val="198C4404"/>
+    <w:nsid w:val="0FCA693F"/>
     <w:multiLevelType w:val="hybridMultilevel"/>
-    <w:tmpl w:val="14623350"/>
-    <w:lvl w:ilvl="0" w:tplc="09CC3B06">
+    <w:tmpl w:val="B6FC76CE"/>
+    <w:lvl w:ilvl="0" w:tplc="214CA5D2">
       <w:start w:val="1"/>
-      <w:numFmt w:val="decimal"/>
-      <w:lvlText w:val="%1."/>
+      <w:numFmt w:val="bullet"/>
+      <w:lvlText w:val="•"/>
       <w:lvlJc w:val="left"/>
       <w:pPr>
-        <w:ind w:left="440" w:hanging="360"/>
+        <w:ind w:left="440" w:hanging="280"/>
       </w:pPr>
     </w:lvl>
-    <w:lvl w:ilvl="1" w:tplc="CF521A20">
+    <w:lvl w:ilvl="1" w:tplc="F3221458">
       <w:numFmt w:val="decimal"/>
       <w:lvlText w:val=""/>
       <w:lvlJc w:val="left"/>
     </w:lvl>
-    <w:lvl w:ilvl="2" w:tplc="AB22D246">
+    <w:lvl w:ilvl="2" w:tplc="CBCA8654">
       <w:numFmt w:val="decimal"/>
       <w:lvlText w:val=""/>
       <w:lvlJc w:val="left"/>
     </w:lvl>
-    <w:lvl w:ilvl="3" w:tplc="6D9C85D8">
+    <w:lvl w:ilvl="3" w:tplc="B4FCBAA4">
       <w:numFmt w:val="decimal"/>
       <w:lvlText w:val=""/>
       <w:lvlJc w:val="left"/>
     </w:lvl>
-    <w:lvl w:ilvl="4" w:tplc="3F8A17AC">
+    <w:lvl w:ilvl="4" w:tplc="D72E7DB8">
       <w:numFmt w:val="decimal"/>
       <w:lvlText w:val=""/>
       <w:lvlJc w:val="left"/>
     </w:lvl>
-    <w:lvl w:ilvl="5" w:tplc="86DC3834">
+    <w:lvl w:ilvl="5" w:tplc="8EDE50EE">
       <w:numFmt w:val="decimal"/>
       <w:lvlText w:val=""/>
       <w:lvlJc w:val="left"/>
     </w:lvl>
-    <w:lvl w:ilvl="6" w:tplc="8C2012F4">
+    <w:lvl w:ilvl="6" w:tplc="24CAB6B6">
       <w:numFmt w:val="decimal"/>
       <w:lvlText w:val=""/>
       <w:lvlJc w:val="left"/>
     </w:lvl>
-    <w:lvl w:ilvl="7" w:tplc="82B0327A">
+    <w:lvl w:ilvl="7" w:tplc="1CC4DA82">
       <w:numFmt w:val="decimal"/>
       <w:lvlText w:val=""/>
       <w:lvlJc w:val="left"/>
     </w:lvl>
-    <w:lvl w:ilvl="8" w:tplc="E0D4D23E">
+    <w:lvl w:ilvl="8" w:tplc="62FCF7C6">
       <w:numFmt w:val="decimal"/>
       <w:lvlText w:val=""/>
       <w:lvlJc w:val="left"/>
     </w:lvl>
   </w:abstractNum>
   <w:abstractNum w:abstractNumId="3" w15:restartNumberingAfterBreak="0">
-    <w:nsid w:val="1A4D36F8"/>
+    <w:nsid w:val="270D683F"/>
     <w:multiLevelType w:val="hybridMultilevel"/>
-    <w:tmpl w:val="0882C55E"/>
-    <w:lvl w:ilvl="0" w:tplc="5BB6C17C">
+    <w:tmpl w:val="00365F54"/>
+    <w:lvl w:ilvl="0" w:tplc="A6E2DF58">
       <w:start w:val="1"/>
       <w:numFmt w:val="decimal"/>
       <w:lvlText w:val="%1."/>
@@ -16415,52 +17976,52 @@
         <w:ind w:left="440" w:hanging="360"/>
       </w:pPr>
     </w:lvl>
-    <w:lvl w:ilvl="1" w:tplc="44A85BAA">
+    <w:lvl w:ilvl="1" w:tplc="B4BAC9AC">
       <w:numFmt w:val="decimal"/>
       <w:lvlText w:val=""/>
       <w:lvlJc w:val="left"/>
     </w:lvl>
-    <w:lvl w:ilvl="2" w:tplc="FD0A1DF0">
+    <w:lvl w:ilvl="2" w:tplc="7690D1C8">
       <w:numFmt w:val="decimal"/>
       <w:lvlText w:val=""/>
       <w:lvlJc w:val="left"/>
     </w:lvl>
-    <w:lvl w:ilvl="3" w:tplc="E0D4D7D4">
+    <w:lvl w:ilvl="3" w:tplc="A06CD0C4">
       <w:numFmt w:val="decimal"/>
       <w:lvlText w:val=""/>
       <w:lvlJc w:val="left"/>
     </w:lvl>
-    <w:lvl w:ilvl="4" w:tplc="77009722">
+    <w:lvl w:ilvl="4" w:tplc="6B760154">
       <w:numFmt w:val="decimal"/>
       <w:lvlText w:val=""/>
       <w:lvlJc w:val="left"/>
     </w:lvl>
-    <w:lvl w:ilvl="5" w:tplc="5E5C612A">
+    <w:lvl w:ilvl="5" w:tplc="5CFC8B3E">
       <w:numFmt w:val="decimal"/>
       <w:lvlText w:val=""/>
       <w:lvlJc w:val="left"/>
     </w:lvl>
-    <w:lvl w:ilvl="6" w:tplc="07B06B12">
+    <w:lvl w:ilvl="6" w:tplc="4A425B28">
       <w:numFmt w:val="decimal"/>
       <w:lvlText w:val=""/>
       <w:lvlJc w:val="left"/>
     </w:lvl>
-    <w:lvl w:ilvl="7" w:tplc="F8009A4E">
+    <w:lvl w:ilvl="7" w:tplc="7B7CCFF0">
       <w:numFmt w:val="decimal"/>
       <w:lvlText w:val=""/>
       <w:lvlJc w:val="left"/>
     </w:lvl>
-    <w:lvl w:ilvl="8" w:tplc="076E85C2">
+    <w:lvl w:ilvl="8" w:tplc="E9CA7F9E">
       <w:numFmt w:val="decimal"/>
       <w:lvlText w:val=""/>
       <w:lvlJc w:val="left"/>
     </w:lvl>
   </w:abstractNum>
   <w:abstractNum w:abstractNumId="4" w15:restartNumberingAfterBreak="0">
-    <w:nsid w:val="1AD22B96"/>
+    <w:nsid w:val="299F6382"/>
     <w:multiLevelType w:val="hybridMultilevel"/>
-    <w:tmpl w:val="A0F8B0F2"/>
-    <w:lvl w:ilvl="0" w:tplc="E4807D64">
+    <w:tmpl w:val="6F28B0B6"/>
+    <w:lvl w:ilvl="0" w:tplc="B024F89C">
       <w:start w:val="1"/>
       <w:numFmt w:val="decimal"/>
       <w:lvlText w:val="%1."/>
@@ -16469,138 +18030,52 @@
         <w:ind w:left="440" w:hanging="360"/>
       </w:pPr>
     </w:lvl>
-    <w:lvl w:ilvl="1" w:tplc="D7B6D9D2">
+    <w:lvl w:ilvl="1" w:tplc="030052FC">
       <w:numFmt w:val="decimal"/>
       <w:lvlText w:val=""/>
       <w:lvlJc w:val="left"/>
     </w:lvl>
-    <w:lvl w:ilvl="2" w:tplc="10248EA0">
+    <w:lvl w:ilvl="2" w:tplc="124E7D66">
       <w:numFmt w:val="decimal"/>
       <w:lvlText w:val=""/>
       <w:lvlJc w:val="left"/>
     </w:lvl>
-    <w:lvl w:ilvl="3" w:tplc="28BC3B6A">
+    <w:lvl w:ilvl="3" w:tplc="1B9486AA">
       <w:numFmt w:val="decimal"/>
       <w:lvlText w:val=""/>
       <w:lvlJc w:val="left"/>
     </w:lvl>
-    <w:lvl w:ilvl="4" w:tplc="C8141DE6">
+    <w:lvl w:ilvl="4" w:tplc="90CA3078">
       <w:numFmt w:val="decimal"/>
       <w:lvlText w:val=""/>
       <w:lvlJc w:val="left"/>
     </w:lvl>
-    <w:lvl w:ilvl="5" w:tplc="4014A97E">
+    <w:lvl w:ilvl="5" w:tplc="CE02A780">
       <w:numFmt w:val="decimal"/>
       <w:lvlText w:val=""/>
       <w:lvlJc w:val="left"/>
     </w:lvl>
-    <w:lvl w:ilvl="6" w:tplc="F11454BC">
+    <w:lvl w:ilvl="6" w:tplc="48F435B0">
       <w:numFmt w:val="decimal"/>
       <w:lvlText w:val=""/>
       <w:lvlJc w:val="left"/>
     </w:lvl>
-    <w:lvl w:ilvl="7" w:tplc="459830CC">
+    <w:lvl w:ilvl="7" w:tplc="22A09F3E">
       <w:numFmt w:val="decimal"/>
       <w:lvlText w:val=""/>
       <w:lvlJc w:val="left"/>
     </w:lvl>
-    <w:lvl w:ilvl="8" w:tplc="650A8658">
+    <w:lvl w:ilvl="8" w:tplc="ADE6E064">
       <w:numFmt w:val="decimal"/>
       <w:lvlText w:val=""/>
       <w:lvlJc w:val="left"/>
     </w:lvl>
   </w:abstractNum>
   <w:abstractNum w:abstractNumId="5" w15:restartNumberingAfterBreak="0">
-    <w:nsid w:val="39CA2708"/>
+    <w:nsid w:val="42F1677F"/>
     <w:multiLevelType w:val="hybridMultilevel"/>
-    <w:tmpl w:val="5F362F80"/>
-    <w:lvl w:ilvl="0" w:tplc="A4FCDF7A" w:tentative="1">
-      <w:start w:val="1"/>
-      <w:numFmt w:val="bullet"/>
-      <w:lvlText w:val="●"/>
-      <w:lvlJc w:val="left"/>
-      <w:pPr>
-        <w:ind w:left="720" w:hanging="360"/>
-      </w:pPr>
-    </w:lvl>
-    <w:lvl w:ilvl="1" w:tplc="E83CD9E0" w:tentative="1">
-      <w:start w:val="1"/>
-      <w:numFmt w:val="bullet"/>
-      <w:lvlText w:val="○"/>
-      <w:lvlJc w:val="left"/>
-      <w:pPr>
-        <w:ind w:left="1440" w:hanging="360"/>
-      </w:pPr>
-    </w:lvl>
-    <w:lvl w:ilvl="2" w:tplc="EB2EE0FC" w:tentative="1">
-      <w:start w:val="1"/>
-      <w:numFmt w:val="bullet"/>
-      <w:lvlText w:val="■"/>
-      <w:lvlJc w:val="left"/>
-      <w:pPr>
-        <w:ind w:left="2160" w:hanging="360"/>
-      </w:pPr>
-    </w:lvl>
-    <w:lvl w:ilvl="3" w:tplc="D590B7E8" w:tentative="1">
-      <w:start w:val="1"/>
-      <w:numFmt w:val="bullet"/>
-      <w:lvlText w:val="●"/>
-      <w:lvlJc w:val="left"/>
-      <w:pPr>
-        <w:ind w:left="2880" w:hanging="360"/>
-      </w:pPr>
-    </w:lvl>
-    <w:lvl w:ilvl="4" w:tplc="E3EC5B98" w:tentative="1">
-      <w:start w:val="1"/>
-      <w:numFmt w:val="bullet"/>
-      <w:lvlText w:val="○"/>
-      <w:lvlJc w:val="left"/>
-      <w:pPr>
-        <w:ind w:left="3600" w:hanging="360"/>
-      </w:pPr>
-    </w:lvl>
-    <w:lvl w:ilvl="5" w:tplc="41220CF6" w:tentative="1">
-      <w:start w:val="1"/>
-      <w:numFmt w:val="bullet"/>
-      <w:lvlText w:val="■"/>
-      <w:lvlJc w:val="left"/>
-      <w:pPr>
-        <w:ind w:left="4320" w:hanging="360"/>
-      </w:pPr>
-    </w:lvl>
-    <w:lvl w:ilvl="6" w:tplc="9FDAE5EC" w:tentative="1">
-      <w:start w:val="1"/>
-      <w:numFmt w:val="bullet"/>
-      <w:lvlText w:val="●"/>
-      <w:lvlJc w:val="left"/>
-      <w:pPr>
-        <w:ind w:left="5040" w:hanging="360"/>
-      </w:pPr>
-    </w:lvl>
-    <w:lvl w:ilvl="7" w:tplc="28606518" w:tentative="1">
-      <w:start w:val="1"/>
-      <w:numFmt w:val="bullet"/>
-      <w:lvlText w:val="●"/>
-      <w:lvlJc w:val="left"/>
-      <w:pPr>
-        <w:ind w:left="5760" w:hanging="360"/>
-      </w:pPr>
-    </w:lvl>
-    <w:lvl w:ilvl="8" w:tplc="D9EA7306" w:tentative="1">
-      <w:start w:val="1"/>
-      <w:numFmt w:val="bullet"/>
-      <w:lvlText w:val="●"/>
-      <w:lvlJc w:val="left"/>
-      <w:pPr>
-        <w:ind w:left="6480" w:hanging="360"/>
-      </w:pPr>
-    </w:lvl>
-  </w:abstractNum>
-  <w:abstractNum w:abstractNumId="6" w15:restartNumberingAfterBreak="0">
-    <w:nsid w:val="44F51DEC"/>
-    <w:multiLevelType w:val="hybridMultilevel"/>
-    <w:tmpl w:val="56F09D9E"/>
-    <w:lvl w:ilvl="0" w:tplc="26C6F824">
+    <w:tmpl w:val="7FFECCAA"/>
+    <w:lvl w:ilvl="0" w:tplc="15BC3560">
       <w:start w:val="1"/>
       <w:numFmt w:val="decimal"/>
       <w:lvlText w:val="%1."/>
@@ -16609,52 +18084,106 @@
         <w:ind w:left="440" w:hanging="360"/>
       </w:pPr>
     </w:lvl>
-    <w:lvl w:ilvl="1" w:tplc="4636EB2A">
+    <w:lvl w:ilvl="1" w:tplc="24EA9D16">
       <w:numFmt w:val="decimal"/>
       <w:lvlText w:val=""/>
       <w:lvlJc w:val="left"/>
     </w:lvl>
-    <w:lvl w:ilvl="2" w:tplc="3B8CCD5E">
+    <w:lvl w:ilvl="2" w:tplc="BB8A3C26">
       <w:numFmt w:val="decimal"/>
       <w:lvlText w:val=""/>
       <w:lvlJc w:val="left"/>
     </w:lvl>
-    <w:lvl w:ilvl="3" w:tplc="30A0B088">
+    <w:lvl w:ilvl="3" w:tplc="CF3245D8">
       <w:numFmt w:val="decimal"/>
       <w:lvlText w:val=""/>
       <w:lvlJc w:val="left"/>
     </w:lvl>
-    <w:lvl w:ilvl="4" w:tplc="EA928AD6">
+    <w:lvl w:ilvl="4" w:tplc="BF280BB2">
       <w:numFmt w:val="decimal"/>
       <w:lvlText w:val=""/>
       <w:lvlJc w:val="left"/>
     </w:lvl>
-    <w:lvl w:ilvl="5" w:tplc="CE4E04CE">
+    <w:lvl w:ilvl="5" w:tplc="244CEF46">
       <w:numFmt w:val="decimal"/>
       <w:lvlText w:val=""/>
       <w:lvlJc w:val="left"/>
     </w:lvl>
-    <w:lvl w:ilvl="6" w:tplc="CED4329E">
+    <w:lvl w:ilvl="6" w:tplc="1186B5CC">
       <w:numFmt w:val="decimal"/>
       <w:lvlText w:val=""/>
       <w:lvlJc w:val="left"/>
     </w:lvl>
-    <w:lvl w:ilvl="7" w:tplc="53BA68E2">
+    <w:lvl w:ilvl="7" w:tplc="D8A25E76">
       <w:numFmt w:val="decimal"/>
       <w:lvlText w:val=""/>
       <w:lvlJc w:val="left"/>
     </w:lvl>
-    <w:lvl w:ilvl="8" w:tplc="3DBCC5CC">
+    <w:lvl w:ilvl="8" w:tplc="4FB41C0A">
+      <w:numFmt w:val="decimal"/>
+      <w:lvlText w:val=""/>
+      <w:lvlJc w:val="left"/>
+    </w:lvl>
+  </w:abstractNum>
+  <w:abstractNum w:abstractNumId="6" w15:restartNumberingAfterBreak="0">
+    <w:nsid w:val="5A971EDA"/>
+    <w:multiLevelType w:val="hybridMultilevel"/>
+    <w:tmpl w:val="73EA3FF2"/>
+    <w:lvl w:ilvl="0" w:tplc="9668AF58">
+      <w:start w:val="1"/>
+      <w:numFmt w:val="decimal"/>
+      <w:lvlText w:val="%1."/>
+      <w:lvlJc w:val="left"/>
+      <w:pPr>
+        <w:ind w:left="440" w:hanging="360"/>
+      </w:pPr>
+    </w:lvl>
+    <w:lvl w:ilvl="1" w:tplc="65EA2164">
+      <w:numFmt w:val="decimal"/>
+      <w:lvlText w:val=""/>
+      <w:lvlJc w:val="left"/>
+    </w:lvl>
+    <w:lvl w:ilvl="2" w:tplc="85269126">
+      <w:numFmt w:val="decimal"/>
+      <w:lvlText w:val=""/>
+      <w:lvlJc w:val="left"/>
+    </w:lvl>
+    <w:lvl w:ilvl="3" w:tplc="CEFC47A6">
+      <w:numFmt w:val="decimal"/>
+      <w:lvlText w:val=""/>
+      <w:lvlJc w:val="left"/>
+    </w:lvl>
+    <w:lvl w:ilvl="4" w:tplc="FD568E12">
+      <w:numFmt w:val="decimal"/>
+      <w:lvlText w:val=""/>
+      <w:lvlJc w:val="left"/>
+    </w:lvl>
+    <w:lvl w:ilvl="5" w:tplc="E1507D76">
+      <w:numFmt w:val="decimal"/>
+      <w:lvlText w:val=""/>
+      <w:lvlJc w:val="left"/>
+    </w:lvl>
+    <w:lvl w:ilvl="6" w:tplc="A36266C8">
+      <w:numFmt w:val="decimal"/>
+      <w:lvlText w:val=""/>
+      <w:lvlJc w:val="left"/>
+    </w:lvl>
+    <w:lvl w:ilvl="7" w:tplc="942E229A">
+      <w:numFmt w:val="decimal"/>
+      <w:lvlText w:val=""/>
+      <w:lvlJc w:val="left"/>
+    </w:lvl>
+    <w:lvl w:ilvl="8" w:tplc="C696FE70">
       <w:numFmt w:val="decimal"/>
       <w:lvlText w:val=""/>
       <w:lvlJc w:val="left"/>
     </w:lvl>
   </w:abstractNum>
   <w:abstractNum w:abstractNumId="7" w15:restartNumberingAfterBreak="0">
-    <w:nsid w:val="47584ABC"/>
+    <w:nsid w:val="5FCE3120"/>
     <w:multiLevelType w:val="hybridMultilevel"/>
-    <w:tmpl w:val="891443D6"/>
-    <w:lvl w:ilvl="0" w:tplc="B65ED962">
+    <w:tmpl w:val="88CA1D0A"/>
+    <w:lvl w:ilvl="0" w:tplc="7CBA7CA2">
       <w:start w:val="1"/>
       <w:numFmt w:val="decimal"/>
       <w:lvlText w:val="%1."/>
@@ -16663,52 +18192,138 @@
         <w:ind w:left="440" w:hanging="360"/>
       </w:pPr>
     </w:lvl>
-    <w:lvl w:ilvl="1" w:tplc="FF0CFEFC">
+    <w:lvl w:ilvl="1" w:tplc="EC32F5E2">
       <w:numFmt w:val="decimal"/>
       <w:lvlText w:val=""/>
       <w:lvlJc w:val="left"/>
     </w:lvl>
-    <w:lvl w:ilvl="2" w:tplc="936E8FD2">
+    <w:lvl w:ilvl="2" w:tplc="8B3ABD3C">
       <w:numFmt w:val="decimal"/>
       <w:lvlText w:val=""/>
       <w:lvlJc w:val="left"/>
     </w:lvl>
-    <w:lvl w:ilvl="3" w:tplc="E3F6EB28">
+    <w:lvl w:ilvl="3" w:tplc="2CF0683C">
       <w:numFmt w:val="decimal"/>
       <w:lvlText w:val=""/>
       <w:lvlJc w:val="left"/>
     </w:lvl>
-    <w:lvl w:ilvl="4" w:tplc="2212551E">
+    <w:lvl w:ilvl="4" w:tplc="223E0CF4">
       <w:numFmt w:val="decimal"/>
       <w:lvlText w:val=""/>
       <w:lvlJc w:val="left"/>
     </w:lvl>
-    <w:lvl w:ilvl="5" w:tplc="EA72BF60">
+    <w:lvl w:ilvl="5" w:tplc="2FD67DDC">
       <w:numFmt w:val="decimal"/>
       <w:lvlText w:val=""/>
       <w:lvlJc w:val="left"/>
     </w:lvl>
-    <w:lvl w:ilvl="6" w:tplc="53AC48C4">
+    <w:lvl w:ilvl="6" w:tplc="CB563A28">
       <w:numFmt w:val="decimal"/>
       <w:lvlText w:val=""/>
       <w:lvlJc w:val="left"/>
     </w:lvl>
-    <w:lvl w:ilvl="7" w:tplc="E20C87D4">
+    <w:lvl w:ilvl="7" w:tplc="6EBEDE98">
       <w:numFmt w:val="decimal"/>
       <w:lvlText w:val=""/>
       <w:lvlJc w:val="left"/>
     </w:lvl>
-    <w:lvl w:ilvl="8" w:tplc="33801AA6">
+    <w:lvl w:ilvl="8" w:tplc="FE3A9848">
       <w:numFmt w:val="decimal"/>
       <w:lvlText w:val=""/>
       <w:lvlJc w:val="left"/>
     </w:lvl>
   </w:abstractNum>
   <w:abstractNum w:abstractNumId="8" w15:restartNumberingAfterBreak="0">
-    <w:nsid w:val="5A76216A"/>
+    <w:nsid w:val="612D3D7B"/>
     <w:multiLevelType w:val="hybridMultilevel"/>
-    <w:tmpl w:val="276A75A6"/>
-    <w:lvl w:ilvl="0" w:tplc="EFF402EA">
+    <w:tmpl w:val="776029E4"/>
+    <w:lvl w:ilvl="0" w:tplc="8584783E" w:tentative="1">
+      <w:start w:val="1"/>
+      <w:numFmt w:val="bullet"/>
+      <w:lvlText w:val="●"/>
+      <w:lvlJc w:val="left"/>
+      <w:pPr>
+        <w:ind w:left="720" w:hanging="360"/>
+      </w:pPr>
+    </w:lvl>
+    <w:lvl w:ilvl="1" w:tplc="69F8E210" w:tentative="1">
+      <w:start w:val="1"/>
+      <w:numFmt w:val="bullet"/>
+      <w:lvlText w:val="○"/>
+      <w:lvlJc w:val="left"/>
+      <w:pPr>
+        <w:ind w:left="1440" w:hanging="360"/>
+      </w:pPr>
+    </w:lvl>
+    <w:lvl w:ilvl="2" w:tplc="25F475F8" w:tentative="1">
+      <w:start w:val="1"/>
+      <w:numFmt w:val="bullet"/>
+      <w:lvlText w:val="■"/>
+      <w:lvlJc w:val="left"/>
+      <w:pPr>
+        <w:ind w:left="2160" w:hanging="360"/>
+      </w:pPr>
+    </w:lvl>
+    <w:lvl w:ilvl="3" w:tplc="04D49620" w:tentative="1">
+      <w:start w:val="1"/>
+      <w:numFmt w:val="bullet"/>
+      <w:lvlText w:val="●"/>
+      <w:lvlJc w:val="left"/>
+      <w:pPr>
+        <w:ind w:left="2880" w:hanging="360"/>
+      </w:pPr>
+    </w:lvl>
+    <w:lvl w:ilvl="4" w:tplc="E6F4BFD6" w:tentative="1">
+      <w:start w:val="1"/>
+      <w:numFmt w:val="bullet"/>
+      <w:lvlText w:val="○"/>
+      <w:lvlJc w:val="left"/>
+      <w:pPr>
+        <w:ind w:left="3600" w:hanging="360"/>
+      </w:pPr>
+    </w:lvl>
+    <w:lvl w:ilvl="5" w:tplc="11D45FEA" w:tentative="1">
+      <w:start w:val="1"/>
+      <w:numFmt w:val="bullet"/>
+      <w:lvlText w:val="■"/>
+      <w:lvlJc w:val="left"/>
+      <w:pPr>
+        <w:ind w:left="4320" w:hanging="360"/>
+      </w:pPr>
+    </w:lvl>
+    <w:lvl w:ilvl="6" w:tplc="068444A2" w:tentative="1">
+      <w:start w:val="1"/>
+      <w:numFmt w:val="bullet"/>
+      <w:lvlText w:val="●"/>
+      <w:lvlJc w:val="left"/>
+      <w:pPr>
+        <w:ind w:left="5040" w:hanging="360"/>
+      </w:pPr>
+    </w:lvl>
+    <w:lvl w:ilvl="7" w:tplc="7714B7A2" w:tentative="1">
+      <w:start w:val="1"/>
+      <w:numFmt w:val="bullet"/>
+      <w:lvlText w:val="●"/>
+      <w:lvlJc w:val="left"/>
+      <w:pPr>
+        <w:ind w:left="5760" w:hanging="360"/>
+      </w:pPr>
+    </w:lvl>
+    <w:lvl w:ilvl="8" w:tplc="700E2FA8" w:tentative="1">
+      <w:start w:val="1"/>
+      <w:numFmt w:val="bullet"/>
+      <w:lvlText w:val="●"/>
+      <w:lvlJc w:val="left"/>
+      <w:pPr>
+        <w:ind w:left="6480" w:hanging="360"/>
+      </w:pPr>
+    </w:lvl>
+  </w:abstractNum>
+  <w:abstractNum w:abstractNumId="9" w15:restartNumberingAfterBreak="0">
+    <w:nsid w:val="61B649C8"/>
+    <w:multiLevelType w:val="hybridMultilevel"/>
+    <w:tmpl w:val="7CEC03AE"/>
+    <w:lvl w:ilvl="0" w:tplc="A336BF3A">
       <w:start w:val="1"/>
       <w:numFmt w:val="decimal"/>
       <w:lvlText w:val="%1."/>
@@ -16717,106 +18332,52 @@
         <w:ind w:left="440" w:hanging="360"/>
       </w:pPr>
     </w:lvl>
-    <w:lvl w:ilvl="1" w:tplc="0FC429A2">
+    <w:lvl w:ilvl="1" w:tplc="C4D00FA2">
       <w:numFmt w:val="decimal"/>
       <w:lvlText w:val=""/>
       <w:lvlJc w:val="left"/>
     </w:lvl>
-    <w:lvl w:ilvl="2" w:tplc="A6ACC876">
+    <w:lvl w:ilvl="2" w:tplc="1BA629C2">
       <w:numFmt w:val="decimal"/>
       <w:lvlText w:val=""/>
       <w:lvlJc w:val="left"/>
     </w:lvl>
-    <w:lvl w:ilvl="3" w:tplc="D8D4C80C">
+    <w:lvl w:ilvl="3" w:tplc="63ECD070">
       <w:numFmt w:val="decimal"/>
       <w:lvlText w:val=""/>
       <w:lvlJc w:val="left"/>
     </w:lvl>
-    <w:lvl w:ilvl="4" w:tplc="03AADEBE">
+    <w:lvl w:ilvl="4" w:tplc="D3BA1668">
       <w:numFmt w:val="decimal"/>
       <w:lvlText w:val=""/>
       <w:lvlJc w:val="left"/>
     </w:lvl>
-    <w:lvl w:ilvl="5" w:tplc="AE300662">
+    <w:lvl w:ilvl="5" w:tplc="1966D0E6">
       <w:numFmt w:val="decimal"/>
       <w:lvlText w:val=""/>
       <w:lvlJc w:val="left"/>
     </w:lvl>
-    <w:lvl w:ilvl="6" w:tplc="26B2F050">
+    <w:lvl w:ilvl="6" w:tplc="AC34CAA8">
       <w:numFmt w:val="decimal"/>
       <w:lvlText w:val=""/>
       <w:lvlJc w:val="left"/>
     </w:lvl>
-    <w:lvl w:ilvl="7" w:tplc="CF9C2AFE">
+    <w:lvl w:ilvl="7" w:tplc="1DE42338">
       <w:numFmt w:val="decimal"/>
       <w:lvlText w:val=""/>
       <w:lvlJc w:val="left"/>
     </w:lvl>
-    <w:lvl w:ilvl="8" w:tplc="A5ECB7A6">
-      <w:numFmt w:val="decimal"/>
-      <w:lvlText w:val=""/>
-      <w:lvlJc w:val="left"/>
-    </w:lvl>
-  </w:abstractNum>
-  <w:abstractNum w:abstractNumId="9" w15:restartNumberingAfterBreak="0">
-    <w:nsid w:val="5FD669AA"/>
-    <w:multiLevelType w:val="hybridMultilevel"/>
-    <w:tmpl w:val="C3808DB2"/>
-    <w:lvl w:ilvl="0" w:tplc="8C120DBA">
-      <w:start w:val="1"/>
-      <w:numFmt w:val="decimal"/>
-      <w:lvlText w:val="%1."/>
-      <w:lvlJc w:val="left"/>
-      <w:pPr>
-        <w:ind w:left="440" w:hanging="360"/>
-      </w:pPr>
-    </w:lvl>
-    <w:lvl w:ilvl="1" w:tplc="F7CAA018">
-      <w:numFmt w:val="decimal"/>
-      <w:lvlText w:val=""/>
-      <w:lvlJc w:val="left"/>
-    </w:lvl>
-    <w:lvl w:ilvl="2" w:tplc="2E049D7E">
-      <w:numFmt w:val="decimal"/>
-      <w:lvlText w:val=""/>
-      <w:lvlJc w:val="left"/>
-    </w:lvl>
-    <w:lvl w:ilvl="3" w:tplc="93CED834">
-      <w:numFmt w:val="decimal"/>
-      <w:lvlText w:val=""/>
-      <w:lvlJc w:val="left"/>
-    </w:lvl>
-    <w:lvl w:ilvl="4" w:tplc="D2C2DC82">
-      <w:numFmt w:val="decimal"/>
-      <w:lvlText w:val=""/>
-      <w:lvlJc w:val="left"/>
-    </w:lvl>
-    <w:lvl w:ilvl="5" w:tplc="24A40224">
-      <w:numFmt w:val="decimal"/>
-      <w:lvlText w:val=""/>
-      <w:lvlJc w:val="left"/>
-    </w:lvl>
-    <w:lvl w:ilvl="6" w:tplc="62F0F406">
-      <w:numFmt w:val="decimal"/>
-      <w:lvlText w:val=""/>
-      <w:lvlJc w:val="left"/>
-    </w:lvl>
-    <w:lvl w:ilvl="7" w:tplc="2076BA48">
-      <w:numFmt w:val="decimal"/>
-      <w:lvlText w:val=""/>
-      <w:lvlJc w:val="left"/>
-    </w:lvl>
-    <w:lvl w:ilvl="8" w:tplc="D5361B3E">
+    <w:lvl w:ilvl="8" w:tplc="5E345530">
       <w:numFmt w:val="decimal"/>
       <w:lvlText w:val=""/>
       <w:lvlJc w:val="left"/>
     </w:lvl>
   </w:abstractNum>
   <w:abstractNum w:abstractNumId="10" w15:restartNumberingAfterBreak="0">
-    <w:nsid w:val="626F03EA"/>
+    <w:nsid w:val="691E6080"/>
     <w:multiLevelType w:val="hybridMultilevel"/>
-    <w:tmpl w:val="9244E702"/>
-    <w:lvl w:ilvl="0" w:tplc="ECDE927C">
+    <w:tmpl w:val="CD721410"/>
+    <w:lvl w:ilvl="0" w:tplc="E87A5342">
       <w:start w:val="1"/>
       <w:numFmt w:val="decimal"/>
       <w:lvlText w:val="%1."/>
@@ -16825,106 +18386,106 @@
         <w:ind w:left="440" w:hanging="360"/>
       </w:pPr>
     </w:lvl>
-    <w:lvl w:ilvl="1" w:tplc="49524714">
+    <w:lvl w:ilvl="1" w:tplc="847E4B7A">
       <w:numFmt w:val="decimal"/>
       <w:lvlText w:val=""/>
       <w:lvlJc w:val="left"/>
     </w:lvl>
-    <w:lvl w:ilvl="2" w:tplc="2C5E777C">
+    <w:lvl w:ilvl="2" w:tplc="D5DA977A">
       <w:numFmt w:val="decimal"/>
       <w:lvlText w:val=""/>
       <w:lvlJc w:val="left"/>
     </w:lvl>
-    <w:lvl w:ilvl="3" w:tplc="2C1805A0">
+    <w:lvl w:ilvl="3" w:tplc="A6D85354">
       <w:numFmt w:val="decimal"/>
       <w:lvlText w:val=""/>
       <w:lvlJc w:val="left"/>
     </w:lvl>
-    <w:lvl w:ilvl="4" w:tplc="319CB6D4">
+    <w:lvl w:ilvl="4" w:tplc="171E1B6C">
       <w:numFmt w:val="decimal"/>
       <w:lvlText w:val=""/>
       <w:lvlJc w:val="left"/>
     </w:lvl>
-    <w:lvl w:ilvl="5" w:tplc="5E94D36C">
+    <w:lvl w:ilvl="5" w:tplc="426440E0">
       <w:numFmt w:val="decimal"/>
       <w:lvlText w:val=""/>
       <w:lvlJc w:val="left"/>
     </w:lvl>
-    <w:lvl w:ilvl="6" w:tplc="9342D410">
+    <w:lvl w:ilvl="6" w:tplc="3488B874">
       <w:numFmt w:val="decimal"/>
       <w:lvlText w:val=""/>
       <w:lvlJc w:val="left"/>
     </w:lvl>
-    <w:lvl w:ilvl="7" w:tplc="FA94ACDA">
+    <w:lvl w:ilvl="7" w:tplc="F0E04C38">
       <w:numFmt w:val="decimal"/>
       <w:lvlText w:val=""/>
       <w:lvlJc w:val="left"/>
     </w:lvl>
-    <w:lvl w:ilvl="8" w:tplc="A13AD196">
+    <w:lvl w:ilvl="8" w:tplc="9202F120">
       <w:numFmt w:val="decimal"/>
       <w:lvlText w:val=""/>
       <w:lvlJc w:val="left"/>
     </w:lvl>
   </w:abstractNum>
   <w:abstractNum w:abstractNumId="11" w15:restartNumberingAfterBreak="0">
-    <w:nsid w:val="664E033D"/>
+    <w:nsid w:val="6BF43CD3"/>
     <w:multiLevelType w:val="hybridMultilevel"/>
-    <w:tmpl w:val="C9021074"/>
-    <w:lvl w:ilvl="0" w:tplc="84D2DA4A">
+    <w:tmpl w:val="55CCDA62"/>
+    <w:lvl w:ilvl="0" w:tplc="90DA8586">
       <w:start w:val="1"/>
-      <w:numFmt w:val="bullet"/>
-      <w:lvlText w:val="•"/>
+      <w:numFmt w:val="decimal"/>
+      <w:lvlText w:val="%1."/>
       <w:lvlJc w:val="left"/>
       <w:pPr>
-        <w:ind w:left="440" w:hanging="280"/>
+        <w:ind w:left="440" w:hanging="360"/>
       </w:pPr>
     </w:lvl>
-    <w:lvl w:ilvl="1" w:tplc="E1E6E88E">
+    <w:lvl w:ilvl="1" w:tplc="0BB69916">
       <w:numFmt w:val="decimal"/>
       <w:lvlText w:val=""/>
       <w:lvlJc w:val="left"/>
     </w:lvl>
-    <w:lvl w:ilvl="2" w:tplc="2BA487C2">
+    <w:lvl w:ilvl="2" w:tplc="88B6107A">
       <w:numFmt w:val="decimal"/>
       <w:lvlText w:val=""/>
       <w:lvlJc w:val="left"/>
     </w:lvl>
-    <w:lvl w:ilvl="3" w:tplc="875E9F3C">
+    <w:lvl w:ilvl="3" w:tplc="5582B414">
       <w:numFmt w:val="decimal"/>
       <w:lvlText w:val=""/>
       <w:lvlJc w:val="left"/>
     </w:lvl>
-    <w:lvl w:ilvl="4" w:tplc="69A09EF4">
+    <w:lvl w:ilvl="4" w:tplc="D2F6D1E0">
       <w:numFmt w:val="decimal"/>
       <w:lvlText w:val=""/>
       <w:lvlJc w:val="left"/>
     </w:lvl>
-    <w:lvl w:ilvl="5" w:tplc="A6929758">
+    <w:lvl w:ilvl="5" w:tplc="0776A30C">
       <w:numFmt w:val="decimal"/>
       <w:lvlText w:val=""/>
       <w:lvlJc w:val="left"/>
     </w:lvl>
-    <w:lvl w:ilvl="6" w:tplc="88FCD4A6">
+    <w:lvl w:ilvl="6" w:tplc="781AE520">
       <w:numFmt w:val="decimal"/>
       <w:lvlText w:val=""/>
       <w:lvlJc w:val="left"/>
     </w:lvl>
-    <w:lvl w:ilvl="7" w:tplc="96384C58">
+    <w:lvl w:ilvl="7" w:tplc="86807740">
       <w:numFmt w:val="decimal"/>
       <w:lvlText w:val=""/>
       <w:lvlJc w:val="left"/>
     </w:lvl>
-    <w:lvl w:ilvl="8" w:tplc="4E86BC18">
+    <w:lvl w:ilvl="8" w:tplc="4B8C9E42">
       <w:numFmt w:val="decimal"/>
       <w:lvlText w:val=""/>
       <w:lvlJc w:val="left"/>
     </w:lvl>
   </w:abstractNum>
   <w:abstractNum w:abstractNumId="12" w15:restartNumberingAfterBreak="0">
-    <w:nsid w:val="6A0754BB"/>
+    <w:nsid w:val="724751E4"/>
     <w:multiLevelType w:val="hybridMultilevel"/>
-    <w:tmpl w:val="96465FF2"/>
-    <w:lvl w:ilvl="0" w:tplc="38464658">
+    <w:tmpl w:val="A46EAB42"/>
+    <w:lvl w:ilvl="0" w:tplc="A4A01108">
       <w:start w:val="1"/>
       <w:numFmt w:val="decimal"/>
       <w:lvlText w:val="%1."/>
@@ -16933,52 +18494,52 @@
         <w:ind w:left="440" w:hanging="360"/>
       </w:pPr>
     </w:lvl>
-    <w:lvl w:ilvl="1" w:tplc="F018507E">
+    <w:lvl w:ilvl="1" w:tplc="C2C49354">
       <w:numFmt w:val="decimal"/>
       <w:lvlText w:val=""/>
       <w:lvlJc w:val="left"/>
     </w:lvl>
-    <w:lvl w:ilvl="2" w:tplc="7E96D528">
+    <w:lvl w:ilvl="2" w:tplc="79DE9AEA">
       <w:numFmt w:val="decimal"/>
       <w:lvlText w:val=""/>
       <w:lvlJc w:val="left"/>
     </w:lvl>
-    <w:lvl w:ilvl="3" w:tplc="1540B4E6">
+    <w:lvl w:ilvl="3" w:tplc="7206D964">
       <w:numFmt w:val="decimal"/>
       <w:lvlText w:val=""/>
       <w:lvlJc w:val="left"/>
     </w:lvl>
-    <w:lvl w:ilvl="4" w:tplc="8FA42950">
+    <w:lvl w:ilvl="4" w:tplc="49F81370">
       <w:numFmt w:val="decimal"/>
       <w:lvlText w:val=""/>
       <w:lvlJc w:val="left"/>
     </w:lvl>
-    <w:lvl w:ilvl="5" w:tplc="2CC6F5C2">
+    <w:lvl w:ilvl="5" w:tplc="3418FA8C">
       <w:numFmt w:val="decimal"/>
       <w:lvlText w:val=""/>
       <w:lvlJc w:val="left"/>
     </w:lvl>
-    <w:lvl w:ilvl="6" w:tplc="A210A7BE">
+    <w:lvl w:ilvl="6" w:tplc="60CCFF94">
       <w:numFmt w:val="decimal"/>
       <w:lvlText w:val=""/>
       <w:lvlJc w:val="left"/>
     </w:lvl>
-    <w:lvl w:ilvl="7" w:tplc="9CCE1E20">
+    <w:lvl w:ilvl="7" w:tplc="6DEA2BFC">
       <w:numFmt w:val="decimal"/>
       <w:lvlText w:val=""/>
       <w:lvlJc w:val="left"/>
     </w:lvl>
-    <w:lvl w:ilvl="8" w:tplc="FC8C4116">
+    <w:lvl w:ilvl="8" w:tplc="F11EC8B8">
       <w:numFmt w:val="decimal"/>
       <w:lvlText w:val=""/>
       <w:lvlJc w:val="left"/>
     </w:lvl>
   </w:abstractNum>
   <w:abstractNum w:abstractNumId="13" w15:restartNumberingAfterBreak="0">
-    <w:nsid w:val="6F351717"/>
+    <w:nsid w:val="73F55B75"/>
     <w:multiLevelType w:val="hybridMultilevel"/>
-    <w:tmpl w:val="1EF622FE"/>
-    <w:lvl w:ilvl="0" w:tplc="F0BCF370">
+    <w:tmpl w:val="C1C40F10"/>
+    <w:lvl w:ilvl="0" w:tplc="1FEC2C34">
       <w:start w:val="1"/>
       <w:numFmt w:val="decimal"/>
       <w:lvlText w:val="%1."/>
@@ -16987,127 +18548,127 @@
         <w:ind w:left="440" w:hanging="360"/>
       </w:pPr>
     </w:lvl>
-    <w:lvl w:ilvl="1" w:tplc="9990AD50">
+    <w:lvl w:ilvl="1" w:tplc="45ECC33E">
       <w:numFmt w:val="decimal"/>
       <w:lvlText w:val=""/>
       <w:lvlJc w:val="left"/>
     </w:lvl>
-    <w:lvl w:ilvl="2" w:tplc="59E0402E">
+    <w:lvl w:ilvl="2" w:tplc="B87AA202">
       <w:numFmt w:val="decimal"/>
       <w:lvlText w:val=""/>
       <w:lvlJc w:val="left"/>
     </w:lvl>
-    <w:lvl w:ilvl="3" w:tplc="7E0ADD4A">
+    <w:lvl w:ilvl="3" w:tplc="A96E515C">
       <w:numFmt w:val="decimal"/>
       <w:lvlText w:val=""/>
       <w:lvlJc w:val="left"/>
     </w:lvl>
-    <w:lvl w:ilvl="4" w:tplc="1E90FFF4">
+    <w:lvl w:ilvl="4" w:tplc="B2E46CF4">
       <w:numFmt w:val="decimal"/>
       <w:lvlText w:val=""/>
       <w:lvlJc w:val="left"/>
     </w:lvl>
-    <w:lvl w:ilvl="5" w:tplc="E468EC38">
+    <w:lvl w:ilvl="5" w:tplc="5880A8F6">
       <w:numFmt w:val="decimal"/>
       <w:lvlText w:val=""/>
       <w:lvlJc w:val="left"/>
     </w:lvl>
-    <w:lvl w:ilvl="6" w:tplc="B01A5048">
+    <w:lvl w:ilvl="6" w:tplc="734471AA">
       <w:numFmt w:val="decimal"/>
       <w:lvlText w:val=""/>
       <w:lvlJc w:val="left"/>
     </w:lvl>
-    <w:lvl w:ilvl="7" w:tplc="606685C2">
+    <w:lvl w:ilvl="7" w:tplc="EAF43868">
       <w:numFmt w:val="decimal"/>
       <w:lvlText w:val=""/>
       <w:lvlJc w:val="left"/>
     </w:lvl>
-    <w:lvl w:ilvl="8" w:tplc="EEB0702E">
+    <w:lvl w:ilvl="8" w:tplc="5BC40A5A">
       <w:numFmt w:val="decimal"/>
       <w:lvlText w:val=""/>
       <w:lvlJc w:val="left"/>
     </w:lvl>
   </w:abstractNum>
-  <w:num w:numId="1" w16cid:durableId="547912507">
+  <w:num w:numId="1" w16cid:durableId="1312909871">
+    <w:abstractNumId w:val="8"/>
+    <w:lvlOverride w:ilvl="0">
+      <w:startOverride w:val="1"/>
+    </w:lvlOverride>
+  </w:num>
+  <w:num w:numId="2" w16cid:durableId="1718121906">
+    <w:abstractNumId w:val="1"/>
+    <w:lvlOverride w:ilvl="0">
+      <w:startOverride w:val="1"/>
+    </w:lvlOverride>
+  </w:num>
+  <w:num w:numId="3" w16cid:durableId="1368527606">
+    <w:abstractNumId w:val="2"/>
+    <w:lvlOverride w:ilvl="0">
+      <w:startOverride w:val="1"/>
+    </w:lvlOverride>
+  </w:num>
+  <w:num w:numId="4" w16cid:durableId="864751078">
+    <w:abstractNumId w:val="11"/>
+    <w:lvlOverride w:ilvl="0">
+      <w:startOverride w:val="1"/>
+    </w:lvlOverride>
+  </w:num>
+  <w:num w:numId="5" w16cid:durableId="1137991824">
+    <w:abstractNumId w:val="9"/>
+    <w:lvlOverride w:ilvl="0">
+      <w:startOverride w:val="1"/>
+    </w:lvlOverride>
+  </w:num>
+  <w:num w:numId="6" w16cid:durableId="315378990">
+    <w:abstractNumId w:val="0"/>
+    <w:lvlOverride w:ilvl="0">
+      <w:startOverride w:val="1"/>
+    </w:lvlOverride>
+  </w:num>
+  <w:num w:numId="7" w16cid:durableId="1194729652">
+    <w:abstractNumId w:val="7"/>
+    <w:lvlOverride w:ilvl="0">
+      <w:startOverride w:val="1"/>
+    </w:lvlOverride>
+  </w:num>
+  <w:num w:numId="8" w16cid:durableId="1557937618">
+    <w:abstractNumId w:val="13"/>
+    <w:lvlOverride w:ilvl="0">
+      <w:startOverride w:val="1"/>
+    </w:lvlOverride>
+  </w:num>
+  <w:num w:numId="9" w16cid:durableId="1379356572">
+    <w:abstractNumId w:val="3"/>
+    <w:lvlOverride w:ilvl="0">
+      <w:startOverride w:val="1"/>
+    </w:lvlOverride>
+  </w:num>
+  <w:num w:numId="10" w16cid:durableId="392629095">
+    <w:abstractNumId w:val="10"/>
+    <w:lvlOverride w:ilvl="0">
+      <w:startOverride w:val="1"/>
+    </w:lvlOverride>
+  </w:num>
+  <w:num w:numId="11" w16cid:durableId="234170172">
+    <w:abstractNumId w:val="12"/>
+    <w:lvlOverride w:ilvl="0">
+      <w:startOverride w:val="1"/>
+    </w:lvlOverride>
+  </w:num>
+  <w:num w:numId="12" w16cid:durableId="219947876">
     <w:abstractNumId w:val="5"/>
     <w:lvlOverride w:ilvl="0">
       <w:startOverride w:val="1"/>
     </w:lvlOverride>
   </w:num>
-  <w:num w:numId="2" w16cid:durableId="1846093733">
+  <w:num w:numId="13" w16cid:durableId="408499128">
     <w:abstractNumId w:val="4"/>
     <w:lvlOverride w:ilvl="0">
       <w:startOverride w:val="1"/>
     </w:lvlOverride>
   </w:num>
-  <w:num w:numId="3" w16cid:durableId="1739671315">
-    <w:abstractNumId w:val="11"/>
-    <w:lvlOverride w:ilvl="0">
-      <w:startOverride w:val="1"/>
-    </w:lvlOverride>
-  </w:num>
-  <w:num w:numId="4" w16cid:durableId="765731433">
-    <w:abstractNumId w:val="7"/>
-    <w:lvlOverride w:ilvl="0">
-      <w:startOverride w:val="1"/>
-    </w:lvlOverride>
-  </w:num>
-  <w:num w:numId="5" w16cid:durableId="422410272">
-    <w:abstractNumId w:val="1"/>
-    <w:lvlOverride w:ilvl="0">
-      <w:startOverride w:val="1"/>
-    </w:lvlOverride>
-  </w:num>
-  <w:num w:numId="6" w16cid:durableId="2006393286">
-    <w:abstractNumId w:val="10"/>
-    <w:lvlOverride w:ilvl="0">
-      <w:startOverride w:val="1"/>
-    </w:lvlOverride>
-  </w:num>
-  <w:num w:numId="7" w16cid:durableId="1103384581">
-    <w:abstractNumId w:val="12"/>
-    <w:lvlOverride w:ilvl="0">
-      <w:startOverride w:val="1"/>
-    </w:lvlOverride>
-  </w:num>
-  <w:num w:numId="8" w16cid:durableId="1307858414">
-    <w:abstractNumId w:val="9"/>
-    <w:lvlOverride w:ilvl="0">
-      <w:startOverride w:val="1"/>
-    </w:lvlOverride>
-  </w:num>
-  <w:num w:numId="9" w16cid:durableId="1160074474">
+  <w:num w:numId="14" w16cid:durableId="808286045">
     <w:abstractNumId w:val="6"/>
-    <w:lvlOverride w:ilvl="0">
-      <w:startOverride w:val="1"/>
-    </w:lvlOverride>
-  </w:num>
-  <w:num w:numId="10" w16cid:durableId="778378714">
-    <w:abstractNumId w:val="2"/>
-    <w:lvlOverride w:ilvl="0">
-      <w:startOverride w:val="1"/>
-    </w:lvlOverride>
-  </w:num>
-  <w:num w:numId="11" w16cid:durableId="1855881165">
-    <w:abstractNumId w:val="0"/>
-    <w:lvlOverride w:ilvl="0">
-      <w:startOverride w:val="1"/>
-    </w:lvlOverride>
-  </w:num>
-  <w:num w:numId="12" w16cid:durableId="1828933671">
-    <w:abstractNumId w:val="8"/>
-    <w:lvlOverride w:ilvl="0">
-      <w:startOverride w:val="1"/>
-    </w:lvlOverride>
-  </w:num>
-  <w:num w:numId="13" w16cid:durableId="1098598253">
-    <w:abstractNumId w:val="13"/>
-    <w:lvlOverride w:ilvl="0">
-      <w:startOverride w:val="1"/>
-    </w:lvlOverride>
-  </w:num>
-  <w:num w:numId="14" w16cid:durableId="1568998395">
-    <w:abstractNumId w:val="3"/>
     <w:lvlOverride w:ilvl="0">
       <w:startOverride w:val="1"/>
     </w:lvlOverride>

</xml_diff>

<commit_message>
Guide: FLUX resets at 00:00 UTC, ~50 pictures/~8 videos a day at 5 steps; Business #1 published
</commit_message>
<xml_diff>
--- a/Vid Studio — инструкция от А до Я.docx
+++ b/Vid Studio — инструкция от А до Я.docx
@@ -107,7 +107,7 @@
     <w:sdt>
       <w:sdtPr>
         <w:alias w:val="Содержание"/>
-        <w:id w:val="685800070"/>
+        <w:id w:val="-1840297547"/>
         <w:docPartObj>
           <w:docPartGallery w:val="Table of Contents"/>
           <w:docPartUnique/>
@@ -139,7 +139,7 @@
           <w:r>
             <w:fldChar w:fldCharType="separate"/>
           </w:r>
-          <w:hyperlink w:anchor="_Toc244133843" w:history="1">
+          <w:hyperlink w:anchor="_Toc244135745" w:history="1">
             <w:r>
               <w:rPr>
                 <w:rStyle w:val="Hyperlink"/>
@@ -163,7 +163,7 @@
               <w:rPr>
                 <w:noProof/>
               </w:rPr>
-              <w:instrText xml:space="preserve"> PAGEREF _Toc244133843 \h </w:instrText>
+              <w:instrText xml:space="preserve"> PAGEREF _Toc244135745 \h </w:instrText>
             </w:r>
             <w:r>
               <w:rPr>
@@ -205,7 +205,7 @@
               <w14:ligatures w14:val="standardContextual"/>
             </w:rPr>
           </w:pPr>
-          <w:hyperlink w:anchor="_Toc244133844" w:history="1">
+          <w:hyperlink w:anchor="_Toc244135746" w:history="1">
             <w:r>
               <w:rPr>
                 <w:rStyle w:val="Hyperlink"/>
@@ -229,7 +229,7 @@
               <w:rPr>
                 <w:noProof/>
               </w:rPr>
-              <w:instrText xml:space="preserve"> PAGEREF _Toc244133844 \h </w:instrText>
+              <w:instrText xml:space="preserve"> PAGEREF _Toc244135746 \h </w:instrText>
             </w:r>
             <w:r>
               <w:rPr>
@@ -271,7 +271,7 @@
               <w14:ligatures w14:val="standardContextual"/>
             </w:rPr>
           </w:pPr>
-          <w:hyperlink w:anchor="_Toc244133845" w:history="1">
+          <w:hyperlink w:anchor="_Toc244135747" w:history="1">
             <w:r>
               <w:rPr>
                 <w:rStyle w:val="Hyperlink"/>
@@ -295,7 +295,7 @@
               <w:rPr>
                 <w:noProof/>
               </w:rPr>
-              <w:instrText xml:space="preserve"> PAGEREF _Toc244133845 \h </w:instrText>
+              <w:instrText xml:space="preserve"> PAGEREF _Toc244135747 \h </w:instrText>
             </w:r>
             <w:r>
               <w:rPr>
@@ -337,7 +337,7 @@
               <w14:ligatures w14:val="standardContextual"/>
             </w:rPr>
           </w:pPr>
-          <w:hyperlink w:anchor="_Toc244133846" w:history="1">
+          <w:hyperlink w:anchor="_Toc244135748" w:history="1">
             <w:r>
               <w:rPr>
                 <w:rStyle w:val="Hyperlink"/>
@@ -361,7 +361,7 @@
               <w:rPr>
                 <w:noProof/>
               </w:rPr>
-              <w:instrText xml:space="preserve"> PAGEREF _Toc244133846 \h </w:instrText>
+              <w:instrText xml:space="preserve"> PAGEREF _Toc244135748 \h </w:instrText>
             </w:r>
             <w:r>
               <w:rPr>
@@ -403,7 +403,7 @@
               <w14:ligatures w14:val="standardContextual"/>
             </w:rPr>
           </w:pPr>
-          <w:hyperlink w:anchor="_Toc244133847" w:history="1">
+          <w:hyperlink w:anchor="_Toc244135749" w:history="1">
             <w:r>
               <w:rPr>
                 <w:rStyle w:val="Hyperlink"/>
@@ -427,7 +427,7 @@
               <w:rPr>
                 <w:noProof/>
               </w:rPr>
-              <w:instrText xml:space="preserve"> PAGEREF _Toc244133847 \h </w:instrText>
+              <w:instrText xml:space="preserve"> PAGEREF _Toc244135749 \h </w:instrText>
             </w:r>
             <w:r>
               <w:rPr>
@@ -469,7 +469,7 @@
               <w14:ligatures w14:val="standardContextual"/>
             </w:rPr>
           </w:pPr>
-          <w:hyperlink w:anchor="_Toc244133848" w:history="1">
+          <w:hyperlink w:anchor="_Toc244135750" w:history="1">
             <w:r>
               <w:rPr>
                 <w:rStyle w:val="Hyperlink"/>
@@ -493,7 +493,7 @@
               <w:rPr>
                 <w:noProof/>
               </w:rPr>
-              <w:instrText xml:space="preserve"> PAGEREF _Toc244133848 \h </w:instrText>
+              <w:instrText xml:space="preserve"> PAGEREF _Toc244135750 \h </w:instrText>
             </w:r>
             <w:r>
               <w:rPr>
@@ -535,7 +535,7 @@
               <w14:ligatures w14:val="standardContextual"/>
             </w:rPr>
           </w:pPr>
-          <w:hyperlink w:anchor="_Toc244133849" w:history="1">
+          <w:hyperlink w:anchor="_Toc244135751" w:history="1">
             <w:r>
               <w:rPr>
                 <w:rStyle w:val="Hyperlink"/>
@@ -559,7 +559,7 @@
               <w:rPr>
                 <w:noProof/>
               </w:rPr>
-              <w:instrText xml:space="preserve"> PAGEREF _Toc244133849 \h </w:instrText>
+              <w:instrText xml:space="preserve"> PAGEREF _Toc244135751 \h </w:instrText>
             </w:r>
             <w:r>
               <w:rPr>
@@ -601,7 +601,7 @@
               <w14:ligatures w14:val="standardContextual"/>
             </w:rPr>
           </w:pPr>
-          <w:hyperlink w:anchor="_Toc244133850" w:history="1">
+          <w:hyperlink w:anchor="_Toc244135752" w:history="1">
             <w:r>
               <w:rPr>
                 <w:rStyle w:val="Hyperlink"/>
@@ -625,7 +625,7 @@
               <w:rPr>
                 <w:noProof/>
               </w:rPr>
-              <w:instrText xml:space="preserve"> PAGEREF _Toc244133850 \h </w:instrText>
+              <w:instrText xml:space="preserve"> PAGEREF _Toc244135752 \h </w:instrText>
             </w:r>
             <w:r>
               <w:rPr>
@@ -667,7 +667,7 @@
               <w14:ligatures w14:val="standardContextual"/>
             </w:rPr>
           </w:pPr>
-          <w:hyperlink w:anchor="_Toc244133851" w:history="1">
+          <w:hyperlink w:anchor="_Toc244135753" w:history="1">
             <w:r>
               <w:rPr>
                 <w:rStyle w:val="Hyperlink"/>
@@ -691,7 +691,7 @@
               <w:rPr>
                 <w:noProof/>
               </w:rPr>
-              <w:instrText xml:space="preserve"> PAGEREF _Toc244133851 \h </w:instrText>
+              <w:instrText xml:space="preserve"> PAGEREF _Toc244135753 \h </w:instrText>
             </w:r>
             <w:r>
               <w:rPr>
@@ -733,7 +733,7 @@
               <w14:ligatures w14:val="standardContextual"/>
             </w:rPr>
           </w:pPr>
-          <w:hyperlink w:anchor="_Toc244133852" w:history="1">
+          <w:hyperlink w:anchor="_Toc244135754" w:history="1">
             <w:r>
               <w:rPr>
                 <w:rStyle w:val="Hyperlink"/>
@@ -757,7 +757,7 @@
               <w:rPr>
                 <w:noProof/>
               </w:rPr>
-              <w:instrText xml:space="preserve"> PAGEREF _Toc244133852 \h </w:instrText>
+              <w:instrText xml:space="preserve"> PAGEREF _Toc244135754 \h </w:instrText>
             </w:r>
             <w:r>
               <w:rPr>
@@ -799,7 +799,7 @@
               <w14:ligatures w14:val="standardContextual"/>
             </w:rPr>
           </w:pPr>
-          <w:hyperlink w:anchor="_Toc244133853" w:history="1">
+          <w:hyperlink w:anchor="_Toc244135755" w:history="1">
             <w:r>
               <w:rPr>
                 <w:rStyle w:val="Hyperlink"/>
@@ -823,7 +823,7 @@
               <w:rPr>
                 <w:noProof/>
               </w:rPr>
-              <w:instrText xml:space="preserve"> PAGEREF _Toc244133853 \h </w:instrText>
+              <w:instrText xml:space="preserve"> PAGEREF _Toc244135755 \h </w:instrText>
             </w:r>
             <w:r>
               <w:rPr>
@@ -865,7 +865,7 @@
               <w14:ligatures w14:val="standardContextual"/>
             </w:rPr>
           </w:pPr>
-          <w:hyperlink w:anchor="_Toc244133854" w:history="1">
+          <w:hyperlink w:anchor="_Toc244135756" w:history="1">
             <w:r>
               <w:rPr>
                 <w:rStyle w:val="Hyperlink"/>
@@ -889,7 +889,7 @@
               <w:rPr>
                 <w:noProof/>
               </w:rPr>
-              <w:instrText xml:space="preserve"> PAGEREF _Toc244133854 \h </w:instrText>
+              <w:instrText xml:space="preserve"> PAGEREF _Toc244135756 \h </w:instrText>
             </w:r>
             <w:r>
               <w:rPr>
@@ -931,7 +931,7 @@
               <w14:ligatures w14:val="standardContextual"/>
             </w:rPr>
           </w:pPr>
-          <w:hyperlink w:anchor="_Toc244133855" w:history="1">
+          <w:hyperlink w:anchor="_Toc244135757" w:history="1">
             <w:r>
               <w:rPr>
                 <w:rStyle w:val="Hyperlink"/>
@@ -955,7 +955,7 @@
               <w:rPr>
                 <w:noProof/>
               </w:rPr>
-              <w:instrText xml:space="preserve"> PAGEREF _Toc244133855 \h </w:instrText>
+              <w:instrText xml:space="preserve"> PAGEREF _Toc244135757 \h </w:instrText>
             </w:r>
             <w:r>
               <w:rPr>
@@ -997,7 +997,7 @@
               <w14:ligatures w14:val="standardContextual"/>
             </w:rPr>
           </w:pPr>
-          <w:hyperlink w:anchor="_Toc244133856" w:history="1">
+          <w:hyperlink w:anchor="_Toc244135758" w:history="1">
             <w:r>
               <w:rPr>
                 <w:rStyle w:val="Hyperlink"/>
@@ -1021,7 +1021,7 @@
               <w:rPr>
                 <w:noProof/>
               </w:rPr>
-              <w:instrText xml:space="preserve"> PAGEREF _Toc244133856 \h </w:instrText>
+              <w:instrText xml:space="preserve"> PAGEREF _Toc244135758 \h </w:instrText>
             </w:r>
             <w:r>
               <w:rPr>
@@ -1063,7 +1063,7 @@
               <w14:ligatures w14:val="standardContextual"/>
             </w:rPr>
           </w:pPr>
-          <w:hyperlink w:anchor="_Toc244133857" w:history="1">
+          <w:hyperlink w:anchor="_Toc244135759" w:history="1">
             <w:r>
               <w:rPr>
                 <w:rStyle w:val="Hyperlink"/>
@@ -1087,7 +1087,7 @@
               <w:rPr>
                 <w:noProof/>
               </w:rPr>
-              <w:instrText xml:space="preserve"> PAGEREF _Toc244133857 \h </w:instrText>
+              <w:instrText xml:space="preserve"> PAGEREF _Toc244135759 \h </w:instrText>
             </w:r>
             <w:r>
               <w:rPr>
@@ -1129,7 +1129,7 @@
               <w14:ligatures w14:val="standardContextual"/>
             </w:rPr>
           </w:pPr>
-          <w:hyperlink w:anchor="_Toc244133858" w:history="1">
+          <w:hyperlink w:anchor="_Toc244135760" w:history="1">
             <w:r>
               <w:rPr>
                 <w:rStyle w:val="Hyperlink"/>
@@ -1153,7 +1153,7 @@
               <w:rPr>
                 <w:noProof/>
               </w:rPr>
-              <w:instrText xml:space="preserve"> PAGEREF _Toc244133858 \h </w:instrText>
+              <w:instrText xml:space="preserve"> PAGEREF _Toc244135760 \h </w:instrText>
             </w:r>
             <w:r>
               <w:rPr>
@@ -1195,7 +1195,7 @@
               <w14:ligatures w14:val="standardContextual"/>
             </w:rPr>
           </w:pPr>
-          <w:hyperlink w:anchor="_Toc244133859" w:history="1">
+          <w:hyperlink w:anchor="_Toc244135761" w:history="1">
             <w:r>
               <w:rPr>
                 <w:rStyle w:val="Hyperlink"/>
@@ -1219,7 +1219,7 @@
               <w:rPr>
                 <w:noProof/>
               </w:rPr>
-              <w:instrText xml:space="preserve"> PAGEREF _Toc244133859 \h </w:instrText>
+              <w:instrText xml:space="preserve"> PAGEREF _Toc244135761 \h </w:instrText>
             </w:r>
             <w:r>
               <w:rPr>
@@ -1261,7 +1261,7 @@
               <w14:ligatures w14:val="standardContextual"/>
             </w:rPr>
           </w:pPr>
-          <w:hyperlink w:anchor="_Toc244133860" w:history="1">
+          <w:hyperlink w:anchor="_Toc244135762" w:history="1">
             <w:r>
               <w:rPr>
                 <w:rStyle w:val="Hyperlink"/>
@@ -1285,7 +1285,7 @@
               <w:rPr>
                 <w:noProof/>
               </w:rPr>
-              <w:instrText xml:space="preserve"> PAGEREF _Toc244133860 \h </w:instrText>
+              <w:instrText xml:space="preserve"> PAGEREF _Toc244135762 \h </w:instrText>
             </w:r>
             <w:r>
               <w:rPr>
@@ -1327,7 +1327,7 @@
               <w14:ligatures w14:val="standardContextual"/>
             </w:rPr>
           </w:pPr>
-          <w:hyperlink w:anchor="_Toc244133861" w:history="1">
+          <w:hyperlink w:anchor="_Toc244135763" w:history="1">
             <w:r>
               <w:rPr>
                 <w:rStyle w:val="Hyperlink"/>
@@ -1351,7 +1351,7 @@
               <w:rPr>
                 <w:noProof/>
               </w:rPr>
-              <w:instrText xml:space="preserve"> PAGEREF _Toc244133861 \h </w:instrText>
+              <w:instrText xml:space="preserve"> PAGEREF _Toc244135763 \h </w:instrText>
             </w:r>
             <w:r>
               <w:rPr>
@@ -1393,7 +1393,7 @@
               <w14:ligatures w14:val="standardContextual"/>
             </w:rPr>
           </w:pPr>
-          <w:hyperlink w:anchor="_Toc244133862" w:history="1">
+          <w:hyperlink w:anchor="_Toc244135764" w:history="1">
             <w:r>
               <w:rPr>
                 <w:rStyle w:val="Hyperlink"/>
@@ -1417,7 +1417,7 @@
               <w:rPr>
                 <w:noProof/>
               </w:rPr>
-              <w:instrText xml:space="preserve"> PAGEREF _Toc244133862 \h </w:instrText>
+              <w:instrText xml:space="preserve"> PAGEREF _Toc244135764 \h </w:instrText>
             </w:r>
             <w:r>
               <w:rPr>
@@ -1459,7 +1459,7 @@
               <w14:ligatures w14:val="standardContextual"/>
             </w:rPr>
           </w:pPr>
-          <w:hyperlink w:anchor="_Toc244133863" w:history="1">
+          <w:hyperlink w:anchor="_Toc244135765" w:history="1">
             <w:r>
               <w:rPr>
                 <w:rStyle w:val="Hyperlink"/>
@@ -1483,7 +1483,7 @@
               <w:rPr>
                 <w:noProof/>
               </w:rPr>
-              <w:instrText xml:space="preserve"> PAGEREF _Toc244133863 \h </w:instrText>
+              <w:instrText xml:space="preserve"> PAGEREF _Toc244135765 \h </w:instrText>
             </w:r>
             <w:r>
               <w:rPr>
@@ -1500,7 +1500,7 @@
               <w:rPr>
                 <w:noProof/>
               </w:rPr>
-              <w:t>24</w:t>
+              <w:t>25</w:t>
             </w:r>
             <w:r>
               <w:rPr>
@@ -1526,7 +1526,7 @@
       <w:pPr>
         <w:pStyle w:val="Heading1"/>
       </w:pPr>
-      <w:bookmarkStart w:id="0" w:name="_Toc244133843"/>
+      <w:bookmarkStart w:id="0" w:name="_Toc244135745"/>
       <w:r>
         <w:t>1. Что это и как работает</w:t>
       </w:r>
@@ -2429,7 +2429,7 @@
       <w:pPr>
         <w:pStyle w:val="Heading1"/>
       </w:pPr>
-      <w:bookmarkStart w:id="1" w:name="_Toc244133844"/>
+      <w:bookmarkStart w:id="1" w:name="_Toc244135746"/>
       <w:r>
         <w:t>2. Запуск одной кнопкой</w:t>
       </w:r>
@@ -2665,7 +2665,7 @@
       <w:pPr>
         <w:pStyle w:val="Heading1"/>
       </w:pPr>
-      <w:bookmarkStart w:id="2" w:name="_Toc244133845"/>
+      <w:bookmarkStart w:id="2" w:name="_Toc244135747"/>
       <w:r>
         <w:t>3. Где хранится проект — все файлы</w:t>
       </w:r>
@@ -3747,7 +3747,7 @@
       <w:pPr>
         <w:pStyle w:val="Heading1"/>
       </w:pPr>
-      <w:bookmarkStart w:id="3" w:name="_Toc244133846"/>
+      <w:bookmarkStart w:id="3" w:name="_Toc244135748"/>
       <w:r>
         <w:t>4. Что сделано и что осталось</w:t>
       </w:r>
@@ -3980,6 +3980,32 @@
       </w:pPr>
       <w:r>
         <w:t>Роли: супер-админ, владелец, админ и пользователь; страница Users с поиском по почте и ID, сменой пароля, блокировкой, выходом из Студии и удалением; меню ☰ с Users, My account и Log out.</w:t>
+      </w:r>
+    </w:p>
+    <w:p>
+      <w:pPr>
+        <w:pStyle w:val="ListParagraph"/>
+        <w:numPr>
+          <w:ilvl w:val="0"/>
+          <w:numId w:val="2"/>
+        </w:numPr>
+        <w:spacing w:after="80"/>
+      </w:pPr>
+      <w:r>
+        <w:rPr>
+          <w:b/>
+          <w:bCs/>
+        </w:rPr>
+        <w:t>29.10 — первый публичный ролик</w:t>
+      </w:r>
+      <w:r>
+        <w:t>: Business #1 (Buying A Laundromat) с AI-картинками загружен приватно и опубликован кнопкой «</w:t>
+      </w:r>
+      <w:r>
+        <w:t>🌍</w:t>
+      </w:r>
+      <w:r>
+        <w:t xml:space="preserve"> Publish now» в Telegram — кнопки проверены и работают. Вход в YouTube обновлён (Switch account).</w:t>
       </w:r>
     </w:p>
     <w:p>
@@ -4197,17 +4223,7 @@
           </w:tcPr>
           <w:p>
             <w:r>
-              <w:t xml:space="preserve">Google Branding: вставить ссылки GitHub Pages → Publish app → In production → в Студии один раз </w:t>
-            </w:r>
-            <w:r>
-              <w:rPr>
-                <w:b/>
-                <w:bCs/>
-              </w:rPr>
-              <w:t>Switch account</w:t>
-            </w:r>
-            <w:r>
-              <w:t xml:space="preserve"> (заодно включит кнопки в Telegram)</w:t>
+              <w:t>Google Branding: вставить ссылки GitHub Pages → Publish app → In production (если ещё не сделано), чтобы вход в YouTube не слетал каждые 7 дней</w:t>
             </w:r>
           </w:p>
         </w:tc>
@@ -4223,7 +4239,7 @@
           </w:tcPr>
           <w:p>
             <w:r>
-              <w:t>10.2, 13.4</w:t>
+              <w:t>10.2</w:t>
             </w:r>
           </w:p>
         </w:tc>
@@ -4273,13 +4289,13 @@
           </w:tcPr>
           <w:p>
             <w:r>
-              <w:t>Первая неделя: проверять приватные ролики и публиковать кнопкой «</w:t>
+              <w:t>Первая неделя: в 9:00 Студия делает следующий ролик (завтра Business #2 — Ice vending machine) и загружает приватно. Проверить и нажать «</w:t>
             </w:r>
             <w:r>
               <w:t>🌍</w:t>
             </w:r>
             <w:r>
-              <w:t xml:space="preserve"> Publish now» в Telegram или вручную</w:t>
+              <w:t xml:space="preserve"> Publish now» в Telegram</w:t>
             </w:r>
           </w:p>
         </w:tc>
@@ -4606,7 +4622,7 @@
       <w:pPr>
         <w:pStyle w:val="Heading1"/>
       </w:pPr>
-      <w:bookmarkStart w:id="4" w:name="_Toc244133847"/>
+      <w:bookmarkStart w:id="4" w:name="_Toc244135749"/>
       <w:r>
         <w:t>5. Ниша: что выбрано и почему</w:t>
       </w:r>
@@ -4808,7 +4824,7 @@
       <w:pPr>
         <w:pStyle w:val="Heading1"/>
       </w:pPr>
-      <w:bookmarkStart w:id="5" w:name="_Toc244133848"/>
+      <w:bookmarkStart w:id="5" w:name="_Toc244135750"/>
       <w:r>
         <w:t>6. Как строится сценарий</w:t>
       </w:r>
@@ -5758,7 +5774,7 @@
       <w:pPr>
         <w:pStyle w:val="Heading1"/>
       </w:pPr>
-      <w:bookmarkStart w:id="6" w:name="_Toc244133849"/>
+      <w:bookmarkStart w:id="6" w:name="_Toc244135751"/>
       <w:r>
         <w:t>7. Картинки: бесплатно</w:t>
       </w:r>
@@ -5905,17 +5921,17 @@
           </w:tcPr>
           <w:p>
             <w:r>
-              <w:t xml:space="preserve">Автоматически. Бесплатно 10 000 «нейронов» за </w:t>
+              <w:t xml:space="preserve">Автоматически. Бесплатно 10 000 «нейронов» в сутки на все каналы вместе. Одна картинка стоит около 200 нейронов (при 5 шагах качества), то есть ≈ 50 картинок ≈ 8 роликов в день. Лимит обнуляется в </w:t>
             </w:r>
             <w:r>
               <w:rPr>
                 <w:b/>
                 <w:bCs/>
               </w:rPr>
-              <w:t>скользящие 24 часа</w:t>
-            </w:r>
-            <w:r>
-              <w:t xml:space="preserve"> ≈ 130 картинок (≈ 20 роликов) на все каналы вместе. Лимит не обнуляется в полночь: картинки снова рисуются, когда самые старые из последних 24 часов выходят из окна. Лицензия Apache 2.0. Ключи </w:t>
+              <w:t>00:00 UTC</w:t>
+            </w:r>
+            <w:r>
+              <w:t xml:space="preserve"> (02:00 по Киеву зимой, 03:00 летом). Лицензия Apache 2.0. Ключи </w:t>
             </w:r>
             <w:r>
               <w:rPr>
@@ -6158,17 +6174,17 @@
         <w:t xml:space="preserve"> </w:t>
       </w:r>
       <w:r>
-        <w:t xml:space="preserve">Если в Telegram пришло «⚠ FLUX pictures stopped working», значит, лимит за последние 24 часа кончился (обычно из-за большого числа тестовых роликов). Это не поломка: ролик всё равно делается — с фото или карточками с цифрами. Лимит считается за </w:t>
-      </w:r>
-      <w:r>
-        <w:rPr>
-          <w:b/>
-          <w:bCs/>
-        </w:rPr>
-        <w:t>скользящие 24 часа</w:t>
-      </w:r>
-      <w:r>
-        <w:t>, а не по календарным суткам: панель Cloudflare может показывать «0/10k today», а картинки всё ещё не рисуются. Они вернутся сами, когда из окна выйдут вчерашние картинки. У готового ролика картинки можно заменить вручную (ниже).</w:t>
+        <w:t xml:space="preserve">Если в Telegram пришло «⚠ FLUX pictures stopped working», значит, дневной лимит кончился (обычно из-за большого числа тестовых роликов). Это не поломка: ролик всё равно делается — с фото или карточками с цифрами. Лимит обнуляется в </w:t>
+      </w:r>
+      <w:r>
+        <w:rPr>
+          <w:b/>
+          <w:bCs/>
+        </w:rPr>
+        <w:t>00:00 UTC</w:t>
+      </w:r>
+      <w:r>
+        <w:t>, но на деле Cloudflare может отказывать ещё примерно час после полуночи, хотя панель уже показывает «0/10k today». У готового ролика картинки можно заменить вручную (ниже).</w:t>
       </w:r>
     </w:p>
     <w:p>
@@ -6216,7 +6232,7 @@
         <w:t>Меньше шагов FLUX</w:t>
       </w:r>
       <w:r>
-        <w:t>: Settings → Picture → FLUX quality steps с 6 до 4. Картинка дешевле примерно на четверть — около 170 картинок за 24 часа, детализация чуть ниже.</w:t>
+        <w:t>: Settings → Picture → FLUX quality steps. Сейчас стоит 5 (было 6): картинка стоит около 200 нейронов вместо 220. При 4 шагах — ещё примерно на 15–20% дешевле, детализация чуть ниже.</w:t>
       </w:r>
     </w:p>
     <w:p>
@@ -6477,7 +6493,7 @@
       <w:pPr>
         <w:pStyle w:val="Heading1"/>
       </w:pPr>
-      <w:bookmarkStart w:id="7" w:name="_Toc244133850"/>
+      <w:bookmarkStart w:id="7" w:name="_Toc244135752"/>
       <w:r>
         <w:t>8. Создать ролик вручную и версии для A/B-теста</w:t>
       </w:r>
@@ -6853,7 +6869,7 @@
       <w:pPr>
         <w:pStyle w:val="Heading1"/>
       </w:pPr>
-      <w:bookmarkStart w:id="8" w:name="_Toc244133851"/>
+      <w:bookmarkStart w:id="8" w:name="_Toc244135753"/>
       <w:r>
         <w:t>9. Настройки в Студии (Settings)</w:t>
       </w:r>
@@ -7160,7 +7176,7 @@
           </w:tcPr>
           <w:p>
             <w:r>
-              <w:t>Крупная цифра вкл/выкл и её цвет, цвет плашки серии, затемнение, сила движения камеры, источник картинок, стиль AI-картинок, проверка промптов, качество FLUX</w:t>
+              <w:t>Крупная цифра вкл/выкл и её цвет, цвет плашки серии, затемнение, сила движения камеры, источник картинок, стиль AI-картинок, проверка промптов, качество FLUX (FLUX quality steps, по умолчанию 5: меньше — дешевле, но чуть меньше деталей)</w:t>
             </w:r>
           </w:p>
         </w:tc>
@@ -7419,7 +7435,7 @@
       <w:pPr>
         <w:pStyle w:val="Heading1"/>
       </w:pPr>
-      <w:bookmarkStart w:id="9" w:name="_Toc244133852"/>
+      <w:bookmarkStart w:id="9" w:name="_Toc244135754"/>
       <w:r>
         <w:t>10. Соцсети: вход, выход, смена аккаунта</w:t>
       </w:r>
@@ -7676,7 +7692,10 @@
         <w:t>✅</w:t>
       </w:r>
       <w:r>
-        <w:t xml:space="preserve"> Уже подключено: канал </w:t>
+        <w:t xml:space="preserve"> </w:t>
+      </w:r>
+      <w:r>
+        <w:t xml:space="preserve">Уже подключено: канал </w:t>
       </w:r>
       <w:r>
         <w:rPr>
@@ -8801,7 +8820,7 @@
       <w:pPr>
         <w:pStyle w:val="Heading1"/>
       </w:pPr>
-      <w:bookmarkStart w:id="10" w:name="_Toc244133853"/>
+      <w:bookmarkStart w:id="10" w:name="_Toc244135755"/>
       <w:r>
         <w:t>11. Публикация и n8n</w:t>
       </w:r>
@@ -9472,7 +9491,7 @@
       <w:pPr>
         <w:pStyle w:val="Heading1"/>
       </w:pPr>
-      <w:bookmarkStart w:id="11" w:name="_Toc244133854"/>
+      <w:bookmarkStart w:id="11" w:name="_Toc244135756"/>
       <w:r>
         <w:t>12. Заработок и монетизация (Earnings)</w:t>
       </w:r>
@@ -10097,7 +10116,7 @@
       <w:pPr>
         <w:pStyle w:val="Heading1"/>
       </w:pPr>
-      <w:bookmarkStart w:id="12" w:name="_Toc244133855"/>
+      <w:bookmarkStart w:id="12" w:name="_Toc244135757"/>
       <w:r>
         <w:t>13. Очередь тем, проверка фактов, обложки, Telegram, итоги A/B</w:t>
       </w:r>
@@ -11611,7 +11630,7 @@
               <w:t>⚠</w:t>
             </w:r>
             <w:r>
-              <w:t xml:space="preserve"> кончился бесплатный лимит картинок за последние 24 часа (не чаще раза в день)</w:t>
+              <w:t xml:space="preserve"> кончился бесплатный дневной лимит картинок (не чаще раза в день)</w:t>
             </w:r>
           </w:p>
         </w:tc>
@@ -12277,7 +12296,7 @@
       <w:pPr>
         <w:pStyle w:val="Heading1"/>
       </w:pPr>
-      <w:bookmarkStart w:id="13" w:name="_Toc244133856"/>
+      <w:bookmarkStart w:id="13" w:name="_Toc244135758"/>
       <w:r>
         <w:t>14. Включить автопилот и настроить Windows</w:t>
       </w:r>
@@ -12745,7 +12764,7 @@
       <w:pPr>
         <w:pStyle w:val="Heading1"/>
       </w:pPr>
-      <w:bookmarkStart w:id="14" w:name="_Toc244133857"/>
+      <w:bookmarkStart w:id="14" w:name="_Toc244135759"/>
       <w:r>
         <w:t>15. Музыка и звуки</w:t>
       </w:r>
@@ -12893,7 +12912,7 @@
       <w:pPr>
         <w:pStyle w:val="Heading1"/>
       </w:pPr>
-      <w:bookmarkStart w:id="15" w:name="_Toc244133858"/>
+      <w:bookmarkStart w:id="15" w:name="_Toc244135760"/>
       <w:r>
         <w:t>16. Озвучка</w:t>
       </w:r>
@@ -12991,7 +13010,7 @@
       <w:pPr>
         <w:pStyle w:val="Heading1"/>
       </w:pPr>
-      <w:bookmarkStart w:id="16" w:name="_Toc244133859"/>
+      <w:bookmarkStart w:id="16" w:name="_Toc244135761"/>
       <w:r>
         <w:t>17. Ключ Gemini и платные возможности</w:t>
       </w:r>
@@ -13134,7 +13153,7 @@
       <w:pPr>
         <w:pStyle w:val="Heading1"/>
       </w:pPr>
-      <w:bookmarkStart w:id="17" w:name="_Toc244133860"/>
+      <w:bookmarkStart w:id="17" w:name="_Toc244135762"/>
       <w:r>
         <w:t>18. Что осталось в .env</w:t>
       </w:r>
@@ -13696,7 +13715,7 @@
       <w:pPr>
         <w:pStyle w:val="Heading1"/>
       </w:pPr>
-      <w:bookmarkStart w:id="18" w:name="_Toc244133861"/>
+      <w:bookmarkStart w:id="18" w:name="_Toc244135763"/>
       <w:r>
         <w:t>19. Советы: что улучшить дальше</w:t>
       </w:r>
@@ -13868,7 +13887,7 @@
       <w:pPr>
         <w:pStyle w:val="Heading1"/>
       </w:pPr>
-      <w:bookmarkStart w:id="19" w:name="_Toc244133862"/>
+      <w:bookmarkStart w:id="19" w:name="_Toc244135764"/>
       <w:r>
         <w:t>20. Если что-то не работает</w:t>
       </w:r>
@@ -14105,7 +14124,7 @@
           </w:tcPr>
           <w:p>
             <w:r>
-              <w:t xml:space="preserve">Кончился лимит Cloudflare за последние 24 часа (≈130 картинок; освобождается постепенно, а не в полночь) или неверный токен — проверьте </w:t>
+              <w:t xml:space="preserve">Кончился дневной лимит Cloudflare (≈ 50 картинок ≈ 8 роликов на все каналы; обнуляется в 00:00 UTC) или неверный токен — проверьте </w:t>
             </w:r>
             <w:r>
               <w:rPr>
@@ -14148,7 +14167,7 @@
           </w:tcPr>
           <w:p>
             <w:r>
-              <w:t>Лимит считается за скользящие 24 часа, а не по календарным суткам. Подождите несколько часов — картинки вернутся сами; до этого ролики делаются с фото или карточками</w:t>
+              <w:t>Лимит уже обнулился в 00:00 UTC, но Cloudflare применяет это с задержкой — обычно до часа. Подождите: картинки вернутся сами; до этого ролики делаются с фото или карточками</w:t>
             </w:r>
           </w:p>
         </w:tc>
@@ -15061,7 +15080,7 @@
       <w:pPr>
         <w:pStyle w:val="Heading1"/>
       </w:pPr>
-      <w:bookmarkStart w:id="20" w:name="_Toc244133863"/>
+      <w:bookmarkStart w:id="20" w:name="_Toc244135765"/>
       <w:r>
         <w:t>21. Аккаунты Студии и каналы</w:t>
       </w:r>
@@ -15859,7 +15878,7 @@
               <w:t>лимит FLUX</w:t>
             </w:r>
             <w:r>
-              <w:t xml:space="preserve"> — около 130 картинок за скользящие 24 часа на все каналы вместе, это примерно 20 роликов</w:t>
+              <w:t xml:space="preserve"> — около 50 картинок в сутки на все каналы вместе, это примерно 8 роликов</w:t>
             </w:r>
           </w:p>
         </w:tc>
@@ -17802,10 +17821,10 @@
 <file path=word/numbering.xml><?xml version="1.0" encoding="utf-8"?>
 <w:numbering xmlns:wpc="http://schemas.microsoft.com/office/word/2010/wordprocessingCanvas" xmlns:cx="http://schemas.microsoft.com/office/drawing/2014/chartex" xmlns:cx1="http://schemas.microsoft.com/office/drawing/2015/9/8/chartex" xmlns:cx2="http://schemas.microsoft.com/office/drawing/2015/10/21/chartex" xmlns:cx3="http://schemas.microsoft.com/office/drawing/2016/5/9/chartex" xmlns:cx4="http://schemas.microsoft.com/office/drawing/2016/5/10/chartex" xmlns:cx5="http://schemas.microsoft.com/office/drawing/2016/5/11/chartex" xmlns:cx6="http://schemas.microsoft.com/office/drawing/2016/5/12/chartex" xmlns:cx7="http://schemas.microsoft.com/office/drawing/2016/5/13/chartex" xmlns:cx8="http://schemas.microsoft.com/office/drawing/2016/5/14/chartex" xmlns:mc="http://schemas.openxmlformats.org/markup-compatibility/2006" xmlns:aink="http://schemas.microsoft.com/office/drawing/2016/ink" xmlns:am3d="http://schemas.microsoft.com/office/drawing/2017/model3d" xmlns:o="urn:schemas-microsoft-com:office:office" xmlns:oel="http://schemas.microsoft.com/office/2019/extlst" xmlns:r="http://schemas.openxmlformats.org/officeDocument/2006/relationships" xmlns:m="http://schemas.openxmlformats.org/officeDocument/2006/math" xmlns:v="urn:schemas-microsoft-com:vml" xmlns:wp14="http://schemas.microsoft.com/office/word/2010/wordprocessingDrawing" xmlns:wp="http://schemas.openxmlformats.org/drawingml/2006/wordprocessingDrawing" xmlns:w10="urn:schemas-microsoft-com:office:word" xmlns:w="http://schemas.openxmlformats.org/wordprocessingml/2006/main" xmlns:w14="http://schemas.microsoft.com/office/word/2010/wordml" xmlns:w15="http://schemas.microsoft.com/office/word/2012/wordml" xmlns:w16cex="http://schemas.microsoft.com/office/word/2018/wordml/cex" xmlns:w16cid="http://schemas.microsoft.com/office/word/2016/wordml/cid" xmlns:w16="http://schemas.microsoft.com/office/word/2018/wordml" xmlns:w16du="http://schemas.microsoft.com/office/word/2023/wordml/word16du" xmlns:w16sdtdh="http://schemas.microsoft.com/office/word/2020/wordml/sdtdatahash" xmlns:w16sdtfl="http://schemas.microsoft.com/office/word/2024/wordml/sdtformatlock" xmlns:w16se="http://schemas.microsoft.com/office/word/2015/wordml/symex" xmlns:wpg="http://schemas.microsoft.com/office/word/2010/wordprocessingGroup" xmlns:wpi="http://schemas.microsoft.com/office/word/2010/wordprocessingInk" xmlns:wne="http://schemas.microsoft.com/office/word/2006/wordml" xmlns:wps="http://schemas.microsoft.com/office/word/2010/wordprocessingShape" mc:Ignorable="w14 w15 w16se w16cid w16 w16cex w16sdtdh w16sdtfl w16du wp14">
   <w:abstractNum w:abstractNumId="0" w15:restartNumberingAfterBreak="0">
-    <w:nsid w:val="06B02E84"/>
+    <w:nsid w:val="02A23D37"/>
     <w:multiLevelType w:val="hybridMultilevel"/>
-    <w:tmpl w:val="75B64E42"/>
-    <w:lvl w:ilvl="0" w:tplc="CB527D18">
+    <w:tmpl w:val="4B4ABE20"/>
+    <w:lvl w:ilvl="0" w:tplc="5EE4BDB4">
       <w:start w:val="1"/>
       <w:numFmt w:val="decimal"/>
       <w:lvlText w:val="%1."/>
@@ -17814,52 +17833,52 @@
         <w:ind w:left="440" w:hanging="360"/>
       </w:pPr>
     </w:lvl>
-    <w:lvl w:ilvl="1" w:tplc="7FDE06A6">
+    <w:lvl w:ilvl="1" w:tplc="5162AE00">
       <w:numFmt w:val="decimal"/>
       <w:lvlText w:val=""/>
       <w:lvlJc w:val="left"/>
     </w:lvl>
-    <w:lvl w:ilvl="2" w:tplc="6AB41628">
+    <w:lvl w:ilvl="2" w:tplc="D6285234">
       <w:numFmt w:val="decimal"/>
       <w:lvlText w:val=""/>
       <w:lvlJc w:val="left"/>
     </w:lvl>
-    <w:lvl w:ilvl="3" w:tplc="64100DEC">
+    <w:lvl w:ilvl="3" w:tplc="00D065A0">
       <w:numFmt w:val="decimal"/>
       <w:lvlText w:val=""/>
       <w:lvlJc w:val="left"/>
     </w:lvl>
-    <w:lvl w:ilvl="4" w:tplc="51DAA0EA">
+    <w:lvl w:ilvl="4" w:tplc="4C026C02">
       <w:numFmt w:val="decimal"/>
       <w:lvlText w:val=""/>
       <w:lvlJc w:val="left"/>
     </w:lvl>
-    <w:lvl w:ilvl="5" w:tplc="AD52CC90">
+    <w:lvl w:ilvl="5" w:tplc="0DC21CC6">
       <w:numFmt w:val="decimal"/>
       <w:lvlText w:val=""/>
       <w:lvlJc w:val="left"/>
     </w:lvl>
-    <w:lvl w:ilvl="6" w:tplc="58C85322">
+    <w:lvl w:ilvl="6" w:tplc="5C4EA202">
       <w:numFmt w:val="decimal"/>
       <w:lvlText w:val=""/>
       <w:lvlJc w:val="left"/>
     </w:lvl>
-    <w:lvl w:ilvl="7" w:tplc="9D462AE6">
+    <w:lvl w:ilvl="7" w:tplc="D5B4173C">
       <w:numFmt w:val="decimal"/>
       <w:lvlText w:val=""/>
       <w:lvlJc w:val="left"/>
     </w:lvl>
-    <w:lvl w:ilvl="8" w:tplc="017404B6">
+    <w:lvl w:ilvl="8" w:tplc="A0B6DD1C">
       <w:numFmt w:val="decimal"/>
       <w:lvlText w:val=""/>
       <w:lvlJc w:val="left"/>
     </w:lvl>
   </w:abstractNum>
   <w:abstractNum w:abstractNumId="1" w15:restartNumberingAfterBreak="0">
-    <w:nsid w:val="08500A70"/>
+    <w:nsid w:val="09EC66E0"/>
     <w:multiLevelType w:val="hybridMultilevel"/>
-    <w:tmpl w:val="570A75BC"/>
-    <w:lvl w:ilvl="0" w:tplc="52ECA40C">
+    <w:tmpl w:val="D354F94E"/>
+    <w:lvl w:ilvl="0" w:tplc="E326B19C">
       <w:start w:val="1"/>
       <w:numFmt w:val="decimal"/>
       <w:lvlText w:val="%1."/>
@@ -17868,106 +17887,106 @@
         <w:ind w:left="440" w:hanging="360"/>
       </w:pPr>
     </w:lvl>
-    <w:lvl w:ilvl="1" w:tplc="CC2C7112">
+    <w:lvl w:ilvl="1" w:tplc="25F696B4">
       <w:numFmt w:val="decimal"/>
       <w:lvlText w:val=""/>
       <w:lvlJc w:val="left"/>
     </w:lvl>
-    <w:lvl w:ilvl="2" w:tplc="5DDA0240">
+    <w:lvl w:ilvl="2" w:tplc="25F488AA">
       <w:numFmt w:val="decimal"/>
       <w:lvlText w:val=""/>
       <w:lvlJc w:val="left"/>
     </w:lvl>
-    <w:lvl w:ilvl="3" w:tplc="A0E04058">
+    <w:lvl w:ilvl="3" w:tplc="84D8BC7A">
       <w:numFmt w:val="decimal"/>
       <w:lvlText w:val=""/>
       <w:lvlJc w:val="left"/>
     </w:lvl>
-    <w:lvl w:ilvl="4" w:tplc="BC1621C2">
+    <w:lvl w:ilvl="4" w:tplc="2EF4C6A6">
       <w:numFmt w:val="decimal"/>
       <w:lvlText w:val=""/>
       <w:lvlJc w:val="left"/>
     </w:lvl>
-    <w:lvl w:ilvl="5" w:tplc="925C78E4">
+    <w:lvl w:ilvl="5" w:tplc="5838C720">
       <w:numFmt w:val="decimal"/>
       <w:lvlText w:val=""/>
       <w:lvlJc w:val="left"/>
     </w:lvl>
-    <w:lvl w:ilvl="6" w:tplc="3E04A1EA">
+    <w:lvl w:ilvl="6" w:tplc="959AC806">
       <w:numFmt w:val="decimal"/>
       <w:lvlText w:val=""/>
       <w:lvlJc w:val="left"/>
     </w:lvl>
-    <w:lvl w:ilvl="7" w:tplc="3A844F0A">
+    <w:lvl w:ilvl="7" w:tplc="1F569F06">
       <w:numFmt w:val="decimal"/>
       <w:lvlText w:val=""/>
       <w:lvlJc w:val="left"/>
     </w:lvl>
-    <w:lvl w:ilvl="8" w:tplc="86563852">
+    <w:lvl w:ilvl="8" w:tplc="368AA14A">
       <w:numFmt w:val="decimal"/>
       <w:lvlText w:val=""/>
       <w:lvlJc w:val="left"/>
     </w:lvl>
   </w:abstractNum>
   <w:abstractNum w:abstractNumId="2" w15:restartNumberingAfterBreak="0">
-    <w:nsid w:val="0FCA693F"/>
+    <w:nsid w:val="13083C91"/>
     <w:multiLevelType w:val="hybridMultilevel"/>
-    <w:tmpl w:val="B6FC76CE"/>
-    <w:lvl w:ilvl="0" w:tplc="214CA5D2">
+    <w:tmpl w:val="9A2290EE"/>
+    <w:lvl w:ilvl="0" w:tplc="613C90BE">
       <w:start w:val="1"/>
-      <w:numFmt w:val="bullet"/>
-      <w:lvlText w:val="•"/>
+      <w:numFmt w:val="decimal"/>
+      <w:lvlText w:val="%1."/>
       <w:lvlJc w:val="left"/>
       <w:pPr>
-        <w:ind w:left="440" w:hanging="280"/>
+        <w:ind w:left="440" w:hanging="360"/>
       </w:pPr>
     </w:lvl>
-    <w:lvl w:ilvl="1" w:tplc="F3221458">
+    <w:lvl w:ilvl="1" w:tplc="6E06659C">
       <w:numFmt w:val="decimal"/>
       <w:lvlText w:val=""/>
       <w:lvlJc w:val="left"/>
     </w:lvl>
-    <w:lvl w:ilvl="2" w:tplc="CBCA8654">
+    <w:lvl w:ilvl="2" w:tplc="6CF6AA64">
       <w:numFmt w:val="decimal"/>
       <w:lvlText w:val=""/>
       <w:lvlJc w:val="left"/>
     </w:lvl>
-    <w:lvl w:ilvl="3" w:tplc="B4FCBAA4">
+    <w:lvl w:ilvl="3" w:tplc="341699AC">
       <w:numFmt w:val="decimal"/>
       <w:lvlText w:val=""/>
       <w:lvlJc w:val="left"/>
     </w:lvl>
-    <w:lvl w:ilvl="4" w:tplc="D72E7DB8">
+    <w:lvl w:ilvl="4" w:tplc="CE648316">
       <w:numFmt w:val="decimal"/>
       <w:lvlText w:val=""/>
       <w:lvlJc w:val="left"/>
     </w:lvl>
-    <w:lvl w:ilvl="5" w:tplc="8EDE50EE">
+    <w:lvl w:ilvl="5" w:tplc="60982A42">
       <w:numFmt w:val="decimal"/>
       <w:lvlText w:val=""/>
       <w:lvlJc w:val="left"/>
     </w:lvl>
-    <w:lvl w:ilvl="6" w:tplc="24CAB6B6">
+    <w:lvl w:ilvl="6" w:tplc="9B34C072">
       <w:numFmt w:val="decimal"/>
       <w:lvlText w:val=""/>
       <w:lvlJc w:val="left"/>
     </w:lvl>
-    <w:lvl w:ilvl="7" w:tplc="1CC4DA82">
+    <w:lvl w:ilvl="7" w:tplc="5B60CBA0">
       <w:numFmt w:val="decimal"/>
       <w:lvlText w:val=""/>
       <w:lvlJc w:val="left"/>
     </w:lvl>
-    <w:lvl w:ilvl="8" w:tplc="62FCF7C6">
+    <w:lvl w:ilvl="8" w:tplc="5D725142">
       <w:numFmt w:val="decimal"/>
       <w:lvlText w:val=""/>
       <w:lvlJc w:val="left"/>
     </w:lvl>
   </w:abstractNum>
   <w:abstractNum w:abstractNumId="3" w15:restartNumberingAfterBreak="0">
-    <w:nsid w:val="270D683F"/>
+    <w:nsid w:val="21474A66"/>
     <w:multiLevelType w:val="hybridMultilevel"/>
-    <w:tmpl w:val="00365F54"/>
-    <w:lvl w:ilvl="0" w:tplc="A6E2DF58">
+    <w:tmpl w:val="E66E8EAC"/>
+    <w:lvl w:ilvl="0" w:tplc="ECC29404">
       <w:start w:val="1"/>
       <w:numFmt w:val="decimal"/>
       <w:lvlText w:val="%1."/>
@@ -17976,52 +17995,52 @@
         <w:ind w:left="440" w:hanging="360"/>
       </w:pPr>
     </w:lvl>
-    <w:lvl w:ilvl="1" w:tplc="B4BAC9AC">
+    <w:lvl w:ilvl="1" w:tplc="C91CE108">
       <w:numFmt w:val="decimal"/>
       <w:lvlText w:val=""/>
       <w:lvlJc w:val="left"/>
     </w:lvl>
-    <w:lvl w:ilvl="2" w:tplc="7690D1C8">
+    <w:lvl w:ilvl="2" w:tplc="B0ECF9FE">
       <w:numFmt w:val="decimal"/>
       <w:lvlText w:val=""/>
       <w:lvlJc w:val="left"/>
     </w:lvl>
-    <w:lvl w:ilvl="3" w:tplc="A06CD0C4">
+    <w:lvl w:ilvl="3" w:tplc="1DC2E0A6">
       <w:numFmt w:val="decimal"/>
       <w:lvlText w:val=""/>
       <w:lvlJc w:val="left"/>
     </w:lvl>
-    <w:lvl w:ilvl="4" w:tplc="6B760154">
+    <w:lvl w:ilvl="4" w:tplc="D1AC6576">
       <w:numFmt w:val="decimal"/>
       <w:lvlText w:val=""/>
       <w:lvlJc w:val="left"/>
     </w:lvl>
-    <w:lvl w:ilvl="5" w:tplc="5CFC8B3E">
+    <w:lvl w:ilvl="5" w:tplc="D90C5B92">
       <w:numFmt w:val="decimal"/>
       <w:lvlText w:val=""/>
       <w:lvlJc w:val="left"/>
     </w:lvl>
-    <w:lvl w:ilvl="6" w:tplc="4A425B28">
+    <w:lvl w:ilvl="6" w:tplc="68E48B2E">
       <w:numFmt w:val="decimal"/>
       <w:lvlText w:val=""/>
       <w:lvlJc w:val="left"/>
     </w:lvl>
-    <w:lvl w:ilvl="7" w:tplc="7B7CCFF0">
+    <w:lvl w:ilvl="7" w:tplc="D33E7A62">
       <w:numFmt w:val="decimal"/>
       <w:lvlText w:val=""/>
       <w:lvlJc w:val="left"/>
     </w:lvl>
-    <w:lvl w:ilvl="8" w:tplc="E9CA7F9E">
+    <w:lvl w:ilvl="8" w:tplc="81506596">
       <w:numFmt w:val="decimal"/>
       <w:lvlText w:val=""/>
       <w:lvlJc w:val="left"/>
     </w:lvl>
   </w:abstractNum>
   <w:abstractNum w:abstractNumId="4" w15:restartNumberingAfterBreak="0">
-    <w:nsid w:val="299F6382"/>
+    <w:nsid w:val="2B2F5FE6"/>
     <w:multiLevelType w:val="hybridMultilevel"/>
-    <w:tmpl w:val="6F28B0B6"/>
-    <w:lvl w:ilvl="0" w:tplc="B024F89C">
+    <w:tmpl w:val="730022C2"/>
+    <w:lvl w:ilvl="0" w:tplc="D9CAB600">
       <w:start w:val="1"/>
       <w:numFmt w:val="decimal"/>
       <w:lvlText w:val="%1."/>
@@ -18030,52 +18049,52 @@
         <w:ind w:left="440" w:hanging="360"/>
       </w:pPr>
     </w:lvl>
-    <w:lvl w:ilvl="1" w:tplc="030052FC">
+    <w:lvl w:ilvl="1" w:tplc="CE7AB664">
       <w:numFmt w:val="decimal"/>
       <w:lvlText w:val=""/>
       <w:lvlJc w:val="left"/>
     </w:lvl>
-    <w:lvl w:ilvl="2" w:tplc="124E7D66">
+    <w:lvl w:ilvl="2" w:tplc="96E09F5E">
       <w:numFmt w:val="decimal"/>
       <w:lvlText w:val=""/>
       <w:lvlJc w:val="left"/>
     </w:lvl>
-    <w:lvl w:ilvl="3" w:tplc="1B9486AA">
+    <w:lvl w:ilvl="3" w:tplc="85765E5C">
       <w:numFmt w:val="decimal"/>
       <w:lvlText w:val=""/>
       <w:lvlJc w:val="left"/>
     </w:lvl>
-    <w:lvl w:ilvl="4" w:tplc="90CA3078">
+    <w:lvl w:ilvl="4" w:tplc="58DA0E08">
       <w:numFmt w:val="decimal"/>
       <w:lvlText w:val=""/>
       <w:lvlJc w:val="left"/>
     </w:lvl>
-    <w:lvl w:ilvl="5" w:tplc="CE02A780">
+    <w:lvl w:ilvl="5" w:tplc="9CB8B63A">
       <w:numFmt w:val="decimal"/>
       <w:lvlText w:val=""/>
       <w:lvlJc w:val="left"/>
     </w:lvl>
-    <w:lvl w:ilvl="6" w:tplc="48F435B0">
+    <w:lvl w:ilvl="6" w:tplc="865C1A10">
       <w:numFmt w:val="decimal"/>
       <w:lvlText w:val=""/>
       <w:lvlJc w:val="left"/>
     </w:lvl>
-    <w:lvl w:ilvl="7" w:tplc="22A09F3E">
+    <w:lvl w:ilvl="7" w:tplc="29BC761E">
       <w:numFmt w:val="decimal"/>
       <w:lvlText w:val=""/>
       <w:lvlJc w:val="left"/>
     </w:lvl>
-    <w:lvl w:ilvl="8" w:tplc="ADE6E064">
+    <w:lvl w:ilvl="8" w:tplc="F626BD3A">
       <w:numFmt w:val="decimal"/>
       <w:lvlText w:val=""/>
       <w:lvlJc w:val="left"/>
     </w:lvl>
   </w:abstractNum>
   <w:abstractNum w:abstractNumId="5" w15:restartNumberingAfterBreak="0">
-    <w:nsid w:val="42F1677F"/>
+    <w:nsid w:val="3FD7668A"/>
     <w:multiLevelType w:val="hybridMultilevel"/>
-    <w:tmpl w:val="7FFECCAA"/>
-    <w:lvl w:ilvl="0" w:tplc="15BC3560">
+    <w:tmpl w:val="35E875C0"/>
+    <w:lvl w:ilvl="0" w:tplc="A3C07BDE">
       <w:start w:val="1"/>
       <w:numFmt w:val="decimal"/>
       <w:lvlText w:val="%1."/>
@@ -18084,52 +18103,138 @@
         <w:ind w:left="440" w:hanging="360"/>
       </w:pPr>
     </w:lvl>
-    <w:lvl w:ilvl="1" w:tplc="24EA9D16">
+    <w:lvl w:ilvl="1" w:tplc="4F500BCE">
       <w:numFmt w:val="decimal"/>
       <w:lvlText w:val=""/>
       <w:lvlJc w:val="left"/>
     </w:lvl>
-    <w:lvl w:ilvl="2" w:tplc="BB8A3C26">
+    <w:lvl w:ilvl="2" w:tplc="21CACB64">
       <w:numFmt w:val="decimal"/>
       <w:lvlText w:val=""/>
       <w:lvlJc w:val="left"/>
     </w:lvl>
-    <w:lvl w:ilvl="3" w:tplc="CF3245D8">
+    <w:lvl w:ilvl="3" w:tplc="55C833AA">
       <w:numFmt w:val="decimal"/>
       <w:lvlText w:val=""/>
       <w:lvlJc w:val="left"/>
     </w:lvl>
-    <w:lvl w:ilvl="4" w:tplc="BF280BB2">
+    <w:lvl w:ilvl="4" w:tplc="7B8ABB00">
       <w:numFmt w:val="decimal"/>
       <w:lvlText w:val=""/>
       <w:lvlJc w:val="left"/>
     </w:lvl>
-    <w:lvl w:ilvl="5" w:tplc="244CEF46">
+    <w:lvl w:ilvl="5" w:tplc="5E22B8A0">
       <w:numFmt w:val="decimal"/>
       <w:lvlText w:val=""/>
       <w:lvlJc w:val="left"/>
     </w:lvl>
-    <w:lvl w:ilvl="6" w:tplc="1186B5CC">
+    <w:lvl w:ilvl="6" w:tplc="6CFC7D76">
       <w:numFmt w:val="decimal"/>
       <w:lvlText w:val=""/>
       <w:lvlJc w:val="left"/>
     </w:lvl>
-    <w:lvl w:ilvl="7" w:tplc="D8A25E76">
+    <w:lvl w:ilvl="7" w:tplc="7AE87C8E">
       <w:numFmt w:val="decimal"/>
       <w:lvlText w:val=""/>
       <w:lvlJc w:val="left"/>
     </w:lvl>
-    <w:lvl w:ilvl="8" w:tplc="4FB41C0A">
+    <w:lvl w:ilvl="8" w:tplc="DE62F2EA">
       <w:numFmt w:val="decimal"/>
       <w:lvlText w:val=""/>
       <w:lvlJc w:val="left"/>
     </w:lvl>
   </w:abstractNum>
   <w:abstractNum w:abstractNumId="6" w15:restartNumberingAfterBreak="0">
-    <w:nsid w:val="5A971EDA"/>
+    <w:nsid w:val="41A110B5"/>
     <w:multiLevelType w:val="hybridMultilevel"/>
-    <w:tmpl w:val="73EA3FF2"/>
-    <w:lvl w:ilvl="0" w:tplc="9668AF58">
+    <w:tmpl w:val="1F740B76"/>
+    <w:lvl w:ilvl="0" w:tplc="05FE513E" w:tentative="1">
+      <w:start w:val="1"/>
+      <w:numFmt w:val="bullet"/>
+      <w:lvlText w:val="●"/>
+      <w:lvlJc w:val="left"/>
+      <w:pPr>
+        <w:ind w:left="720" w:hanging="360"/>
+      </w:pPr>
+    </w:lvl>
+    <w:lvl w:ilvl="1" w:tplc="38883ABA" w:tentative="1">
+      <w:start w:val="1"/>
+      <w:numFmt w:val="bullet"/>
+      <w:lvlText w:val="○"/>
+      <w:lvlJc w:val="left"/>
+      <w:pPr>
+        <w:ind w:left="1440" w:hanging="360"/>
+      </w:pPr>
+    </w:lvl>
+    <w:lvl w:ilvl="2" w:tplc="3E1C42AC" w:tentative="1">
+      <w:start w:val="1"/>
+      <w:numFmt w:val="bullet"/>
+      <w:lvlText w:val="■"/>
+      <w:lvlJc w:val="left"/>
+      <w:pPr>
+        <w:ind w:left="2160" w:hanging="360"/>
+      </w:pPr>
+    </w:lvl>
+    <w:lvl w:ilvl="3" w:tplc="28E4F6A4" w:tentative="1">
+      <w:start w:val="1"/>
+      <w:numFmt w:val="bullet"/>
+      <w:lvlText w:val="●"/>
+      <w:lvlJc w:val="left"/>
+      <w:pPr>
+        <w:ind w:left="2880" w:hanging="360"/>
+      </w:pPr>
+    </w:lvl>
+    <w:lvl w:ilvl="4" w:tplc="90D024D0" w:tentative="1">
+      <w:start w:val="1"/>
+      <w:numFmt w:val="bullet"/>
+      <w:lvlText w:val="○"/>
+      <w:lvlJc w:val="left"/>
+      <w:pPr>
+        <w:ind w:left="3600" w:hanging="360"/>
+      </w:pPr>
+    </w:lvl>
+    <w:lvl w:ilvl="5" w:tplc="B3540F82" w:tentative="1">
+      <w:start w:val="1"/>
+      <w:numFmt w:val="bullet"/>
+      <w:lvlText w:val="■"/>
+      <w:lvlJc w:val="left"/>
+      <w:pPr>
+        <w:ind w:left="4320" w:hanging="360"/>
+      </w:pPr>
+    </w:lvl>
+    <w:lvl w:ilvl="6" w:tplc="5316E8D4" w:tentative="1">
+      <w:start w:val="1"/>
+      <w:numFmt w:val="bullet"/>
+      <w:lvlText w:val="●"/>
+      <w:lvlJc w:val="left"/>
+      <w:pPr>
+        <w:ind w:left="5040" w:hanging="360"/>
+      </w:pPr>
+    </w:lvl>
+    <w:lvl w:ilvl="7" w:tplc="B40CABB4" w:tentative="1">
+      <w:start w:val="1"/>
+      <w:numFmt w:val="bullet"/>
+      <w:lvlText w:val="●"/>
+      <w:lvlJc w:val="left"/>
+      <w:pPr>
+        <w:ind w:left="5760" w:hanging="360"/>
+      </w:pPr>
+    </w:lvl>
+    <w:lvl w:ilvl="8" w:tplc="94F2B37E" w:tentative="1">
+      <w:start w:val="1"/>
+      <w:numFmt w:val="bullet"/>
+      <w:lvlText w:val="●"/>
+      <w:lvlJc w:val="left"/>
+      <w:pPr>
+        <w:ind w:left="6480" w:hanging="360"/>
+      </w:pPr>
+    </w:lvl>
+  </w:abstractNum>
+  <w:abstractNum w:abstractNumId="7" w15:restartNumberingAfterBreak="0">
+    <w:nsid w:val="56647DD1"/>
+    <w:multiLevelType w:val="hybridMultilevel"/>
+    <w:tmpl w:val="0EFC19BE"/>
+    <w:lvl w:ilvl="0" w:tplc="EDDCC884">
       <w:start w:val="1"/>
       <w:numFmt w:val="decimal"/>
       <w:lvlText w:val="%1."/>
@@ -18138,192 +18243,106 @@
         <w:ind w:left="440" w:hanging="360"/>
       </w:pPr>
     </w:lvl>
-    <w:lvl w:ilvl="1" w:tplc="65EA2164">
+    <w:lvl w:ilvl="1" w:tplc="F7341562">
       <w:numFmt w:val="decimal"/>
       <w:lvlText w:val=""/>
       <w:lvlJc w:val="left"/>
     </w:lvl>
-    <w:lvl w:ilvl="2" w:tplc="85269126">
+    <w:lvl w:ilvl="2" w:tplc="CEB4547C">
       <w:numFmt w:val="decimal"/>
       <w:lvlText w:val=""/>
       <w:lvlJc w:val="left"/>
     </w:lvl>
-    <w:lvl w:ilvl="3" w:tplc="CEFC47A6">
+    <w:lvl w:ilvl="3" w:tplc="A0B2451A">
       <w:numFmt w:val="decimal"/>
       <w:lvlText w:val=""/>
       <w:lvlJc w:val="left"/>
     </w:lvl>
-    <w:lvl w:ilvl="4" w:tplc="FD568E12">
+    <w:lvl w:ilvl="4" w:tplc="7400A34C">
       <w:numFmt w:val="decimal"/>
       <w:lvlText w:val=""/>
       <w:lvlJc w:val="left"/>
     </w:lvl>
-    <w:lvl w:ilvl="5" w:tplc="E1507D76">
+    <w:lvl w:ilvl="5" w:tplc="44CA44B2">
       <w:numFmt w:val="decimal"/>
       <w:lvlText w:val=""/>
       <w:lvlJc w:val="left"/>
     </w:lvl>
-    <w:lvl w:ilvl="6" w:tplc="A36266C8">
+    <w:lvl w:ilvl="6" w:tplc="C0BEDF9A">
       <w:numFmt w:val="decimal"/>
       <w:lvlText w:val=""/>
       <w:lvlJc w:val="left"/>
     </w:lvl>
-    <w:lvl w:ilvl="7" w:tplc="942E229A">
+    <w:lvl w:ilvl="7" w:tplc="B186D6EA">
       <w:numFmt w:val="decimal"/>
       <w:lvlText w:val=""/>
       <w:lvlJc w:val="left"/>
     </w:lvl>
-    <w:lvl w:ilvl="8" w:tplc="C696FE70">
-      <w:numFmt w:val="decimal"/>
-      <w:lvlText w:val=""/>
-      <w:lvlJc w:val="left"/>
-    </w:lvl>
-  </w:abstractNum>
-  <w:abstractNum w:abstractNumId="7" w15:restartNumberingAfterBreak="0">
-    <w:nsid w:val="5FCE3120"/>
-    <w:multiLevelType w:val="hybridMultilevel"/>
-    <w:tmpl w:val="88CA1D0A"/>
-    <w:lvl w:ilvl="0" w:tplc="7CBA7CA2">
-      <w:start w:val="1"/>
-      <w:numFmt w:val="decimal"/>
-      <w:lvlText w:val="%1."/>
-      <w:lvlJc w:val="left"/>
-      <w:pPr>
-        <w:ind w:left="440" w:hanging="360"/>
-      </w:pPr>
-    </w:lvl>
-    <w:lvl w:ilvl="1" w:tplc="EC32F5E2">
-      <w:numFmt w:val="decimal"/>
-      <w:lvlText w:val=""/>
-      <w:lvlJc w:val="left"/>
-    </w:lvl>
-    <w:lvl w:ilvl="2" w:tplc="8B3ABD3C">
-      <w:numFmt w:val="decimal"/>
-      <w:lvlText w:val=""/>
-      <w:lvlJc w:val="left"/>
-    </w:lvl>
-    <w:lvl w:ilvl="3" w:tplc="2CF0683C">
-      <w:numFmt w:val="decimal"/>
-      <w:lvlText w:val=""/>
-      <w:lvlJc w:val="left"/>
-    </w:lvl>
-    <w:lvl w:ilvl="4" w:tplc="223E0CF4">
-      <w:numFmt w:val="decimal"/>
-      <w:lvlText w:val=""/>
-      <w:lvlJc w:val="left"/>
-    </w:lvl>
-    <w:lvl w:ilvl="5" w:tplc="2FD67DDC">
-      <w:numFmt w:val="decimal"/>
-      <w:lvlText w:val=""/>
-      <w:lvlJc w:val="left"/>
-    </w:lvl>
-    <w:lvl w:ilvl="6" w:tplc="CB563A28">
-      <w:numFmt w:val="decimal"/>
-      <w:lvlText w:val=""/>
-      <w:lvlJc w:val="left"/>
-    </w:lvl>
-    <w:lvl w:ilvl="7" w:tplc="6EBEDE98">
-      <w:numFmt w:val="decimal"/>
-      <w:lvlText w:val=""/>
-      <w:lvlJc w:val="left"/>
-    </w:lvl>
-    <w:lvl w:ilvl="8" w:tplc="FE3A9848">
+    <w:lvl w:ilvl="8" w:tplc="4B7897F6">
       <w:numFmt w:val="decimal"/>
       <w:lvlText w:val=""/>
       <w:lvlJc w:val="left"/>
     </w:lvl>
   </w:abstractNum>
   <w:abstractNum w:abstractNumId="8" w15:restartNumberingAfterBreak="0">
-    <w:nsid w:val="612D3D7B"/>
+    <w:nsid w:val="5E5828E8"/>
     <w:multiLevelType w:val="hybridMultilevel"/>
-    <w:tmpl w:val="776029E4"/>
-    <w:lvl w:ilvl="0" w:tplc="8584783E" w:tentative="1">
+    <w:tmpl w:val="EB4C6464"/>
+    <w:lvl w:ilvl="0" w:tplc="E998EE2E">
       <w:start w:val="1"/>
       <w:numFmt w:val="bullet"/>
-      <w:lvlText w:val="●"/>
+      <w:lvlText w:val="•"/>
       <w:lvlJc w:val="left"/>
       <w:pPr>
-        <w:ind w:left="720" w:hanging="360"/>
+        <w:ind w:left="440" w:hanging="280"/>
       </w:pPr>
     </w:lvl>
-    <w:lvl w:ilvl="1" w:tplc="69F8E210" w:tentative="1">
-      <w:start w:val="1"/>
-      <w:numFmt w:val="bullet"/>
-      <w:lvlText w:val="○"/>
+    <w:lvl w:ilvl="1" w:tplc="F834658E">
+      <w:numFmt w:val="decimal"/>
+      <w:lvlText w:val=""/>
       <w:lvlJc w:val="left"/>
-      <w:pPr>
-        <w:ind w:left="1440" w:hanging="360"/>
-      </w:pPr>
     </w:lvl>
-    <w:lvl w:ilvl="2" w:tplc="25F475F8" w:tentative="1">
-      <w:start w:val="1"/>
-      <w:numFmt w:val="bullet"/>
-      <w:lvlText w:val="■"/>
+    <w:lvl w:ilvl="2" w:tplc="80AEF0C8">
+      <w:numFmt w:val="decimal"/>
+      <w:lvlText w:val=""/>
       <w:lvlJc w:val="left"/>
-      <w:pPr>
-        <w:ind w:left="2160" w:hanging="360"/>
-      </w:pPr>
     </w:lvl>
-    <w:lvl w:ilvl="3" w:tplc="04D49620" w:tentative="1">
-      <w:start w:val="1"/>
-      <w:numFmt w:val="bullet"/>
-      <w:lvlText w:val="●"/>
+    <w:lvl w:ilvl="3" w:tplc="CA78E70A">
+      <w:numFmt w:val="decimal"/>
+      <w:lvlText w:val=""/>
       <w:lvlJc w:val="left"/>
-      <w:pPr>
-        <w:ind w:left="2880" w:hanging="360"/>
-      </w:pPr>
     </w:lvl>
-    <w:lvl w:ilvl="4" w:tplc="E6F4BFD6" w:tentative="1">
-      <w:start w:val="1"/>
-      <w:numFmt w:val="bullet"/>
-      <w:lvlText w:val="○"/>
+    <w:lvl w:ilvl="4" w:tplc="FC14525A">
+      <w:numFmt w:val="decimal"/>
+      <w:lvlText w:val=""/>
       <w:lvlJc w:val="left"/>
-      <w:pPr>
-        <w:ind w:left="3600" w:hanging="360"/>
-      </w:pPr>
     </w:lvl>
-    <w:lvl w:ilvl="5" w:tplc="11D45FEA" w:tentative="1">
-      <w:start w:val="1"/>
-      <w:numFmt w:val="bullet"/>
-      <w:lvlText w:val="■"/>
+    <w:lvl w:ilvl="5" w:tplc="C100A43E">
+      <w:numFmt w:val="decimal"/>
+      <w:lvlText w:val=""/>
       <w:lvlJc w:val="left"/>
-      <w:pPr>
-        <w:ind w:left="4320" w:hanging="360"/>
-      </w:pPr>
     </w:lvl>
-    <w:lvl w:ilvl="6" w:tplc="068444A2" w:tentative="1">
-      <w:start w:val="1"/>
-      <w:numFmt w:val="bullet"/>
-      <w:lvlText w:val="●"/>
+    <w:lvl w:ilvl="6" w:tplc="7C1005C8">
+      <w:numFmt w:val="decimal"/>
+      <w:lvlText w:val=""/>
       <w:lvlJc w:val="left"/>
-      <w:pPr>
-        <w:ind w:left="5040" w:hanging="360"/>
-      </w:pPr>
     </w:lvl>
-    <w:lvl w:ilvl="7" w:tplc="7714B7A2" w:tentative="1">
-      <w:start w:val="1"/>
-      <w:numFmt w:val="bullet"/>
-      <w:lvlText w:val="●"/>
+    <w:lvl w:ilvl="7" w:tplc="2BBC3466">
+      <w:numFmt w:val="decimal"/>
+      <w:lvlText w:val=""/>
       <w:lvlJc w:val="left"/>
-      <w:pPr>
-        <w:ind w:left="5760" w:hanging="360"/>
-      </w:pPr>
     </w:lvl>
-    <w:lvl w:ilvl="8" w:tplc="700E2FA8" w:tentative="1">
-      <w:start w:val="1"/>
-      <w:numFmt w:val="bullet"/>
-      <w:lvlText w:val="●"/>
+    <w:lvl w:ilvl="8" w:tplc="A36E629C">
+      <w:numFmt w:val="decimal"/>
+      <w:lvlText w:val=""/>
       <w:lvlJc w:val="left"/>
-      <w:pPr>
-        <w:ind w:left="6480" w:hanging="360"/>
-      </w:pPr>
     </w:lvl>
   </w:abstractNum>
   <w:abstractNum w:abstractNumId="9" w15:restartNumberingAfterBreak="0">
-    <w:nsid w:val="61B649C8"/>
+    <w:nsid w:val="651E0F7E"/>
     <w:multiLevelType w:val="hybridMultilevel"/>
-    <w:tmpl w:val="7CEC03AE"/>
-    <w:lvl w:ilvl="0" w:tplc="A336BF3A">
+    <w:tmpl w:val="24BA77D8"/>
+    <w:lvl w:ilvl="0" w:tplc="2DD49BB6">
       <w:start w:val="1"/>
       <w:numFmt w:val="decimal"/>
       <w:lvlText w:val="%1."/>
@@ -18332,52 +18351,52 @@
         <w:ind w:left="440" w:hanging="360"/>
       </w:pPr>
     </w:lvl>
-    <w:lvl w:ilvl="1" w:tplc="C4D00FA2">
+    <w:lvl w:ilvl="1" w:tplc="2AA2077A">
       <w:numFmt w:val="decimal"/>
       <w:lvlText w:val=""/>
       <w:lvlJc w:val="left"/>
     </w:lvl>
-    <w:lvl w:ilvl="2" w:tplc="1BA629C2">
+    <w:lvl w:ilvl="2" w:tplc="31BEA5A6">
       <w:numFmt w:val="decimal"/>
       <w:lvlText w:val=""/>
       <w:lvlJc w:val="left"/>
     </w:lvl>
-    <w:lvl w:ilvl="3" w:tplc="63ECD070">
+    <w:lvl w:ilvl="3" w:tplc="3C7CD0F6">
       <w:numFmt w:val="decimal"/>
       <w:lvlText w:val=""/>
       <w:lvlJc w:val="left"/>
     </w:lvl>
-    <w:lvl w:ilvl="4" w:tplc="D3BA1668">
+    <w:lvl w:ilvl="4" w:tplc="187805BC">
       <w:numFmt w:val="decimal"/>
       <w:lvlText w:val=""/>
       <w:lvlJc w:val="left"/>
     </w:lvl>
-    <w:lvl w:ilvl="5" w:tplc="1966D0E6">
+    <w:lvl w:ilvl="5" w:tplc="74B25710">
       <w:numFmt w:val="decimal"/>
       <w:lvlText w:val=""/>
       <w:lvlJc w:val="left"/>
     </w:lvl>
-    <w:lvl w:ilvl="6" w:tplc="AC34CAA8">
+    <w:lvl w:ilvl="6" w:tplc="886E80CA">
       <w:numFmt w:val="decimal"/>
       <w:lvlText w:val=""/>
       <w:lvlJc w:val="left"/>
     </w:lvl>
-    <w:lvl w:ilvl="7" w:tplc="1DE42338">
+    <w:lvl w:ilvl="7" w:tplc="3650E854">
       <w:numFmt w:val="decimal"/>
       <w:lvlText w:val=""/>
       <w:lvlJc w:val="left"/>
     </w:lvl>
-    <w:lvl w:ilvl="8" w:tplc="5E345530">
+    <w:lvl w:ilvl="8" w:tplc="8F204D64">
       <w:numFmt w:val="decimal"/>
       <w:lvlText w:val=""/>
       <w:lvlJc w:val="left"/>
     </w:lvl>
   </w:abstractNum>
   <w:abstractNum w:abstractNumId="10" w15:restartNumberingAfterBreak="0">
-    <w:nsid w:val="691E6080"/>
+    <w:nsid w:val="688D354B"/>
     <w:multiLevelType w:val="hybridMultilevel"/>
-    <w:tmpl w:val="CD721410"/>
-    <w:lvl w:ilvl="0" w:tplc="E87A5342">
+    <w:tmpl w:val="79AACB20"/>
+    <w:lvl w:ilvl="0" w:tplc="0D420A04">
       <w:start w:val="1"/>
       <w:numFmt w:val="decimal"/>
       <w:lvlText w:val="%1."/>
@@ -18386,52 +18405,52 @@
         <w:ind w:left="440" w:hanging="360"/>
       </w:pPr>
     </w:lvl>
-    <w:lvl w:ilvl="1" w:tplc="847E4B7A">
+    <w:lvl w:ilvl="1" w:tplc="B6BCE888">
       <w:numFmt w:val="decimal"/>
       <w:lvlText w:val=""/>
       <w:lvlJc w:val="left"/>
     </w:lvl>
-    <w:lvl w:ilvl="2" w:tplc="D5DA977A">
+    <w:lvl w:ilvl="2" w:tplc="6270EF28">
       <w:numFmt w:val="decimal"/>
       <w:lvlText w:val=""/>
       <w:lvlJc w:val="left"/>
     </w:lvl>
-    <w:lvl w:ilvl="3" w:tplc="A6D85354">
+    <w:lvl w:ilvl="3" w:tplc="8190F37C">
       <w:numFmt w:val="decimal"/>
       <w:lvlText w:val=""/>
       <w:lvlJc w:val="left"/>
     </w:lvl>
-    <w:lvl w:ilvl="4" w:tplc="171E1B6C">
+    <w:lvl w:ilvl="4" w:tplc="A54E13BE">
       <w:numFmt w:val="decimal"/>
       <w:lvlText w:val=""/>
       <w:lvlJc w:val="left"/>
     </w:lvl>
-    <w:lvl w:ilvl="5" w:tplc="426440E0">
+    <w:lvl w:ilvl="5" w:tplc="BF166A14">
       <w:numFmt w:val="decimal"/>
       <w:lvlText w:val=""/>
       <w:lvlJc w:val="left"/>
     </w:lvl>
-    <w:lvl w:ilvl="6" w:tplc="3488B874">
+    <w:lvl w:ilvl="6" w:tplc="F8CAE01A">
       <w:numFmt w:val="decimal"/>
       <w:lvlText w:val=""/>
       <w:lvlJc w:val="left"/>
     </w:lvl>
-    <w:lvl w:ilvl="7" w:tplc="F0E04C38">
+    <w:lvl w:ilvl="7" w:tplc="04101FBA">
       <w:numFmt w:val="decimal"/>
       <w:lvlText w:val=""/>
       <w:lvlJc w:val="left"/>
     </w:lvl>
-    <w:lvl w:ilvl="8" w:tplc="9202F120">
+    <w:lvl w:ilvl="8" w:tplc="692EA59A">
       <w:numFmt w:val="decimal"/>
       <w:lvlText w:val=""/>
       <w:lvlJc w:val="left"/>
     </w:lvl>
   </w:abstractNum>
   <w:abstractNum w:abstractNumId="11" w15:restartNumberingAfterBreak="0">
-    <w:nsid w:val="6BF43CD3"/>
+    <w:nsid w:val="6C234BAD"/>
     <w:multiLevelType w:val="hybridMultilevel"/>
-    <w:tmpl w:val="55CCDA62"/>
-    <w:lvl w:ilvl="0" w:tplc="90DA8586">
+    <w:tmpl w:val="D43ED67A"/>
+    <w:lvl w:ilvl="0" w:tplc="AD52C7C0">
       <w:start w:val="1"/>
       <w:numFmt w:val="decimal"/>
       <w:lvlText w:val="%1."/>
@@ -18440,52 +18459,52 @@
         <w:ind w:left="440" w:hanging="360"/>
       </w:pPr>
     </w:lvl>
-    <w:lvl w:ilvl="1" w:tplc="0BB69916">
+    <w:lvl w:ilvl="1" w:tplc="BAC24496">
       <w:numFmt w:val="decimal"/>
       <w:lvlText w:val=""/>
       <w:lvlJc w:val="left"/>
     </w:lvl>
-    <w:lvl w:ilvl="2" w:tplc="88B6107A">
+    <w:lvl w:ilvl="2" w:tplc="C374DE5A">
       <w:numFmt w:val="decimal"/>
       <w:lvlText w:val=""/>
       <w:lvlJc w:val="left"/>
     </w:lvl>
-    <w:lvl w:ilvl="3" w:tplc="5582B414">
+    <w:lvl w:ilvl="3" w:tplc="DB748C5E">
       <w:numFmt w:val="decimal"/>
       <w:lvlText w:val=""/>
       <w:lvlJc w:val="left"/>
     </w:lvl>
-    <w:lvl w:ilvl="4" w:tplc="D2F6D1E0">
+    <w:lvl w:ilvl="4" w:tplc="81CCE3C0">
       <w:numFmt w:val="decimal"/>
       <w:lvlText w:val=""/>
       <w:lvlJc w:val="left"/>
     </w:lvl>
-    <w:lvl w:ilvl="5" w:tplc="0776A30C">
+    <w:lvl w:ilvl="5" w:tplc="0098205C">
       <w:numFmt w:val="decimal"/>
       <w:lvlText w:val=""/>
       <w:lvlJc w:val="left"/>
     </w:lvl>
-    <w:lvl w:ilvl="6" w:tplc="781AE520">
+    <w:lvl w:ilvl="6" w:tplc="E01AE0E4">
       <w:numFmt w:val="decimal"/>
       <w:lvlText w:val=""/>
       <w:lvlJc w:val="left"/>
     </w:lvl>
-    <w:lvl w:ilvl="7" w:tplc="86807740">
+    <w:lvl w:ilvl="7" w:tplc="1BFCDAA4">
       <w:numFmt w:val="decimal"/>
       <w:lvlText w:val=""/>
       <w:lvlJc w:val="left"/>
     </w:lvl>
-    <w:lvl w:ilvl="8" w:tplc="4B8C9E42">
+    <w:lvl w:ilvl="8" w:tplc="5A444088">
       <w:numFmt w:val="decimal"/>
       <w:lvlText w:val=""/>
       <w:lvlJc w:val="left"/>
     </w:lvl>
   </w:abstractNum>
   <w:abstractNum w:abstractNumId="12" w15:restartNumberingAfterBreak="0">
-    <w:nsid w:val="724751E4"/>
+    <w:nsid w:val="73560129"/>
     <w:multiLevelType w:val="hybridMultilevel"/>
-    <w:tmpl w:val="A46EAB42"/>
-    <w:lvl w:ilvl="0" w:tplc="A4A01108">
+    <w:tmpl w:val="52E699E4"/>
+    <w:lvl w:ilvl="0" w:tplc="63C28C56">
       <w:start w:val="1"/>
       <w:numFmt w:val="decimal"/>
       <w:lvlText w:val="%1."/>
@@ -18494,52 +18513,52 @@
         <w:ind w:left="440" w:hanging="360"/>
       </w:pPr>
     </w:lvl>
-    <w:lvl w:ilvl="1" w:tplc="C2C49354">
+    <w:lvl w:ilvl="1" w:tplc="61403CB6">
       <w:numFmt w:val="decimal"/>
       <w:lvlText w:val=""/>
       <w:lvlJc w:val="left"/>
     </w:lvl>
-    <w:lvl w:ilvl="2" w:tplc="79DE9AEA">
+    <w:lvl w:ilvl="2" w:tplc="71149322">
       <w:numFmt w:val="decimal"/>
       <w:lvlText w:val=""/>
       <w:lvlJc w:val="left"/>
     </w:lvl>
-    <w:lvl w:ilvl="3" w:tplc="7206D964">
+    <w:lvl w:ilvl="3" w:tplc="091CC1B4">
       <w:numFmt w:val="decimal"/>
       <w:lvlText w:val=""/>
       <w:lvlJc w:val="left"/>
     </w:lvl>
-    <w:lvl w:ilvl="4" w:tplc="49F81370">
+    <w:lvl w:ilvl="4" w:tplc="A832F1BE">
       <w:numFmt w:val="decimal"/>
       <w:lvlText w:val=""/>
       <w:lvlJc w:val="left"/>
     </w:lvl>
-    <w:lvl w:ilvl="5" w:tplc="3418FA8C">
+    <w:lvl w:ilvl="5" w:tplc="A9941C4E">
       <w:numFmt w:val="decimal"/>
       <w:lvlText w:val=""/>
       <w:lvlJc w:val="left"/>
     </w:lvl>
-    <w:lvl w:ilvl="6" w:tplc="60CCFF94">
+    <w:lvl w:ilvl="6" w:tplc="625AA7B6">
       <w:numFmt w:val="decimal"/>
       <w:lvlText w:val=""/>
       <w:lvlJc w:val="left"/>
     </w:lvl>
-    <w:lvl w:ilvl="7" w:tplc="6DEA2BFC">
+    <w:lvl w:ilvl="7" w:tplc="72E677C4">
       <w:numFmt w:val="decimal"/>
       <w:lvlText w:val=""/>
       <w:lvlJc w:val="left"/>
     </w:lvl>
-    <w:lvl w:ilvl="8" w:tplc="F11EC8B8">
+    <w:lvl w:ilvl="8" w:tplc="2564F07A">
       <w:numFmt w:val="decimal"/>
       <w:lvlText w:val=""/>
       <w:lvlJc w:val="left"/>
     </w:lvl>
   </w:abstractNum>
   <w:abstractNum w:abstractNumId="13" w15:restartNumberingAfterBreak="0">
-    <w:nsid w:val="73F55B75"/>
+    <w:nsid w:val="7B693C55"/>
     <w:multiLevelType w:val="hybridMultilevel"/>
-    <w:tmpl w:val="C1C40F10"/>
-    <w:lvl w:ilvl="0" w:tplc="1FEC2C34">
+    <w:tmpl w:val="89922DE8"/>
+    <w:lvl w:ilvl="0" w:tplc="7420846A">
       <w:start w:val="1"/>
       <w:numFmt w:val="decimal"/>
       <w:lvlText w:val="%1."/>
@@ -18548,127 +18567,127 @@
         <w:ind w:left="440" w:hanging="360"/>
       </w:pPr>
     </w:lvl>
-    <w:lvl w:ilvl="1" w:tplc="45ECC33E">
+    <w:lvl w:ilvl="1" w:tplc="3998F854">
       <w:numFmt w:val="decimal"/>
       <w:lvlText w:val=""/>
       <w:lvlJc w:val="left"/>
     </w:lvl>
-    <w:lvl w:ilvl="2" w:tplc="B87AA202">
+    <w:lvl w:ilvl="2" w:tplc="450A0DAC">
       <w:numFmt w:val="decimal"/>
       <w:lvlText w:val=""/>
       <w:lvlJc w:val="left"/>
     </w:lvl>
-    <w:lvl w:ilvl="3" w:tplc="A96E515C">
+    <w:lvl w:ilvl="3" w:tplc="04D8322E">
       <w:numFmt w:val="decimal"/>
       <w:lvlText w:val=""/>
       <w:lvlJc w:val="left"/>
     </w:lvl>
-    <w:lvl w:ilvl="4" w:tplc="B2E46CF4">
+    <w:lvl w:ilvl="4" w:tplc="846EF520">
       <w:numFmt w:val="decimal"/>
       <w:lvlText w:val=""/>
       <w:lvlJc w:val="left"/>
     </w:lvl>
-    <w:lvl w:ilvl="5" w:tplc="5880A8F6">
+    <w:lvl w:ilvl="5" w:tplc="641880C8">
       <w:numFmt w:val="decimal"/>
       <w:lvlText w:val=""/>
       <w:lvlJc w:val="left"/>
     </w:lvl>
-    <w:lvl w:ilvl="6" w:tplc="734471AA">
+    <w:lvl w:ilvl="6" w:tplc="1BAE2148">
       <w:numFmt w:val="decimal"/>
       <w:lvlText w:val=""/>
       <w:lvlJc w:val="left"/>
     </w:lvl>
-    <w:lvl w:ilvl="7" w:tplc="EAF43868">
+    <w:lvl w:ilvl="7" w:tplc="33ACDF56">
       <w:numFmt w:val="decimal"/>
       <w:lvlText w:val=""/>
       <w:lvlJc w:val="left"/>
     </w:lvl>
-    <w:lvl w:ilvl="8" w:tplc="5BC40A5A">
+    <w:lvl w:ilvl="8" w:tplc="AB86CDBA">
       <w:numFmt w:val="decimal"/>
       <w:lvlText w:val=""/>
       <w:lvlJc w:val="left"/>
     </w:lvl>
   </w:abstractNum>
-  <w:num w:numId="1" w16cid:durableId="1312909871">
+  <w:num w:numId="1" w16cid:durableId="1668710323">
+    <w:abstractNumId w:val="6"/>
+    <w:lvlOverride w:ilvl="0">
+      <w:startOverride w:val="1"/>
+    </w:lvlOverride>
+  </w:num>
+  <w:num w:numId="2" w16cid:durableId="893009244">
+    <w:abstractNumId w:val="12"/>
+    <w:lvlOverride w:ilvl="0">
+      <w:startOverride w:val="1"/>
+    </w:lvlOverride>
+  </w:num>
+  <w:num w:numId="3" w16cid:durableId="912592904">
     <w:abstractNumId w:val="8"/>
     <w:lvlOverride w:ilvl="0">
       <w:startOverride w:val="1"/>
     </w:lvlOverride>
   </w:num>
-  <w:num w:numId="2" w16cid:durableId="1718121906">
+  <w:num w:numId="4" w16cid:durableId="928805001">
+    <w:abstractNumId w:val="11"/>
+    <w:lvlOverride w:ilvl="0">
+      <w:startOverride w:val="1"/>
+    </w:lvlOverride>
+  </w:num>
+  <w:num w:numId="5" w16cid:durableId="1044139276">
+    <w:abstractNumId w:val="10"/>
+    <w:lvlOverride w:ilvl="0">
+      <w:startOverride w:val="1"/>
+    </w:lvlOverride>
+  </w:num>
+  <w:num w:numId="6" w16cid:durableId="1835146522">
+    <w:abstractNumId w:val="7"/>
+    <w:lvlOverride w:ilvl="0">
+      <w:startOverride w:val="1"/>
+    </w:lvlOverride>
+  </w:num>
+  <w:num w:numId="7" w16cid:durableId="1737705936">
+    <w:abstractNumId w:val="13"/>
+    <w:lvlOverride w:ilvl="0">
+      <w:startOverride w:val="1"/>
+    </w:lvlOverride>
+  </w:num>
+  <w:num w:numId="8" w16cid:durableId="581447332">
+    <w:abstractNumId w:val="9"/>
+    <w:lvlOverride w:ilvl="0">
+      <w:startOverride w:val="1"/>
+    </w:lvlOverride>
+  </w:num>
+  <w:num w:numId="9" w16cid:durableId="609581434">
     <w:abstractNumId w:val="1"/>
     <w:lvlOverride w:ilvl="0">
       <w:startOverride w:val="1"/>
     </w:lvlOverride>
   </w:num>
-  <w:num w:numId="3" w16cid:durableId="1368527606">
+  <w:num w:numId="10" w16cid:durableId="599336036">
+    <w:abstractNumId w:val="4"/>
+    <w:lvlOverride w:ilvl="0">
+      <w:startOverride w:val="1"/>
+    </w:lvlOverride>
+  </w:num>
+  <w:num w:numId="11" w16cid:durableId="83304337">
     <w:abstractNumId w:val="2"/>
     <w:lvlOverride w:ilvl="0">
       <w:startOverride w:val="1"/>
     </w:lvlOverride>
   </w:num>
-  <w:num w:numId="4" w16cid:durableId="864751078">
-    <w:abstractNumId w:val="11"/>
+  <w:num w:numId="12" w16cid:durableId="839004866">
+    <w:abstractNumId w:val="3"/>
     <w:lvlOverride w:ilvl="0">
       <w:startOverride w:val="1"/>
     </w:lvlOverride>
   </w:num>
-  <w:num w:numId="5" w16cid:durableId="1137991824">
-    <w:abstractNumId w:val="9"/>
-    <w:lvlOverride w:ilvl="0">
-      <w:startOverride w:val="1"/>
-    </w:lvlOverride>
-  </w:num>
-  <w:num w:numId="6" w16cid:durableId="315378990">
+  <w:num w:numId="13" w16cid:durableId="1579166874">
     <w:abstractNumId w:val="0"/>
     <w:lvlOverride w:ilvl="0">
       <w:startOverride w:val="1"/>
     </w:lvlOverride>
   </w:num>
-  <w:num w:numId="7" w16cid:durableId="1194729652">
-    <w:abstractNumId w:val="7"/>
-    <w:lvlOverride w:ilvl="0">
-      <w:startOverride w:val="1"/>
-    </w:lvlOverride>
-  </w:num>
-  <w:num w:numId="8" w16cid:durableId="1557937618">
-    <w:abstractNumId w:val="13"/>
-    <w:lvlOverride w:ilvl="0">
-      <w:startOverride w:val="1"/>
-    </w:lvlOverride>
-  </w:num>
-  <w:num w:numId="9" w16cid:durableId="1379356572">
-    <w:abstractNumId w:val="3"/>
-    <w:lvlOverride w:ilvl="0">
-      <w:startOverride w:val="1"/>
-    </w:lvlOverride>
-  </w:num>
-  <w:num w:numId="10" w16cid:durableId="392629095">
-    <w:abstractNumId w:val="10"/>
-    <w:lvlOverride w:ilvl="0">
-      <w:startOverride w:val="1"/>
-    </w:lvlOverride>
-  </w:num>
-  <w:num w:numId="11" w16cid:durableId="234170172">
-    <w:abstractNumId w:val="12"/>
-    <w:lvlOverride w:ilvl="0">
-      <w:startOverride w:val="1"/>
-    </w:lvlOverride>
-  </w:num>
-  <w:num w:numId="12" w16cid:durableId="219947876">
+  <w:num w:numId="14" w16cid:durableId="1082531946">
     <w:abstractNumId w:val="5"/>
-    <w:lvlOverride w:ilvl="0">
-      <w:startOverride w:val="1"/>
-    </w:lvlOverride>
-  </w:num>
-  <w:num w:numId="13" w16cid:durableId="408499128">
-    <w:abstractNumId w:val="4"/>
-    <w:lvlOverride w:ilvl="0">
-      <w:startOverride w:val="1"/>
-    </w:lvlOverride>
-  </w:num>
-  <w:num w:numId="14" w16cid:durableId="808286045">
-    <w:abstractNumId w:val="6"/>
     <w:lvlOverride w:ilvl="0">
       <w:startOverride w:val="1"/>
     </w:lvlOverride>

</xml_diff>

<commit_message>
Guide: FLUX 4 steps (~165 neurons, ~60 pictures/day), only prompt+steps, careful wording on the reset
</commit_message>
<xml_diff>
--- a/Vid Studio — инструкция от А до Я.docx
+++ b/Vid Studio — инструкция от А до Я.docx
@@ -107,7 +107,7 @@
     <w:sdt>
       <w:sdtPr>
         <w:alias w:val="Содержание"/>
-        <w:id w:val="-1840297547"/>
+        <w:id w:val="1990139441"/>
         <w:docPartObj>
           <w:docPartGallery w:val="Table of Contents"/>
           <w:docPartUnique/>
@@ -139,7 +139,7 @@
           <w:r>
             <w:fldChar w:fldCharType="separate"/>
           </w:r>
-          <w:hyperlink w:anchor="_Toc244135745" w:history="1">
+          <w:hyperlink w:anchor="_Toc244137023" w:history="1">
             <w:r>
               <w:rPr>
                 <w:rStyle w:val="Hyperlink"/>
@@ -163,7 +163,7 @@
               <w:rPr>
                 <w:noProof/>
               </w:rPr>
-              <w:instrText xml:space="preserve"> PAGEREF _Toc244135745 \h </w:instrText>
+              <w:instrText xml:space="preserve"> PAGEREF _Toc244137023 \h </w:instrText>
             </w:r>
             <w:r>
               <w:rPr>
@@ -205,7 +205,7 @@
               <w14:ligatures w14:val="standardContextual"/>
             </w:rPr>
           </w:pPr>
-          <w:hyperlink w:anchor="_Toc244135746" w:history="1">
+          <w:hyperlink w:anchor="_Toc244137024" w:history="1">
             <w:r>
               <w:rPr>
                 <w:rStyle w:val="Hyperlink"/>
@@ -229,7 +229,7 @@
               <w:rPr>
                 <w:noProof/>
               </w:rPr>
-              <w:instrText xml:space="preserve"> PAGEREF _Toc244135746 \h </w:instrText>
+              <w:instrText xml:space="preserve"> PAGEREF _Toc244137024 \h </w:instrText>
             </w:r>
             <w:r>
               <w:rPr>
@@ -271,7 +271,7 @@
               <w14:ligatures w14:val="standardContextual"/>
             </w:rPr>
           </w:pPr>
-          <w:hyperlink w:anchor="_Toc244135747" w:history="1">
+          <w:hyperlink w:anchor="_Toc244137025" w:history="1">
             <w:r>
               <w:rPr>
                 <w:rStyle w:val="Hyperlink"/>
@@ -295,7 +295,7 @@
               <w:rPr>
                 <w:noProof/>
               </w:rPr>
-              <w:instrText xml:space="preserve"> PAGEREF _Toc244135747 \h </w:instrText>
+              <w:instrText xml:space="preserve"> PAGEREF _Toc244137025 \h </w:instrText>
             </w:r>
             <w:r>
               <w:rPr>
@@ -337,7 +337,7 @@
               <w14:ligatures w14:val="standardContextual"/>
             </w:rPr>
           </w:pPr>
-          <w:hyperlink w:anchor="_Toc244135748" w:history="1">
+          <w:hyperlink w:anchor="_Toc244137026" w:history="1">
             <w:r>
               <w:rPr>
                 <w:rStyle w:val="Hyperlink"/>
@@ -361,7 +361,7 @@
               <w:rPr>
                 <w:noProof/>
               </w:rPr>
-              <w:instrText xml:space="preserve"> PAGEREF _Toc244135748 \h </w:instrText>
+              <w:instrText xml:space="preserve"> PAGEREF _Toc244137026 \h </w:instrText>
             </w:r>
             <w:r>
               <w:rPr>
@@ -403,7 +403,7 @@
               <w14:ligatures w14:val="standardContextual"/>
             </w:rPr>
           </w:pPr>
-          <w:hyperlink w:anchor="_Toc244135749" w:history="1">
+          <w:hyperlink w:anchor="_Toc244137027" w:history="1">
             <w:r>
               <w:rPr>
                 <w:rStyle w:val="Hyperlink"/>
@@ -427,7 +427,7 @@
               <w:rPr>
                 <w:noProof/>
               </w:rPr>
-              <w:instrText xml:space="preserve"> PAGEREF _Toc244135749 \h </w:instrText>
+              <w:instrText xml:space="preserve"> PAGEREF _Toc244137027 \h </w:instrText>
             </w:r>
             <w:r>
               <w:rPr>
@@ -469,7 +469,7 @@
               <w14:ligatures w14:val="standardContextual"/>
             </w:rPr>
           </w:pPr>
-          <w:hyperlink w:anchor="_Toc244135750" w:history="1">
+          <w:hyperlink w:anchor="_Toc244137028" w:history="1">
             <w:r>
               <w:rPr>
                 <w:rStyle w:val="Hyperlink"/>
@@ -493,7 +493,7 @@
               <w:rPr>
                 <w:noProof/>
               </w:rPr>
-              <w:instrText xml:space="preserve"> PAGEREF _Toc244135750 \h </w:instrText>
+              <w:instrText xml:space="preserve"> PAGEREF _Toc244137028 \h </w:instrText>
             </w:r>
             <w:r>
               <w:rPr>
@@ -535,7 +535,7 @@
               <w14:ligatures w14:val="standardContextual"/>
             </w:rPr>
           </w:pPr>
-          <w:hyperlink w:anchor="_Toc244135751" w:history="1">
+          <w:hyperlink w:anchor="_Toc244137029" w:history="1">
             <w:r>
               <w:rPr>
                 <w:rStyle w:val="Hyperlink"/>
@@ -559,7 +559,7 @@
               <w:rPr>
                 <w:noProof/>
               </w:rPr>
-              <w:instrText xml:space="preserve"> PAGEREF _Toc244135751 \h </w:instrText>
+              <w:instrText xml:space="preserve"> PAGEREF _Toc244137029 \h </w:instrText>
             </w:r>
             <w:r>
               <w:rPr>
@@ -601,7 +601,7 @@
               <w14:ligatures w14:val="standardContextual"/>
             </w:rPr>
           </w:pPr>
-          <w:hyperlink w:anchor="_Toc244135752" w:history="1">
+          <w:hyperlink w:anchor="_Toc244137030" w:history="1">
             <w:r>
               <w:rPr>
                 <w:rStyle w:val="Hyperlink"/>
@@ -625,7 +625,7 @@
               <w:rPr>
                 <w:noProof/>
               </w:rPr>
-              <w:instrText xml:space="preserve"> PAGEREF _Toc244135752 \h </w:instrText>
+              <w:instrText xml:space="preserve"> PAGEREF _Toc244137030 \h </w:instrText>
             </w:r>
             <w:r>
               <w:rPr>
@@ -667,7 +667,7 @@
               <w14:ligatures w14:val="standardContextual"/>
             </w:rPr>
           </w:pPr>
-          <w:hyperlink w:anchor="_Toc244135753" w:history="1">
+          <w:hyperlink w:anchor="_Toc244137031" w:history="1">
             <w:r>
               <w:rPr>
                 <w:rStyle w:val="Hyperlink"/>
@@ -691,7 +691,7 @@
               <w:rPr>
                 <w:noProof/>
               </w:rPr>
-              <w:instrText xml:space="preserve"> PAGEREF _Toc244135753 \h </w:instrText>
+              <w:instrText xml:space="preserve"> PAGEREF _Toc244137031 \h </w:instrText>
             </w:r>
             <w:r>
               <w:rPr>
@@ -733,7 +733,7 @@
               <w14:ligatures w14:val="standardContextual"/>
             </w:rPr>
           </w:pPr>
-          <w:hyperlink w:anchor="_Toc244135754" w:history="1">
+          <w:hyperlink w:anchor="_Toc244137032" w:history="1">
             <w:r>
               <w:rPr>
                 <w:rStyle w:val="Hyperlink"/>
@@ -757,7 +757,7 @@
               <w:rPr>
                 <w:noProof/>
               </w:rPr>
-              <w:instrText xml:space="preserve"> PAGEREF _Toc244135754 \h </w:instrText>
+              <w:instrText xml:space="preserve"> PAGEREF _Toc244137032 \h </w:instrText>
             </w:r>
             <w:r>
               <w:rPr>
@@ -799,7 +799,7 @@
               <w14:ligatures w14:val="standardContextual"/>
             </w:rPr>
           </w:pPr>
-          <w:hyperlink w:anchor="_Toc244135755" w:history="1">
+          <w:hyperlink w:anchor="_Toc244137033" w:history="1">
             <w:r>
               <w:rPr>
                 <w:rStyle w:val="Hyperlink"/>
@@ -823,7 +823,7 @@
               <w:rPr>
                 <w:noProof/>
               </w:rPr>
-              <w:instrText xml:space="preserve"> PAGEREF _Toc244135755 \h </w:instrText>
+              <w:instrText xml:space="preserve"> PAGEREF _Toc244137033 \h </w:instrText>
             </w:r>
             <w:r>
               <w:rPr>
@@ -840,7 +840,7 @@
               <w:rPr>
                 <w:noProof/>
               </w:rPr>
-              <w:t>14</w:t>
+              <w:t>15</w:t>
             </w:r>
             <w:r>
               <w:rPr>
@@ -865,7 +865,7 @@
               <w14:ligatures w14:val="standardContextual"/>
             </w:rPr>
           </w:pPr>
-          <w:hyperlink w:anchor="_Toc244135756" w:history="1">
+          <w:hyperlink w:anchor="_Toc244137034" w:history="1">
             <w:r>
               <w:rPr>
                 <w:rStyle w:val="Hyperlink"/>
@@ -889,7 +889,7 @@
               <w:rPr>
                 <w:noProof/>
               </w:rPr>
-              <w:instrText xml:space="preserve"> PAGEREF _Toc244135756 \h </w:instrText>
+              <w:instrText xml:space="preserve"> PAGEREF _Toc244137034 \h </w:instrText>
             </w:r>
             <w:r>
               <w:rPr>
@@ -931,7 +931,7 @@
               <w14:ligatures w14:val="standardContextual"/>
             </w:rPr>
           </w:pPr>
-          <w:hyperlink w:anchor="_Toc244135757" w:history="1">
+          <w:hyperlink w:anchor="_Toc244137035" w:history="1">
             <w:r>
               <w:rPr>
                 <w:rStyle w:val="Hyperlink"/>
@@ -955,7 +955,7 @@
               <w:rPr>
                 <w:noProof/>
               </w:rPr>
-              <w:instrText xml:space="preserve"> PAGEREF _Toc244135757 \h </w:instrText>
+              <w:instrText xml:space="preserve"> PAGEREF _Toc244137035 \h </w:instrText>
             </w:r>
             <w:r>
               <w:rPr>
@@ -997,7 +997,7 @@
               <w14:ligatures w14:val="standardContextual"/>
             </w:rPr>
           </w:pPr>
-          <w:hyperlink w:anchor="_Toc244135758" w:history="1">
+          <w:hyperlink w:anchor="_Toc244137036" w:history="1">
             <w:r>
               <w:rPr>
                 <w:rStyle w:val="Hyperlink"/>
@@ -1021,7 +1021,7 @@
               <w:rPr>
                 <w:noProof/>
               </w:rPr>
-              <w:instrText xml:space="preserve"> PAGEREF _Toc244135758 \h </w:instrText>
+              <w:instrText xml:space="preserve"> PAGEREF _Toc244137036 \h </w:instrText>
             </w:r>
             <w:r>
               <w:rPr>
@@ -1063,7 +1063,7 @@
               <w14:ligatures w14:val="standardContextual"/>
             </w:rPr>
           </w:pPr>
-          <w:hyperlink w:anchor="_Toc244135759" w:history="1">
+          <w:hyperlink w:anchor="_Toc244137037" w:history="1">
             <w:r>
               <w:rPr>
                 <w:rStyle w:val="Hyperlink"/>
@@ -1087,7 +1087,7 @@
               <w:rPr>
                 <w:noProof/>
               </w:rPr>
-              <w:instrText xml:space="preserve"> PAGEREF _Toc244135759 \h </w:instrText>
+              <w:instrText xml:space="preserve"> PAGEREF _Toc244137037 \h </w:instrText>
             </w:r>
             <w:r>
               <w:rPr>
@@ -1129,7 +1129,7 @@
               <w14:ligatures w14:val="standardContextual"/>
             </w:rPr>
           </w:pPr>
-          <w:hyperlink w:anchor="_Toc244135760" w:history="1">
+          <w:hyperlink w:anchor="_Toc244137038" w:history="1">
             <w:r>
               <w:rPr>
                 <w:rStyle w:val="Hyperlink"/>
@@ -1153,7 +1153,7 @@
               <w:rPr>
                 <w:noProof/>
               </w:rPr>
-              <w:instrText xml:space="preserve"> PAGEREF _Toc244135760 \h </w:instrText>
+              <w:instrText xml:space="preserve"> PAGEREF _Toc244137038 \h </w:instrText>
             </w:r>
             <w:r>
               <w:rPr>
@@ -1170,7 +1170,7 @@
               <w:rPr>
                 <w:noProof/>
               </w:rPr>
-              <w:t>21</w:t>
+              <w:t>22</w:t>
             </w:r>
             <w:r>
               <w:rPr>
@@ -1195,7 +1195,7 @@
               <w14:ligatures w14:val="standardContextual"/>
             </w:rPr>
           </w:pPr>
-          <w:hyperlink w:anchor="_Toc244135761" w:history="1">
+          <w:hyperlink w:anchor="_Toc244137039" w:history="1">
             <w:r>
               <w:rPr>
                 <w:rStyle w:val="Hyperlink"/>
@@ -1219,7 +1219,7 @@
               <w:rPr>
                 <w:noProof/>
               </w:rPr>
-              <w:instrText xml:space="preserve"> PAGEREF _Toc244135761 \h </w:instrText>
+              <w:instrText xml:space="preserve"> PAGEREF _Toc244137039 \h </w:instrText>
             </w:r>
             <w:r>
               <w:rPr>
@@ -1261,7 +1261,7 @@
               <w14:ligatures w14:val="standardContextual"/>
             </w:rPr>
           </w:pPr>
-          <w:hyperlink w:anchor="_Toc244135762" w:history="1">
+          <w:hyperlink w:anchor="_Toc244137040" w:history="1">
             <w:r>
               <w:rPr>
                 <w:rStyle w:val="Hyperlink"/>
@@ -1285,7 +1285,7 @@
               <w:rPr>
                 <w:noProof/>
               </w:rPr>
-              <w:instrText xml:space="preserve"> PAGEREF _Toc244135762 \h </w:instrText>
+              <w:instrText xml:space="preserve"> PAGEREF _Toc244137040 \h </w:instrText>
             </w:r>
             <w:r>
               <w:rPr>
@@ -1327,7 +1327,7 @@
               <w14:ligatures w14:val="standardContextual"/>
             </w:rPr>
           </w:pPr>
-          <w:hyperlink w:anchor="_Toc244135763" w:history="1">
+          <w:hyperlink w:anchor="_Toc244137041" w:history="1">
             <w:r>
               <w:rPr>
                 <w:rStyle w:val="Hyperlink"/>
@@ -1351,7 +1351,7 @@
               <w:rPr>
                 <w:noProof/>
               </w:rPr>
-              <w:instrText xml:space="preserve"> PAGEREF _Toc244135763 \h </w:instrText>
+              <w:instrText xml:space="preserve"> PAGEREF _Toc244137041 \h </w:instrText>
             </w:r>
             <w:r>
               <w:rPr>
@@ -1368,7 +1368,7 @@
               <w:rPr>
                 <w:noProof/>
               </w:rPr>
-              <w:t>22</w:t>
+              <w:t>23</w:t>
             </w:r>
             <w:r>
               <w:rPr>
@@ -1393,7 +1393,7 @@
               <w14:ligatures w14:val="standardContextual"/>
             </w:rPr>
           </w:pPr>
-          <w:hyperlink w:anchor="_Toc244135764" w:history="1">
+          <w:hyperlink w:anchor="_Toc244137042" w:history="1">
             <w:r>
               <w:rPr>
                 <w:rStyle w:val="Hyperlink"/>
@@ -1417,7 +1417,7 @@
               <w:rPr>
                 <w:noProof/>
               </w:rPr>
-              <w:instrText xml:space="preserve"> PAGEREF _Toc244135764 \h </w:instrText>
+              <w:instrText xml:space="preserve"> PAGEREF _Toc244137042 \h </w:instrText>
             </w:r>
             <w:r>
               <w:rPr>
@@ -1459,7 +1459,7 @@
               <w14:ligatures w14:val="standardContextual"/>
             </w:rPr>
           </w:pPr>
-          <w:hyperlink w:anchor="_Toc244135765" w:history="1">
+          <w:hyperlink w:anchor="_Toc244137043" w:history="1">
             <w:r>
               <w:rPr>
                 <w:rStyle w:val="Hyperlink"/>
@@ -1483,7 +1483,7 @@
               <w:rPr>
                 <w:noProof/>
               </w:rPr>
-              <w:instrText xml:space="preserve"> PAGEREF _Toc244135765 \h </w:instrText>
+              <w:instrText xml:space="preserve"> PAGEREF _Toc244137043 \h </w:instrText>
             </w:r>
             <w:r>
               <w:rPr>
@@ -1526,7 +1526,7 @@
       <w:pPr>
         <w:pStyle w:val="Heading1"/>
       </w:pPr>
-      <w:bookmarkStart w:id="0" w:name="_Toc244135745"/>
+      <w:bookmarkStart w:id="0" w:name="_Toc244137023"/>
       <w:r>
         <w:t>1. Что это и как работает</w:t>
       </w:r>
@@ -2429,7 +2429,7 @@
       <w:pPr>
         <w:pStyle w:val="Heading1"/>
       </w:pPr>
-      <w:bookmarkStart w:id="1" w:name="_Toc244135746"/>
+      <w:bookmarkStart w:id="1" w:name="_Toc244137024"/>
       <w:r>
         <w:t>2. Запуск одной кнопкой</w:t>
       </w:r>
@@ -2665,7 +2665,7 @@
       <w:pPr>
         <w:pStyle w:val="Heading1"/>
       </w:pPr>
-      <w:bookmarkStart w:id="2" w:name="_Toc244135747"/>
+      <w:bookmarkStart w:id="2" w:name="_Toc244137025"/>
       <w:r>
         <w:t>3. Где хранится проект — все файлы</w:t>
       </w:r>
@@ -3747,7 +3747,7 @@
       <w:pPr>
         <w:pStyle w:val="Heading1"/>
       </w:pPr>
-      <w:bookmarkStart w:id="3" w:name="_Toc244135748"/>
+      <w:bookmarkStart w:id="3" w:name="_Toc244137026"/>
       <w:r>
         <w:t>4. Что сделано и что осталось</w:t>
       </w:r>
@@ -4622,7 +4622,7 @@
       <w:pPr>
         <w:pStyle w:val="Heading1"/>
       </w:pPr>
-      <w:bookmarkStart w:id="4" w:name="_Toc244135749"/>
+      <w:bookmarkStart w:id="4" w:name="_Toc244137027"/>
       <w:r>
         <w:t>5. Ниша: что выбрано и почему</w:t>
       </w:r>
@@ -4824,7 +4824,7 @@
       <w:pPr>
         <w:pStyle w:val="Heading1"/>
       </w:pPr>
-      <w:bookmarkStart w:id="5" w:name="_Toc244135750"/>
+      <w:bookmarkStart w:id="5" w:name="_Toc244137028"/>
       <w:r>
         <w:t>6. Как строится сценарий</w:t>
       </w:r>
@@ -5774,7 +5774,7 @@
       <w:pPr>
         <w:pStyle w:val="Heading1"/>
       </w:pPr>
-      <w:bookmarkStart w:id="6" w:name="_Toc244135751"/>
+      <w:bookmarkStart w:id="6" w:name="_Toc244137029"/>
       <w:r>
         <w:t>7. Картинки: бесплатно</w:t>
       </w:r>
@@ -5921,7 +5921,7 @@
           </w:tcPr>
           <w:p>
             <w:r>
-              <w:t xml:space="preserve">Автоматически. Бесплатно 10 000 «нейронов» в сутки на все каналы вместе. Одна картинка стоит около 200 нейронов (при 5 шагах качества), то есть ≈ 50 картинок ≈ 8 роликов в день. Лимит обнуляется в </w:t>
+              <w:t xml:space="preserve">Автоматически. Бесплатно 10 000 «нейронов» в сутки на все каналы вместе. Одна картинка стоит около 165 нейронов (при 4 шагах качества), то есть ≈ 60 картинок ≈ 10 роликов в день. По документации Cloudflare лимит обнуляется в </w:t>
             </w:r>
             <w:r>
               <w:rPr>
@@ -6174,7 +6174,7 @@
         <w:t xml:space="preserve"> </w:t>
       </w:r>
       <w:r>
-        <w:t xml:space="preserve">Если в Telegram пришло «⚠ FLUX pictures stopped working», значит, дневной лимит кончился (обычно из-за большого числа тестовых роликов). Это не поломка: ролик всё равно делается — с фото или карточками с цифрами. Лимит обнуляется в </w:t>
+        <w:t xml:space="preserve">Если в Telegram пришло «⚠ FLUX pictures stopped working», значит, дневной лимит кончился (обычно из-за большого числа тестовых роликов). Это не поломка: ролик всё равно делается — с фото или карточками с цифрами. По документации лимит обнуляется в </w:t>
       </w:r>
       <w:r>
         <w:rPr>
@@ -6184,7 +6184,26 @@
         <w:t>00:00 UTC</w:t>
       </w:r>
       <w:r>
-        <w:t>, но на деле Cloudflare может отказывать ещё примерно час после полуночи, хотя панель уже показывает «0/10k today». У готового ролика картинки можно заменить вручную (ниже).</w:t>
+        <w:t>, но 29.10 Cloudflare отказывал и после полуночи UTC, хотя панель показывала всего около 2k из 10k. Поэтому точное время, когда картинки вернутся, заранее не известно. Ролик в любом случае не срывается, а картинки у готового ролика можно перерисовать позже или заменить вручную (ниже).</w:t>
+      </w:r>
+    </w:p>
+    <w:p>
+      <w:pPr>
+        <w:pBdr>
+          <w:left w:val="single" w:sz="24" w:space="8" w:color="3EA6FF"/>
+        </w:pBdr>
+        <w:shd w:val="clear" w:color="auto" w:fill="E8F3FF"/>
+        <w:spacing w:before="80" w:after="160"/>
+        <w:ind w:left="200" w:right="100"/>
+      </w:pPr>
+      <w:r>
+        <w:t>💡</w:t>
+      </w:r>
+      <w:r>
+        <w:t xml:space="preserve"> </w:t>
+      </w:r>
+      <w:r>
+        <w:t>Модель FLUX в Cloudflare принимает только два параметра: текст запроса (промпт) и число шагов. Размер всегда 1024×1024, ролик обрезает картинку до вертикали 9:16. Ширину, высоту или seed задать нельзя — Cloudflare отклоняет такой запрос (проверено 29.10).</w:t>
       </w:r>
     </w:p>
     <w:p>
@@ -6229,10 +6248,30 @@
           <w:b/>
           <w:bCs/>
         </w:rPr>
-        <w:t>Меньше шагов FLUX</w:t>
-      </w:r>
-      <w:r>
-        <w:t>: Settings → Picture → FLUX quality steps. Сейчас стоит 5 (было 6): картинка стоит около 200 нейронов вместо 220. При 4 шагах — ещё примерно на 15–20% дешевле, детализация чуть ниже.</w:t>
+        <w:t>Шаги FLUX уже снижены до 4</w:t>
+      </w:r>
+      <w:r>
+        <w:t xml:space="preserve"> (было 6): FLUX.1 schnell обучена работать за 1–4 шага, поэтому для наших сцен (3–5 секунд на телефоне, с затемнением и цифрами поверх) картинка практически та же, а стоит около 165 нейронов вместо 220.</w:t>
+      </w:r>
+    </w:p>
+    <w:p>
+      <w:pPr>
+        <w:pStyle w:val="ListParagraph"/>
+        <w:numPr>
+          <w:ilvl w:val="0"/>
+          <w:numId w:val="3"/>
+        </w:numPr>
+        <w:spacing w:after="60"/>
+      </w:pPr>
+      <w:r>
+        <w:rPr>
+          <w:b/>
+          <w:bCs/>
+        </w:rPr>
+        <w:t>Не делать лишних тестовых картинок</w:t>
+      </w:r>
+      <w:r>
+        <w:t>: проверки и пересборки тоже тратят общий лимит всех каналов.</w:t>
       </w:r>
     </w:p>
     <w:p>
@@ -6493,7 +6532,7 @@
       <w:pPr>
         <w:pStyle w:val="Heading1"/>
       </w:pPr>
-      <w:bookmarkStart w:id="7" w:name="_Toc244135752"/>
+      <w:bookmarkStart w:id="7" w:name="_Toc244137030"/>
       <w:r>
         <w:t>8. Создать ролик вручную и версии для A/B-теста</w:t>
       </w:r>
@@ -6869,7 +6908,7 @@
       <w:pPr>
         <w:pStyle w:val="Heading1"/>
       </w:pPr>
-      <w:bookmarkStart w:id="8" w:name="_Toc244135753"/>
+      <w:bookmarkStart w:id="8" w:name="_Toc244137031"/>
       <w:r>
         <w:t>9. Настройки в Студии (Settings)</w:t>
       </w:r>
@@ -7176,7 +7215,7 @@
           </w:tcPr>
           <w:p>
             <w:r>
-              <w:t>Крупная цифра вкл/выкл и её цвет, цвет плашки серии, затемнение, сила движения камеры, источник картинок, стиль AI-картинок, проверка промптов, качество FLUX (FLUX quality steps, по умолчанию 5: меньше — дешевле, но чуть меньше деталей)</w:t>
+              <w:t>Крупная цифра вкл/выкл и её цвет, цвет плашки серии, затемнение, сила движения камеры, источник картинок, стиль AI-картинок, проверка промптов, качество FLUX (FLUX quality steps, по умолчанию 4 — столько, сколько нужно модели schnell; каждый лишний шаг стоит нейронов)</w:t>
             </w:r>
           </w:p>
         </w:tc>
@@ -7435,7 +7474,7 @@
       <w:pPr>
         <w:pStyle w:val="Heading1"/>
       </w:pPr>
-      <w:bookmarkStart w:id="9" w:name="_Toc244135754"/>
+      <w:bookmarkStart w:id="9" w:name="_Toc244137032"/>
       <w:r>
         <w:t>10. Соцсети: вход, выход, смена аккаунта</w:t>
       </w:r>
@@ -7692,10 +7731,7 @@
         <w:t>✅</w:t>
       </w:r>
       <w:r>
-        <w:t xml:space="preserve"> </w:t>
-      </w:r>
-      <w:r>
-        <w:t xml:space="preserve">Уже подключено: канал </w:t>
+        <w:t xml:space="preserve"> Уже подключено: канал </w:t>
       </w:r>
       <w:r>
         <w:rPr>
@@ -8810,17 +8846,14 @@
         <w:t>⚠</w:t>
       </w:r>
       <w:r>
-        <w:t xml:space="preserve"> </w:t>
-      </w:r>
-      <w:r>
-        <w:t>Загрузка видео через X API может требовать платного тарифа X. Если X ответит ошибкой доступа — это тариф, а не Vid Studio.</w:t>
+        <w:t xml:space="preserve"> Загрузка видео через X API может требовать платного тарифа X. Если X ответит ошибкой доступа — это тариф, а не Vid Studio.</w:t>
       </w:r>
     </w:p>
     <w:p>
       <w:pPr>
         <w:pStyle w:val="Heading1"/>
       </w:pPr>
-      <w:bookmarkStart w:id="10" w:name="_Toc244135755"/>
+      <w:bookmarkStart w:id="10" w:name="_Toc244137033"/>
       <w:r>
         <w:t>11. Публикация и n8n</w:t>
       </w:r>
@@ -8847,7 +8880,10 @@
         <w:t>✅</w:t>
       </w:r>
       <w:r>
-        <w:t xml:space="preserve"> Уже сделано: вход владельца создан, workflow «VidAuto: Make &amp; Publish» опубликован (статус </w:t>
+        <w:t xml:space="preserve"> </w:t>
+      </w:r>
+      <w:r>
+        <w:t xml:space="preserve">Уже сделано: вход владельца создан, workflow «VidAuto: Make &amp; Publish» опубликован (статус </w:t>
       </w:r>
       <w:r>
         <w:rPr>
@@ -9491,7 +9527,7 @@
       <w:pPr>
         <w:pStyle w:val="Heading1"/>
       </w:pPr>
-      <w:bookmarkStart w:id="11" w:name="_Toc244135756"/>
+      <w:bookmarkStart w:id="11" w:name="_Toc244137034"/>
       <w:r>
         <w:t>12. Заработок и монетизация (Earnings)</w:t>
       </w:r>
@@ -9971,10 +10007,7 @@
         <w:t>⚠</w:t>
       </w:r>
       <w:r>
-        <w:t xml:space="preserve"> </w:t>
-      </w:r>
-      <w:r>
-        <w:t xml:space="preserve">Доход YouTube появится только после вступления в партнёрскую программу. Статистика приходит с задержкой 1–2 дня. Если YouTube был подключён до этой версии — нажмите в Accounts </w:t>
+        <w:t xml:space="preserve"> Доход YouTube появится только после вступления в партнёрскую программу. Статистика приходит с задержкой 1–2 дня. Если YouTube был подключён до этой версии — нажмите в Accounts </w:t>
       </w:r>
       <w:r>
         <w:rPr>
@@ -10116,7 +10149,7 @@
       <w:pPr>
         <w:pStyle w:val="Heading1"/>
       </w:pPr>
-      <w:bookmarkStart w:id="12" w:name="_Toc244135757"/>
+      <w:bookmarkStart w:id="12" w:name="_Toc244137035"/>
       <w:r>
         <w:t>13. Очередь тем, проверка фактов, обложки, Telegram, итоги A/B</w:t>
       </w:r>
@@ -10639,7 +10672,10 @@
         <w:t>✅</w:t>
       </w:r>
       <w:r>
-        <w:t xml:space="preserve"> Все 397 тем уже проверены: около 19 исправлено, сомнительных нет. При переименовании отметка снимается, и тему можно проверить заново. Выключить проверку: </w:t>
+        <w:t xml:space="preserve"> </w:t>
+      </w:r>
+      <w:r>
+        <w:t xml:space="preserve">Все 397 тем уже проверены: около 19 исправлено, сомнительных нет. При переименовании отметка снимается, и тему можно проверить заново. Выключить проверку: </w:t>
       </w:r>
       <w:r>
         <w:rPr>
@@ -10665,10 +10701,7 @@
         <w:t>💡</w:t>
       </w:r>
       <w:r>
-        <w:t xml:space="preserve"> </w:t>
-      </w:r>
-      <w:r>
-        <w:t xml:space="preserve">Продолжение истории, разбитой на части, всегда идёт раньше очереди. Отключить очередь: </w:t>
+        <w:t xml:space="preserve"> Продолжение истории, разбитой на части, всегда идёт раньше очереди. Отключить очередь: </w:t>
       </w:r>
       <w:r>
         <w:rPr>
@@ -12296,7 +12329,7 @@
       <w:pPr>
         <w:pStyle w:val="Heading1"/>
       </w:pPr>
-      <w:bookmarkStart w:id="13" w:name="_Toc244135758"/>
+      <w:bookmarkStart w:id="13" w:name="_Toc244137036"/>
       <w:r>
         <w:t>14. Включить автопилот и настроить Windows</w:t>
       </w:r>
@@ -12764,7 +12797,7 @@
       <w:pPr>
         <w:pStyle w:val="Heading1"/>
       </w:pPr>
-      <w:bookmarkStart w:id="14" w:name="_Toc244135759"/>
+      <w:bookmarkStart w:id="14" w:name="_Toc244137037"/>
       <w:r>
         <w:t>15. Музыка и звуки</w:t>
       </w:r>
@@ -12912,7 +12945,7 @@
       <w:pPr>
         <w:pStyle w:val="Heading1"/>
       </w:pPr>
-      <w:bookmarkStart w:id="15" w:name="_Toc244135760"/>
+      <w:bookmarkStart w:id="15" w:name="_Toc244137038"/>
       <w:r>
         <w:t>16. Озвучка</w:t>
       </w:r>
@@ -13010,7 +13043,7 @@
       <w:pPr>
         <w:pStyle w:val="Heading1"/>
       </w:pPr>
-      <w:bookmarkStart w:id="16" w:name="_Toc244135761"/>
+      <w:bookmarkStart w:id="16" w:name="_Toc244137039"/>
       <w:r>
         <w:t>17. Ключ Gemini и платные возможности</w:t>
       </w:r>
@@ -13153,7 +13186,7 @@
       <w:pPr>
         <w:pStyle w:val="Heading1"/>
       </w:pPr>
-      <w:bookmarkStart w:id="17" w:name="_Toc244135762"/>
+      <w:bookmarkStart w:id="17" w:name="_Toc244137040"/>
       <w:r>
         <w:t>18. Что осталось в .env</w:t>
       </w:r>
@@ -13715,7 +13748,7 @@
       <w:pPr>
         <w:pStyle w:val="Heading1"/>
       </w:pPr>
-      <w:bookmarkStart w:id="18" w:name="_Toc244135763"/>
+      <w:bookmarkStart w:id="18" w:name="_Toc244137041"/>
       <w:r>
         <w:t>19. Советы: что улучшить дальше</w:t>
       </w:r>
@@ -13887,7 +13920,7 @@
       <w:pPr>
         <w:pStyle w:val="Heading1"/>
       </w:pPr>
-      <w:bookmarkStart w:id="19" w:name="_Toc244135764"/>
+      <w:bookmarkStart w:id="19" w:name="_Toc244137042"/>
       <w:r>
         <w:t>20. Если что-то не работает</w:t>
       </w:r>
@@ -14124,7 +14157,7 @@
           </w:tcPr>
           <w:p>
             <w:r>
-              <w:t xml:space="preserve">Кончился дневной лимит Cloudflare (≈ 50 картинок ≈ 8 роликов на все каналы; обнуляется в 00:00 UTC) или неверный токен — проверьте </w:t>
+              <w:t xml:space="preserve">Кончился дневной лимит Cloudflare (≈ 60 картинок ≈ 10 роликов на все каналы) или неверный токен — проверьте </w:t>
             </w:r>
             <w:r>
               <w:rPr>
@@ -14167,7 +14200,7 @@
           </w:tcPr>
           <w:p>
             <w:r>
-              <w:t>Лимит уже обнулился в 00:00 UTC, но Cloudflare применяет это с задержкой — обычно до часа. Подождите: картинки вернутся сами; до этого ролики делаются с фото или карточками</w:t>
+              <w:t>Панель и проверка лимита в Cloudflare расходятся (так было 29.10). Ролики пока делаются с фото или карточками; когда FLUX снова ответит, картинки можно перерисовать</w:t>
             </w:r>
           </w:p>
         </w:tc>
@@ -15080,7 +15113,7 @@
       <w:pPr>
         <w:pStyle w:val="Heading1"/>
       </w:pPr>
-      <w:bookmarkStart w:id="20" w:name="_Toc244135765"/>
+      <w:bookmarkStart w:id="20" w:name="_Toc244137043"/>
       <w:r>
         <w:t>21. Аккаунты Студии и каналы</w:t>
       </w:r>
@@ -15878,7 +15911,7 @@
               <w:t>лимит FLUX</w:t>
             </w:r>
             <w:r>
-              <w:t xml:space="preserve"> — около 50 картинок в сутки на все каналы вместе, это примерно 8 роликов</w:t>
+              <w:t xml:space="preserve"> — около 60 картинок в сутки на все каналы вместе, это примерно 10 роликов</w:t>
             </w:r>
           </w:p>
         </w:tc>
@@ -17821,10 +17854,10 @@
 <file path=word/numbering.xml><?xml version="1.0" encoding="utf-8"?>
 <w:numbering xmlns:wpc="http://schemas.microsoft.com/office/word/2010/wordprocessingCanvas" xmlns:cx="http://schemas.microsoft.com/office/drawing/2014/chartex" xmlns:cx1="http://schemas.microsoft.com/office/drawing/2015/9/8/chartex" xmlns:cx2="http://schemas.microsoft.com/office/drawing/2015/10/21/chartex" xmlns:cx3="http://schemas.microsoft.com/office/drawing/2016/5/9/chartex" xmlns:cx4="http://schemas.microsoft.com/office/drawing/2016/5/10/chartex" xmlns:cx5="http://schemas.microsoft.com/office/drawing/2016/5/11/chartex" xmlns:cx6="http://schemas.microsoft.com/office/drawing/2016/5/12/chartex" xmlns:cx7="http://schemas.microsoft.com/office/drawing/2016/5/13/chartex" xmlns:cx8="http://schemas.microsoft.com/office/drawing/2016/5/14/chartex" xmlns:mc="http://schemas.openxmlformats.org/markup-compatibility/2006" xmlns:aink="http://schemas.microsoft.com/office/drawing/2016/ink" xmlns:am3d="http://schemas.microsoft.com/office/drawing/2017/model3d" xmlns:o="urn:schemas-microsoft-com:office:office" xmlns:oel="http://schemas.microsoft.com/office/2019/extlst" xmlns:r="http://schemas.openxmlformats.org/officeDocument/2006/relationships" xmlns:m="http://schemas.openxmlformats.org/officeDocument/2006/math" xmlns:v="urn:schemas-microsoft-com:vml" xmlns:wp14="http://schemas.microsoft.com/office/word/2010/wordprocessingDrawing" xmlns:wp="http://schemas.openxmlformats.org/drawingml/2006/wordprocessingDrawing" xmlns:w10="urn:schemas-microsoft-com:office:word" xmlns:w="http://schemas.openxmlformats.org/wordprocessingml/2006/main" xmlns:w14="http://schemas.microsoft.com/office/word/2010/wordml" xmlns:w15="http://schemas.microsoft.com/office/word/2012/wordml" xmlns:w16cex="http://schemas.microsoft.com/office/word/2018/wordml/cex" xmlns:w16cid="http://schemas.microsoft.com/office/word/2016/wordml/cid" xmlns:w16="http://schemas.microsoft.com/office/word/2018/wordml" xmlns:w16du="http://schemas.microsoft.com/office/word/2023/wordml/word16du" xmlns:w16sdtdh="http://schemas.microsoft.com/office/word/2020/wordml/sdtdatahash" xmlns:w16sdtfl="http://schemas.microsoft.com/office/word/2024/wordml/sdtformatlock" xmlns:w16se="http://schemas.microsoft.com/office/word/2015/wordml/symex" xmlns:wpg="http://schemas.microsoft.com/office/word/2010/wordprocessingGroup" xmlns:wpi="http://schemas.microsoft.com/office/word/2010/wordprocessingInk" xmlns:wne="http://schemas.microsoft.com/office/word/2006/wordml" xmlns:wps="http://schemas.microsoft.com/office/word/2010/wordprocessingShape" mc:Ignorable="w14 w15 w16se w16cid w16 w16cex w16sdtdh w16sdtfl w16du wp14">
   <w:abstractNum w:abstractNumId="0" w15:restartNumberingAfterBreak="0">
-    <w:nsid w:val="02A23D37"/>
+    <w:nsid w:val="05A12856"/>
     <w:multiLevelType w:val="hybridMultilevel"/>
-    <w:tmpl w:val="4B4ABE20"/>
-    <w:lvl w:ilvl="0" w:tplc="5EE4BDB4">
+    <w:tmpl w:val="25E2A0E6"/>
+    <w:lvl w:ilvl="0" w:tplc="349A729A">
       <w:start w:val="1"/>
       <w:numFmt w:val="decimal"/>
       <w:lvlText w:val="%1."/>
@@ -17833,52 +17866,52 @@
         <w:ind w:left="440" w:hanging="360"/>
       </w:pPr>
     </w:lvl>
-    <w:lvl w:ilvl="1" w:tplc="5162AE00">
+    <w:lvl w:ilvl="1" w:tplc="DAD0EA7C">
       <w:numFmt w:val="decimal"/>
       <w:lvlText w:val=""/>
       <w:lvlJc w:val="left"/>
     </w:lvl>
-    <w:lvl w:ilvl="2" w:tplc="D6285234">
+    <w:lvl w:ilvl="2" w:tplc="5E98781C">
       <w:numFmt w:val="decimal"/>
       <w:lvlText w:val=""/>
       <w:lvlJc w:val="left"/>
     </w:lvl>
-    <w:lvl w:ilvl="3" w:tplc="00D065A0">
+    <w:lvl w:ilvl="3" w:tplc="54BAF878">
       <w:numFmt w:val="decimal"/>
       <w:lvlText w:val=""/>
       <w:lvlJc w:val="left"/>
     </w:lvl>
-    <w:lvl w:ilvl="4" w:tplc="4C026C02">
+    <w:lvl w:ilvl="4" w:tplc="D74C3724">
       <w:numFmt w:val="decimal"/>
       <w:lvlText w:val=""/>
       <w:lvlJc w:val="left"/>
     </w:lvl>
-    <w:lvl w:ilvl="5" w:tplc="0DC21CC6">
+    <w:lvl w:ilvl="5" w:tplc="ED9288C6">
       <w:numFmt w:val="decimal"/>
       <w:lvlText w:val=""/>
       <w:lvlJc w:val="left"/>
     </w:lvl>
-    <w:lvl w:ilvl="6" w:tplc="5C4EA202">
+    <w:lvl w:ilvl="6" w:tplc="A120E73A">
       <w:numFmt w:val="decimal"/>
       <w:lvlText w:val=""/>
       <w:lvlJc w:val="left"/>
     </w:lvl>
-    <w:lvl w:ilvl="7" w:tplc="D5B4173C">
+    <w:lvl w:ilvl="7" w:tplc="6156AB06">
       <w:numFmt w:val="decimal"/>
       <w:lvlText w:val=""/>
       <w:lvlJc w:val="left"/>
     </w:lvl>
-    <w:lvl w:ilvl="8" w:tplc="A0B6DD1C">
+    <w:lvl w:ilvl="8" w:tplc="B590DBDE">
       <w:numFmt w:val="decimal"/>
       <w:lvlText w:val=""/>
       <w:lvlJc w:val="left"/>
     </w:lvl>
   </w:abstractNum>
   <w:abstractNum w:abstractNumId="1" w15:restartNumberingAfterBreak="0">
-    <w:nsid w:val="09EC66E0"/>
+    <w:nsid w:val="071F55AA"/>
     <w:multiLevelType w:val="hybridMultilevel"/>
-    <w:tmpl w:val="D354F94E"/>
-    <w:lvl w:ilvl="0" w:tplc="E326B19C">
+    <w:tmpl w:val="2530F988"/>
+    <w:lvl w:ilvl="0" w:tplc="8A0670FE">
       <w:start w:val="1"/>
       <w:numFmt w:val="decimal"/>
       <w:lvlText w:val="%1."/>
@@ -17887,52 +17920,52 @@
         <w:ind w:left="440" w:hanging="360"/>
       </w:pPr>
     </w:lvl>
-    <w:lvl w:ilvl="1" w:tplc="25F696B4">
+    <w:lvl w:ilvl="1" w:tplc="4392B64C">
       <w:numFmt w:val="decimal"/>
       <w:lvlText w:val=""/>
       <w:lvlJc w:val="left"/>
     </w:lvl>
-    <w:lvl w:ilvl="2" w:tplc="25F488AA">
+    <w:lvl w:ilvl="2" w:tplc="2EFE4068">
       <w:numFmt w:val="decimal"/>
       <w:lvlText w:val=""/>
       <w:lvlJc w:val="left"/>
     </w:lvl>
-    <w:lvl w:ilvl="3" w:tplc="84D8BC7A">
+    <w:lvl w:ilvl="3" w:tplc="2F3ED4D8">
       <w:numFmt w:val="decimal"/>
       <w:lvlText w:val=""/>
       <w:lvlJc w:val="left"/>
     </w:lvl>
-    <w:lvl w:ilvl="4" w:tplc="2EF4C6A6">
+    <w:lvl w:ilvl="4" w:tplc="DED4FB22">
       <w:numFmt w:val="decimal"/>
       <w:lvlText w:val=""/>
       <w:lvlJc w:val="left"/>
     </w:lvl>
-    <w:lvl w:ilvl="5" w:tplc="5838C720">
+    <w:lvl w:ilvl="5" w:tplc="D0D63D0E">
       <w:numFmt w:val="decimal"/>
       <w:lvlText w:val=""/>
       <w:lvlJc w:val="left"/>
     </w:lvl>
-    <w:lvl w:ilvl="6" w:tplc="959AC806">
+    <w:lvl w:ilvl="6" w:tplc="B4A838EA">
       <w:numFmt w:val="decimal"/>
       <w:lvlText w:val=""/>
       <w:lvlJc w:val="left"/>
     </w:lvl>
-    <w:lvl w:ilvl="7" w:tplc="1F569F06">
+    <w:lvl w:ilvl="7" w:tplc="E9DC5BFE">
       <w:numFmt w:val="decimal"/>
       <w:lvlText w:val=""/>
       <w:lvlJc w:val="left"/>
     </w:lvl>
-    <w:lvl w:ilvl="8" w:tplc="368AA14A">
+    <w:lvl w:ilvl="8" w:tplc="A87C4D66">
       <w:numFmt w:val="decimal"/>
       <w:lvlText w:val=""/>
       <w:lvlJc w:val="left"/>
     </w:lvl>
   </w:abstractNum>
   <w:abstractNum w:abstractNumId="2" w15:restartNumberingAfterBreak="0">
-    <w:nsid w:val="13083C91"/>
+    <w:nsid w:val="18BA535F"/>
     <w:multiLevelType w:val="hybridMultilevel"/>
-    <w:tmpl w:val="9A2290EE"/>
-    <w:lvl w:ilvl="0" w:tplc="613C90BE">
+    <w:tmpl w:val="73D05E38"/>
+    <w:lvl w:ilvl="0" w:tplc="1D70DA1A">
       <w:start w:val="1"/>
       <w:numFmt w:val="decimal"/>
       <w:lvlText w:val="%1."/>
@@ -17941,52 +17974,52 @@
         <w:ind w:left="440" w:hanging="360"/>
       </w:pPr>
     </w:lvl>
-    <w:lvl w:ilvl="1" w:tplc="6E06659C">
+    <w:lvl w:ilvl="1" w:tplc="A2FE9B6C">
       <w:numFmt w:val="decimal"/>
       <w:lvlText w:val=""/>
       <w:lvlJc w:val="left"/>
     </w:lvl>
-    <w:lvl w:ilvl="2" w:tplc="6CF6AA64">
+    <w:lvl w:ilvl="2" w:tplc="14F8CB88">
       <w:numFmt w:val="decimal"/>
       <w:lvlText w:val=""/>
       <w:lvlJc w:val="left"/>
     </w:lvl>
-    <w:lvl w:ilvl="3" w:tplc="341699AC">
+    <w:lvl w:ilvl="3" w:tplc="A484C968">
       <w:numFmt w:val="decimal"/>
       <w:lvlText w:val=""/>
       <w:lvlJc w:val="left"/>
     </w:lvl>
-    <w:lvl w:ilvl="4" w:tplc="CE648316">
+    <w:lvl w:ilvl="4" w:tplc="2B5CE39E">
       <w:numFmt w:val="decimal"/>
       <w:lvlText w:val=""/>
       <w:lvlJc w:val="left"/>
     </w:lvl>
-    <w:lvl w:ilvl="5" w:tplc="60982A42">
+    <w:lvl w:ilvl="5" w:tplc="A1FA7AA6">
       <w:numFmt w:val="decimal"/>
       <w:lvlText w:val=""/>
       <w:lvlJc w:val="left"/>
     </w:lvl>
-    <w:lvl w:ilvl="6" w:tplc="9B34C072">
+    <w:lvl w:ilvl="6" w:tplc="B83C8736">
       <w:numFmt w:val="decimal"/>
       <w:lvlText w:val=""/>
       <w:lvlJc w:val="left"/>
     </w:lvl>
-    <w:lvl w:ilvl="7" w:tplc="5B60CBA0">
+    <w:lvl w:ilvl="7" w:tplc="91C4B308">
       <w:numFmt w:val="decimal"/>
       <w:lvlText w:val=""/>
       <w:lvlJc w:val="left"/>
     </w:lvl>
-    <w:lvl w:ilvl="8" w:tplc="5D725142">
+    <w:lvl w:ilvl="8" w:tplc="A8541E38">
       <w:numFmt w:val="decimal"/>
       <w:lvlText w:val=""/>
       <w:lvlJc w:val="left"/>
     </w:lvl>
   </w:abstractNum>
   <w:abstractNum w:abstractNumId="3" w15:restartNumberingAfterBreak="0">
-    <w:nsid w:val="21474A66"/>
+    <w:nsid w:val="19F2048F"/>
     <w:multiLevelType w:val="hybridMultilevel"/>
-    <w:tmpl w:val="E66E8EAC"/>
-    <w:lvl w:ilvl="0" w:tplc="ECC29404">
+    <w:tmpl w:val="26DAD1E0"/>
+    <w:lvl w:ilvl="0" w:tplc="F932977A">
       <w:start w:val="1"/>
       <w:numFmt w:val="decimal"/>
       <w:lvlText w:val="%1."/>
@@ -17995,52 +18028,52 @@
         <w:ind w:left="440" w:hanging="360"/>
       </w:pPr>
     </w:lvl>
-    <w:lvl w:ilvl="1" w:tplc="C91CE108">
+    <w:lvl w:ilvl="1" w:tplc="A8569BD4">
       <w:numFmt w:val="decimal"/>
       <w:lvlText w:val=""/>
       <w:lvlJc w:val="left"/>
     </w:lvl>
-    <w:lvl w:ilvl="2" w:tplc="B0ECF9FE">
+    <w:lvl w:ilvl="2" w:tplc="9CE0AAD4">
       <w:numFmt w:val="decimal"/>
       <w:lvlText w:val=""/>
       <w:lvlJc w:val="left"/>
     </w:lvl>
-    <w:lvl w:ilvl="3" w:tplc="1DC2E0A6">
+    <w:lvl w:ilvl="3" w:tplc="1548E0C0">
       <w:numFmt w:val="decimal"/>
       <w:lvlText w:val=""/>
       <w:lvlJc w:val="left"/>
     </w:lvl>
-    <w:lvl w:ilvl="4" w:tplc="D1AC6576">
+    <w:lvl w:ilvl="4" w:tplc="C1AEA264">
       <w:numFmt w:val="decimal"/>
       <w:lvlText w:val=""/>
       <w:lvlJc w:val="left"/>
     </w:lvl>
-    <w:lvl w:ilvl="5" w:tplc="D90C5B92">
+    <w:lvl w:ilvl="5" w:tplc="76F61C9C">
       <w:numFmt w:val="decimal"/>
       <w:lvlText w:val=""/>
       <w:lvlJc w:val="left"/>
     </w:lvl>
-    <w:lvl w:ilvl="6" w:tplc="68E48B2E">
+    <w:lvl w:ilvl="6" w:tplc="039E0A76">
       <w:numFmt w:val="decimal"/>
       <w:lvlText w:val=""/>
       <w:lvlJc w:val="left"/>
     </w:lvl>
-    <w:lvl w:ilvl="7" w:tplc="D33E7A62">
+    <w:lvl w:ilvl="7" w:tplc="8FFE825C">
       <w:numFmt w:val="decimal"/>
       <w:lvlText w:val=""/>
       <w:lvlJc w:val="left"/>
     </w:lvl>
-    <w:lvl w:ilvl="8" w:tplc="81506596">
+    <w:lvl w:ilvl="8" w:tplc="7F6EFFD4">
       <w:numFmt w:val="decimal"/>
       <w:lvlText w:val=""/>
       <w:lvlJc w:val="left"/>
     </w:lvl>
   </w:abstractNum>
   <w:abstractNum w:abstractNumId="4" w15:restartNumberingAfterBreak="0">
-    <w:nsid w:val="2B2F5FE6"/>
+    <w:nsid w:val="26DB698C"/>
     <w:multiLevelType w:val="hybridMultilevel"/>
-    <w:tmpl w:val="730022C2"/>
-    <w:lvl w:ilvl="0" w:tplc="D9CAB600">
+    <w:tmpl w:val="E29072DC"/>
+    <w:lvl w:ilvl="0" w:tplc="F098A414">
       <w:start w:val="1"/>
       <w:numFmt w:val="decimal"/>
       <w:lvlText w:val="%1."/>
@@ -18049,52 +18082,52 @@
         <w:ind w:left="440" w:hanging="360"/>
       </w:pPr>
     </w:lvl>
-    <w:lvl w:ilvl="1" w:tplc="CE7AB664">
+    <w:lvl w:ilvl="1" w:tplc="093A4E78">
       <w:numFmt w:val="decimal"/>
       <w:lvlText w:val=""/>
       <w:lvlJc w:val="left"/>
     </w:lvl>
-    <w:lvl w:ilvl="2" w:tplc="96E09F5E">
+    <w:lvl w:ilvl="2" w:tplc="B2503620">
       <w:numFmt w:val="decimal"/>
       <w:lvlText w:val=""/>
       <w:lvlJc w:val="left"/>
     </w:lvl>
-    <w:lvl w:ilvl="3" w:tplc="85765E5C">
+    <w:lvl w:ilvl="3" w:tplc="F0D23EA8">
       <w:numFmt w:val="decimal"/>
       <w:lvlText w:val=""/>
       <w:lvlJc w:val="left"/>
     </w:lvl>
-    <w:lvl w:ilvl="4" w:tplc="58DA0E08">
+    <w:lvl w:ilvl="4" w:tplc="3EBC3CAA">
       <w:numFmt w:val="decimal"/>
       <w:lvlText w:val=""/>
       <w:lvlJc w:val="left"/>
     </w:lvl>
-    <w:lvl w:ilvl="5" w:tplc="9CB8B63A">
+    <w:lvl w:ilvl="5" w:tplc="C78A781A">
       <w:numFmt w:val="decimal"/>
       <w:lvlText w:val=""/>
       <w:lvlJc w:val="left"/>
     </w:lvl>
-    <w:lvl w:ilvl="6" w:tplc="865C1A10">
+    <w:lvl w:ilvl="6" w:tplc="00CC0C9E">
       <w:numFmt w:val="decimal"/>
       <w:lvlText w:val=""/>
       <w:lvlJc w:val="left"/>
     </w:lvl>
-    <w:lvl w:ilvl="7" w:tplc="29BC761E">
+    <w:lvl w:ilvl="7" w:tplc="87043F5C">
       <w:numFmt w:val="decimal"/>
       <w:lvlText w:val=""/>
       <w:lvlJc w:val="left"/>
     </w:lvl>
-    <w:lvl w:ilvl="8" w:tplc="F626BD3A">
+    <w:lvl w:ilvl="8" w:tplc="26D07454">
       <w:numFmt w:val="decimal"/>
       <w:lvlText w:val=""/>
       <w:lvlJc w:val="left"/>
     </w:lvl>
   </w:abstractNum>
   <w:abstractNum w:abstractNumId="5" w15:restartNumberingAfterBreak="0">
-    <w:nsid w:val="3FD7668A"/>
+    <w:nsid w:val="291300C5"/>
     <w:multiLevelType w:val="hybridMultilevel"/>
-    <w:tmpl w:val="35E875C0"/>
-    <w:lvl w:ilvl="0" w:tplc="A3C07BDE">
+    <w:tmpl w:val="53E6046E"/>
+    <w:lvl w:ilvl="0" w:tplc="3A08C780">
       <w:start w:val="1"/>
       <w:numFmt w:val="decimal"/>
       <w:lvlText w:val="%1."/>
@@ -18103,138 +18136,52 @@
         <w:ind w:left="440" w:hanging="360"/>
       </w:pPr>
     </w:lvl>
-    <w:lvl w:ilvl="1" w:tplc="4F500BCE">
+    <w:lvl w:ilvl="1" w:tplc="1DBAF094">
       <w:numFmt w:val="decimal"/>
       <w:lvlText w:val=""/>
       <w:lvlJc w:val="left"/>
     </w:lvl>
-    <w:lvl w:ilvl="2" w:tplc="21CACB64">
+    <w:lvl w:ilvl="2" w:tplc="F0266A86">
       <w:numFmt w:val="decimal"/>
       <w:lvlText w:val=""/>
       <w:lvlJc w:val="left"/>
     </w:lvl>
-    <w:lvl w:ilvl="3" w:tplc="55C833AA">
+    <w:lvl w:ilvl="3" w:tplc="305A4710">
       <w:numFmt w:val="decimal"/>
       <w:lvlText w:val=""/>
       <w:lvlJc w:val="left"/>
     </w:lvl>
-    <w:lvl w:ilvl="4" w:tplc="7B8ABB00">
+    <w:lvl w:ilvl="4" w:tplc="B29A646C">
       <w:numFmt w:val="decimal"/>
       <w:lvlText w:val=""/>
       <w:lvlJc w:val="left"/>
     </w:lvl>
-    <w:lvl w:ilvl="5" w:tplc="5E22B8A0">
+    <w:lvl w:ilvl="5" w:tplc="2424F1CE">
       <w:numFmt w:val="decimal"/>
       <w:lvlText w:val=""/>
       <w:lvlJc w:val="left"/>
     </w:lvl>
-    <w:lvl w:ilvl="6" w:tplc="6CFC7D76">
+    <w:lvl w:ilvl="6" w:tplc="1778CA82">
       <w:numFmt w:val="decimal"/>
       <w:lvlText w:val=""/>
       <w:lvlJc w:val="left"/>
     </w:lvl>
-    <w:lvl w:ilvl="7" w:tplc="7AE87C8E">
+    <w:lvl w:ilvl="7" w:tplc="8DFEF4A0">
       <w:numFmt w:val="decimal"/>
       <w:lvlText w:val=""/>
       <w:lvlJc w:val="left"/>
     </w:lvl>
-    <w:lvl w:ilvl="8" w:tplc="DE62F2EA">
+    <w:lvl w:ilvl="8" w:tplc="4720095E">
       <w:numFmt w:val="decimal"/>
       <w:lvlText w:val=""/>
       <w:lvlJc w:val="left"/>
     </w:lvl>
   </w:abstractNum>
   <w:abstractNum w:abstractNumId="6" w15:restartNumberingAfterBreak="0">
-    <w:nsid w:val="41A110B5"/>
+    <w:nsid w:val="38D91B8B"/>
     <w:multiLevelType w:val="hybridMultilevel"/>
-    <w:tmpl w:val="1F740B76"/>
-    <w:lvl w:ilvl="0" w:tplc="05FE513E" w:tentative="1">
-      <w:start w:val="1"/>
-      <w:numFmt w:val="bullet"/>
-      <w:lvlText w:val="●"/>
-      <w:lvlJc w:val="left"/>
-      <w:pPr>
-        <w:ind w:left="720" w:hanging="360"/>
-      </w:pPr>
-    </w:lvl>
-    <w:lvl w:ilvl="1" w:tplc="38883ABA" w:tentative="1">
-      <w:start w:val="1"/>
-      <w:numFmt w:val="bullet"/>
-      <w:lvlText w:val="○"/>
-      <w:lvlJc w:val="left"/>
-      <w:pPr>
-        <w:ind w:left="1440" w:hanging="360"/>
-      </w:pPr>
-    </w:lvl>
-    <w:lvl w:ilvl="2" w:tplc="3E1C42AC" w:tentative="1">
-      <w:start w:val="1"/>
-      <w:numFmt w:val="bullet"/>
-      <w:lvlText w:val="■"/>
-      <w:lvlJc w:val="left"/>
-      <w:pPr>
-        <w:ind w:left="2160" w:hanging="360"/>
-      </w:pPr>
-    </w:lvl>
-    <w:lvl w:ilvl="3" w:tplc="28E4F6A4" w:tentative="1">
-      <w:start w:val="1"/>
-      <w:numFmt w:val="bullet"/>
-      <w:lvlText w:val="●"/>
-      <w:lvlJc w:val="left"/>
-      <w:pPr>
-        <w:ind w:left="2880" w:hanging="360"/>
-      </w:pPr>
-    </w:lvl>
-    <w:lvl w:ilvl="4" w:tplc="90D024D0" w:tentative="1">
-      <w:start w:val="1"/>
-      <w:numFmt w:val="bullet"/>
-      <w:lvlText w:val="○"/>
-      <w:lvlJc w:val="left"/>
-      <w:pPr>
-        <w:ind w:left="3600" w:hanging="360"/>
-      </w:pPr>
-    </w:lvl>
-    <w:lvl w:ilvl="5" w:tplc="B3540F82" w:tentative="1">
-      <w:start w:val="1"/>
-      <w:numFmt w:val="bullet"/>
-      <w:lvlText w:val="■"/>
-      <w:lvlJc w:val="left"/>
-      <w:pPr>
-        <w:ind w:left="4320" w:hanging="360"/>
-      </w:pPr>
-    </w:lvl>
-    <w:lvl w:ilvl="6" w:tplc="5316E8D4" w:tentative="1">
-      <w:start w:val="1"/>
-      <w:numFmt w:val="bullet"/>
-      <w:lvlText w:val="●"/>
-      <w:lvlJc w:val="left"/>
-      <w:pPr>
-        <w:ind w:left="5040" w:hanging="360"/>
-      </w:pPr>
-    </w:lvl>
-    <w:lvl w:ilvl="7" w:tplc="B40CABB4" w:tentative="1">
-      <w:start w:val="1"/>
-      <w:numFmt w:val="bullet"/>
-      <w:lvlText w:val="●"/>
-      <w:lvlJc w:val="left"/>
-      <w:pPr>
-        <w:ind w:left="5760" w:hanging="360"/>
-      </w:pPr>
-    </w:lvl>
-    <w:lvl w:ilvl="8" w:tplc="94F2B37E" w:tentative="1">
-      <w:start w:val="1"/>
-      <w:numFmt w:val="bullet"/>
-      <w:lvlText w:val="●"/>
-      <w:lvlJc w:val="left"/>
-      <w:pPr>
-        <w:ind w:left="6480" w:hanging="360"/>
-      </w:pPr>
-    </w:lvl>
-  </w:abstractNum>
-  <w:abstractNum w:abstractNumId="7" w15:restartNumberingAfterBreak="0">
-    <w:nsid w:val="56647DD1"/>
-    <w:multiLevelType w:val="hybridMultilevel"/>
-    <w:tmpl w:val="0EFC19BE"/>
-    <w:lvl w:ilvl="0" w:tplc="EDDCC884">
+    <w:tmpl w:val="C7325278"/>
+    <w:lvl w:ilvl="0" w:tplc="4C4A0B7C">
       <w:start w:val="1"/>
       <w:numFmt w:val="decimal"/>
       <w:lvlText w:val="%1."/>
@@ -18243,106 +18190,160 @@
         <w:ind w:left="440" w:hanging="360"/>
       </w:pPr>
     </w:lvl>
-    <w:lvl w:ilvl="1" w:tplc="F7341562">
+    <w:lvl w:ilvl="1" w:tplc="F7B6C490">
       <w:numFmt w:val="decimal"/>
       <w:lvlText w:val=""/>
       <w:lvlJc w:val="left"/>
     </w:lvl>
-    <w:lvl w:ilvl="2" w:tplc="CEB4547C">
+    <w:lvl w:ilvl="2" w:tplc="626AE4F4">
       <w:numFmt w:val="decimal"/>
       <w:lvlText w:val=""/>
       <w:lvlJc w:val="left"/>
     </w:lvl>
-    <w:lvl w:ilvl="3" w:tplc="A0B2451A">
+    <w:lvl w:ilvl="3" w:tplc="F9E2EBAE">
       <w:numFmt w:val="decimal"/>
       <w:lvlText w:val=""/>
       <w:lvlJc w:val="left"/>
     </w:lvl>
-    <w:lvl w:ilvl="4" w:tplc="7400A34C">
+    <w:lvl w:ilvl="4" w:tplc="199CDD22">
       <w:numFmt w:val="decimal"/>
       <w:lvlText w:val=""/>
       <w:lvlJc w:val="left"/>
     </w:lvl>
-    <w:lvl w:ilvl="5" w:tplc="44CA44B2">
+    <w:lvl w:ilvl="5" w:tplc="0074A4B2">
       <w:numFmt w:val="decimal"/>
       <w:lvlText w:val=""/>
       <w:lvlJc w:val="left"/>
     </w:lvl>
-    <w:lvl w:ilvl="6" w:tplc="C0BEDF9A">
+    <w:lvl w:ilvl="6" w:tplc="DCD6AD10">
       <w:numFmt w:val="decimal"/>
       <w:lvlText w:val=""/>
       <w:lvlJc w:val="left"/>
     </w:lvl>
-    <w:lvl w:ilvl="7" w:tplc="B186D6EA">
+    <w:lvl w:ilvl="7" w:tplc="BCE42F64">
       <w:numFmt w:val="decimal"/>
       <w:lvlText w:val=""/>
       <w:lvlJc w:val="left"/>
     </w:lvl>
-    <w:lvl w:ilvl="8" w:tplc="4B7897F6">
+    <w:lvl w:ilvl="8" w:tplc="85580F9E">
+      <w:numFmt w:val="decimal"/>
+      <w:lvlText w:val=""/>
+      <w:lvlJc w:val="left"/>
+    </w:lvl>
+  </w:abstractNum>
+  <w:abstractNum w:abstractNumId="7" w15:restartNumberingAfterBreak="0">
+    <w:nsid w:val="3A162F53"/>
+    <w:multiLevelType w:val="hybridMultilevel"/>
+    <w:tmpl w:val="753873F6"/>
+    <w:lvl w:ilvl="0" w:tplc="2BB048E6">
+      <w:start w:val="1"/>
+      <w:numFmt w:val="decimal"/>
+      <w:lvlText w:val="%1."/>
+      <w:lvlJc w:val="left"/>
+      <w:pPr>
+        <w:ind w:left="440" w:hanging="360"/>
+      </w:pPr>
+    </w:lvl>
+    <w:lvl w:ilvl="1" w:tplc="F006AF34">
+      <w:numFmt w:val="decimal"/>
+      <w:lvlText w:val=""/>
+      <w:lvlJc w:val="left"/>
+    </w:lvl>
+    <w:lvl w:ilvl="2" w:tplc="093CBFB4">
+      <w:numFmt w:val="decimal"/>
+      <w:lvlText w:val=""/>
+      <w:lvlJc w:val="left"/>
+    </w:lvl>
+    <w:lvl w:ilvl="3" w:tplc="DFD6D51C">
+      <w:numFmt w:val="decimal"/>
+      <w:lvlText w:val=""/>
+      <w:lvlJc w:val="left"/>
+    </w:lvl>
+    <w:lvl w:ilvl="4" w:tplc="0E3A385C">
+      <w:numFmt w:val="decimal"/>
+      <w:lvlText w:val=""/>
+      <w:lvlJc w:val="left"/>
+    </w:lvl>
+    <w:lvl w:ilvl="5" w:tplc="AF7CDA50">
+      <w:numFmt w:val="decimal"/>
+      <w:lvlText w:val=""/>
+      <w:lvlJc w:val="left"/>
+    </w:lvl>
+    <w:lvl w:ilvl="6" w:tplc="B8A8A3EC">
+      <w:numFmt w:val="decimal"/>
+      <w:lvlText w:val=""/>
+      <w:lvlJc w:val="left"/>
+    </w:lvl>
+    <w:lvl w:ilvl="7" w:tplc="4146842E">
+      <w:numFmt w:val="decimal"/>
+      <w:lvlText w:val=""/>
+      <w:lvlJc w:val="left"/>
+    </w:lvl>
+    <w:lvl w:ilvl="8" w:tplc="80E2CD1A">
       <w:numFmt w:val="decimal"/>
       <w:lvlText w:val=""/>
       <w:lvlJc w:val="left"/>
     </w:lvl>
   </w:abstractNum>
   <w:abstractNum w:abstractNumId="8" w15:restartNumberingAfterBreak="0">
-    <w:nsid w:val="5E5828E8"/>
+    <w:nsid w:val="3E1447E3"/>
     <w:multiLevelType w:val="hybridMultilevel"/>
-    <w:tmpl w:val="EB4C6464"/>
-    <w:lvl w:ilvl="0" w:tplc="E998EE2E">
+    <w:tmpl w:val="26B445D6"/>
+    <w:lvl w:ilvl="0" w:tplc="83723DA4">
       <w:start w:val="1"/>
-      <w:numFmt w:val="bullet"/>
-      <w:lvlText w:val="•"/>
+      <w:numFmt w:val="decimal"/>
+      <w:lvlText w:val="%1."/>
       <w:lvlJc w:val="left"/>
       <w:pPr>
-        <w:ind w:left="440" w:hanging="280"/>
+        <w:ind w:left="440" w:hanging="360"/>
       </w:pPr>
     </w:lvl>
-    <w:lvl w:ilvl="1" w:tplc="F834658E">
+    <w:lvl w:ilvl="1" w:tplc="1F986DD2">
       <w:numFmt w:val="decimal"/>
       <w:lvlText w:val=""/>
       <w:lvlJc w:val="left"/>
     </w:lvl>
-    <w:lvl w:ilvl="2" w:tplc="80AEF0C8">
+    <w:lvl w:ilvl="2" w:tplc="6B3A2E80">
       <w:numFmt w:val="decimal"/>
       <w:lvlText w:val=""/>
       <w:lvlJc w:val="left"/>
     </w:lvl>
-    <w:lvl w:ilvl="3" w:tplc="CA78E70A">
+    <w:lvl w:ilvl="3" w:tplc="40FE9DFC">
       <w:numFmt w:val="decimal"/>
       <w:lvlText w:val=""/>
       <w:lvlJc w:val="left"/>
     </w:lvl>
-    <w:lvl w:ilvl="4" w:tplc="FC14525A">
+    <w:lvl w:ilvl="4" w:tplc="35B843F4">
       <w:numFmt w:val="decimal"/>
       <w:lvlText w:val=""/>
       <w:lvlJc w:val="left"/>
     </w:lvl>
-    <w:lvl w:ilvl="5" w:tplc="C100A43E">
+    <w:lvl w:ilvl="5" w:tplc="38B6F9E0">
       <w:numFmt w:val="decimal"/>
       <w:lvlText w:val=""/>
       <w:lvlJc w:val="left"/>
     </w:lvl>
-    <w:lvl w:ilvl="6" w:tplc="7C1005C8">
+    <w:lvl w:ilvl="6" w:tplc="9CBEA028">
       <w:numFmt w:val="decimal"/>
       <w:lvlText w:val=""/>
       <w:lvlJc w:val="left"/>
     </w:lvl>
-    <w:lvl w:ilvl="7" w:tplc="2BBC3466">
+    <w:lvl w:ilvl="7" w:tplc="8BEA10E0">
       <w:numFmt w:val="decimal"/>
       <w:lvlText w:val=""/>
       <w:lvlJc w:val="left"/>
     </w:lvl>
-    <w:lvl w:ilvl="8" w:tplc="A36E629C">
+    <w:lvl w:ilvl="8" w:tplc="DD84BB0C">
       <w:numFmt w:val="decimal"/>
       <w:lvlText w:val=""/>
       <w:lvlJc w:val="left"/>
     </w:lvl>
   </w:abstractNum>
   <w:abstractNum w:abstractNumId="9" w15:restartNumberingAfterBreak="0">
-    <w:nsid w:val="651E0F7E"/>
+    <w:nsid w:val="51171379"/>
     <w:multiLevelType w:val="hybridMultilevel"/>
-    <w:tmpl w:val="24BA77D8"/>
-    <w:lvl w:ilvl="0" w:tplc="2DD49BB6">
+    <w:tmpl w:val="9D9E4A7E"/>
+    <w:lvl w:ilvl="0" w:tplc="2B2E0AAC">
       <w:start w:val="1"/>
       <w:numFmt w:val="decimal"/>
       <w:lvlText w:val="%1."/>
@@ -18351,52 +18352,138 @@
         <w:ind w:left="440" w:hanging="360"/>
       </w:pPr>
     </w:lvl>
-    <w:lvl w:ilvl="1" w:tplc="2AA2077A">
+    <w:lvl w:ilvl="1" w:tplc="D166C5C6">
       <w:numFmt w:val="decimal"/>
       <w:lvlText w:val=""/>
       <w:lvlJc w:val="left"/>
     </w:lvl>
-    <w:lvl w:ilvl="2" w:tplc="31BEA5A6">
+    <w:lvl w:ilvl="2" w:tplc="C748B0EC">
       <w:numFmt w:val="decimal"/>
       <w:lvlText w:val=""/>
       <w:lvlJc w:val="left"/>
     </w:lvl>
-    <w:lvl w:ilvl="3" w:tplc="3C7CD0F6">
+    <w:lvl w:ilvl="3" w:tplc="E8E405F2">
       <w:numFmt w:val="decimal"/>
       <w:lvlText w:val=""/>
       <w:lvlJc w:val="left"/>
     </w:lvl>
-    <w:lvl w:ilvl="4" w:tplc="187805BC">
+    <w:lvl w:ilvl="4" w:tplc="7C92605E">
       <w:numFmt w:val="decimal"/>
       <w:lvlText w:val=""/>
       <w:lvlJc w:val="left"/>
     </w:lvl>
-    <w:lvl w:ilvl="5" w:tplc="74B25710">
+    <w:lvl w:ilvl="5" w:tplc="65920E2E">
       <w:numFmt w:val="decimal"/>
       <w:lvlText w:val=""/>
       <w:lvlJc w:val="left"/>
     </w:lvl>
-    <w:lvl w:ilvl="6" w:tplc="886E80CA">
+    <w:lvl w:ilvl="6" w:tplc="46A6B068">
       <w:numFmt w:val="decimal"/>
       <w:lvlText w:val=""/>
       <w:lvlJc w:val="left"/>
     </w:lvl>
-    <w:lvl w:ilvl="7" w:tplc="3650E854">
+    <w:lvl w:ilvl="7" w:tplc="0F965752">
       <w:numFmt w:val="decimal"/>
       <w:lvlText w:val=""/>
       <w:lvlJc w:val="left"/>
     </w:lvl>
-    <w:lvl w:ilvl="8" w:tplc="8F204D64">
+    <w:lvl w:ilvl="8" w:tplc="420C1C74">
       <w:numFmt w:val="decimal"/>
       <w:lvlText w:val=""/>
       <w:lvlJc w:val="left"/>
     </w:lvl>
   </w:abstractNum>
   <w:abstractNum w:abstractNumId="10" w15:restartNumberingAfterBreak="0">
-    <w:nsid w:val="688D354B"/>
+    <w:nsid w:val="68845E5D"/>
     <w:multiLevelType w:val="hybridMultilevel"/>
-    <w:tmpl w:val="79AACB20"/>
-    <w:lvl w:ilvl="0" w:tplc="0D420A04">
+    <w:tmpl w:val="061CAA94"/>
+    <w:lvl w:ilvl="0" w:tplc="8B3C23B8" w:tentative="1">
+      <w:start w:val="1"/>
+      <w:numFmt w:val="bullet"/>
+      <w:lvlText w:val="●"/>
+      <w:lvlJc w:val="left"/>
+      <w:pPr>
+        <w:ind w:left="720" w:hanging="360"/>
+      </w:pPr>
+    </w:lvl>
+    <w:lvl w:ilvl="1" w:tplc="CCB257FA" w:tentative="1">
+      <w:start w:val="1"/>
+      <w:numFmt w:val="bullet"/>
+      <w:lvlText w:val="○"/>
+      <w:lvlJc w:val="left"/>
+      <w:pPr>
+        <w:ind w:left="1440" w:hanging="360"/>
+      </w:pPr>
+    </w:lvl>
+    <w:lvl w:ilvl="2" w:tplc="8F1CA7AC" w:tentative="1">
+      <w:start w:val="1"/>
+      <w:numFmt w:val="bullet"/>
+      <w:lvlText w:val="■"/>
+      <w:lvlJc w:val="left"/>
+      <w:pPr>
+        <w:ind w:left="2160" w:hanging="360"/>
+      </w:pPr>
+    </w:lvl>
+    <w:lvl w:ilvl="3" w:tplc="EAB25588" w:tentative="1">
+      <w:start w:val="1"/>
+      <w:numFmt w:val="bullet"/>
+      <w:lvlText w:val="●"/>
+      <w:lvlJc w:val="left"/>
+      <w:pPr>
+        <w:ind w:left="2880" w:hanging="360"/>
+      </w:pPr>
+    </w:lvl>
+    <w:lvl w:ilvl="4" w:tplc="B410439A" w:tentative="1">
+      <w:start w:val="1"/>
+      <w:numFmt w:val="bullet"/>
+      <w:lvlText w:val="○"/>
+      <w:lvlJc w:val="left"/>
+      <w:pPr>
+        <w:ind w:left="3600" w:hanging="360"/>
+      </w:pPr>
+    </w:lvl>
+    <w:lvl w:ilvl="5" w:tplc="BA329E62" w:tentative="1">
+      <w:start w:val="1"/>
+      <w:numFmt w:val="bullet"/>
+      <w:lvlText w:val="■"/>
+      <w:lvlJc w:val="left"/>
+      <w:pPr>
+        <w:ind w:left="4320" w:hanging="360"/>
+      </w:pPr>
+    </w:lvl>
+    <w:lvl w:ilvl="6" w:tplc="90DE3882" w:tentative="1">
+      <w:start w:val="1"/>
+      <w:numFmt w:val="bullet"/>
+      <w:lvlText w:val="●"/>
+      <w:lvlJc w:val="left"/>
+      <w:pPr>
+        <w:ind w:left="5040" w:hanging="360"/>
+      </w:pPr>
+    </w:lvl>
+    <w:lvl w:ilvl="7" w:tplc="4EEC4322" w:tentative="1">
+      <w:start w:val="1"/>
+      <w:numFmt w:val="bullet"/>
+      <w:lvlText w:val="●"/>
+      <w:lvlJc w:val="left"/>
+      <w:pPr>
+        <w:ind w:left="5760" w:hanging="360"/>
+      </w:pPr>
+    </w:lvl>
+    <w:lvl w:ilvl="8" w:tplc="00925568" w:tentative="1">
+      <w:start w:val="1"/>
+      <w:numFmt w:val="bullet"/>
+      <w:lvlText w:val="●"/>
+      <w:lvlJc w:val="left"/>
+      <w:pPr>
+        <w:ind w:left="6480" w:hanging="360"/>
+      </w:pPr>
+    </w:lvl>
+  </w:abstractNum>
+  <w:abstractNum w:abstractNumId="11" w15:restartNumberingAfterBreak="0">
+    <w:nsid w:val="68E86A64"/>
+    <w:multiLevelType w:val="hybridMultilevel"/>
+    <w:tmpl w:val="B142D8A6"/>
+    <w:lvl w:ilvl="0" w:tplc="1408CE9A">
       <w:start w:val="1"/>
       <w:numFmt w:val="decimal"/>
       <w:lvlText w:val="%1."/>
@@ -18405,106 +18492,52 @@
         <w:ind w:left="440" w:hanging="360"/>
       </w:pPr>
     </w:lvl>
-    <w:lvl w:ilvl="1" w:tplc="B6BCE888">
+    <w:lvl w:ilvl="1" w:tplc="7AD6E9AA">
       <w:numFmt w:val="decimal"/>
       <w:lvlText w:val=""/>
       <w:lvlJc w:val="left"/>
     </w:lvl>
-    <w:lvl w:ilvl="2" w:tplc="6270EF28">
+    <w:lvl w:ilvl="2" w:tplc="E6A87E34">
       <w:numFmt w:val="decimal"/>
       <w:lvlText w:val=""/>
       <w:lvlJc w:val="left"/>
     </w:lvl>
-    <w:lvl w:ilvl="3" w:tplc="8190F37C">
+    <w:lvl w:ilvl="3" w:tplc="F070BF44">
       <w:numFmt w:val="decimal"/>
       <w:lvlText w:val=""/>
       <w:lvlJc w:val="left"/>
     </w:lvl>
-    <w:lvl w:ilvl="4" w:tplc="A54E13BE">
+    <w:lvl w:ilvl="4" w:tplc="134487AE">
       <w:numFmt w:val="decimal"/>
       <w:lvlText w:val=""/>
       <w:lvlJc w:val="left"/>
     </w:lvl>
-    <w:lvl w:ilvl="5" w:tplc="BF166A14">
+    <w:lvl w:ilvl="5" w:tplc="B644ED36">
       <w:numFmt w:val="decimal"/>
       <w:lvlText w:val=""/>
       <w:lvlJc w:val="left"/>
     </w:lvl>
-    <w:lvl w:ilvl="6" w:tplc="F8CAE01A">
+    <w:lvl w:ilvl="6" w:tplc="B2448A8A">
       <w:numFmt w:val="decimal"/>
       <w:lvlText w:val=""/>
       <w:lvlJc w:val="left"/>
     </w:lvl>
-    <w:lvl w:ilvl="7" w:tplc="04101FBA">
+    <w:lvl w:ilvl="7" w:tplc="794CE070">
       <w:numFmt w:val="decimal"/>
       <w:lvlText w:val=""/>
       <w:lvlJc w:val="left"/>
     </w:lvl>
-    <w:lvl w:ilvl="8" w:tplc="692EA59A">
-      <w:numFmt w:val="decimal"/>
-      <w:lvlText w:val=""/>
-      <w:lvlJc w:val="left"/>
-    </w:lvl>
-  </w:abstractNum>
-  <w:abstractNum w:abstractNumId="11" w15:restartNumberingAfterBreak="0">
-    <w:nsid w:val="6C234BAD"/>
-    <w:multiLevelType w:val="hybridMultilevel"/>
-    <w:tmpl w:val="D43ED67A"/>
-    <w:lvl w:ilvl="0" w:tplc="AD52C7C0">
-      <w:start w:val="1"/>
-      <w:numFmt w:val="decimal"/>
-      <w:lvlText w:val="%1."/>
-      <w:lvlJc w:val="left"/>
-      <w:pPr>
-        <w:ind w:left="440" w:hanging="360"/>
-      </w:pPr>
-    </w:lvl>
-    <w:lvl w:ilvl="1" w:tplc="BAC24496">
-      <w:numFmt w:val="decimal"/>
-      <w:lvlText w:val=""/>
-      <w:lvlJc w:val="left"/>
-    </w:lvl>
-    <w:lvl w:ilvl="2" w:tplc="C374DE5A">
-      <w:numFmt w:val="decimal"/>
-      <w:lvlText w:val=""/>
-      <w:lvlJc w:val="left"/>
-    </w:lvl>
-    <w:lvl w:ilvl="3" w:tplc="DB748C5E">
-      <w:numFmt w:val="decimal"/>
-      <w:lvlText w:val=""/>
-      <w:lvlJc w:val="left"/>
-    </w:lvl>
-    <w:lvl w:ilvl="4" w:tplc="81CCE3C0">
-      <w:numFmt w:val="decimal"/>
-      <w:lvlText w:val=""/>
-      <w:lvlJc w:val="left"/>
-    </w:lvl>
-    <w:lvl w:ilvl="5" w:tplc="0098205C">
-      <w:numFmt w:val="decimal"/>
-      <w:lvlText w:val=""/>
-      <w:lvlJc w:val="left"/>
-    </w:lvl>
-    <w:lvl w:ilvl="6" w:tplc="E01AE0E4">
-      <w:numFmt w:val="decimal"/>
-      <w:lvlText w:val=""/>
-      <w:lvlJc w:val="left"/>
-    </w:lvl>
-    <w:lvl w:ilvl="7" w:tplc="1BFCDAA4">
-      <w:numFmt w:val="decimal"/>
-      <w:lvlText w:val=""/>
-      <w:lvlJc w:val="left"/>
-    </w:lvl>
-    <w:lvl w:ilvl="8" w:tplc="5A444088">
+    <w:lvl w:ilvl="8" w:tplc="CD46B20A">
       <w:numFmt w:val="decimal"/>
       <w:lvlText w:val=""/>
       <w:lvlJc w:val="left"/>
     </w:lvl>
   </w:abstractNum>
   <w:abstractNum w:abstractNumId="12" w15:restartNumberingAfterBreak="0">
-    <w:nsid w:val="73560129"/>
+    <w:nsid w:val="749D6A1F"/>
     <w:multiLevelType w:val="hybridMultilevel"/>
-    <w:tmpl w:val="52E699E4"/>
-    <w:lvl w:ilvl="0" w:tplc="63C28C56">
+    <w:tmpl w:val="ED58D19A"/>
+    <w:lvl w:ilvl="0" w:tplc="AB44E296">
       <w:start w:val="1"/>
       <w:numFmt w:val="decimal"/>
       <w:lvlText w:val="%1."/>
@@ -18513,181 +18546,181 @@
         <w:ind w:left="440" w:hanging="360"/>
       </w:pPr>
     </w:lvl>
-    <w:lvl w:ilvl="1" w:tplc="61403CB6">
+    <w:lvl w:ilvl="1" w:tplc="2076C8EC">
       <w:numFmt w:val="decimal"/>
       <w:lvlText w:val=""/>
       <w:lvlJc w:val="left"/>
     </w:lvl>
-    <w:lvl w:ilvl="2" w:tplc="71149322">
+    <w:lvl w:ilvl="2" w:tplc="826857D0">
       <w:numFmt w:val="decimal"/>
       <w:lvlText w:val=""/>
       <w:lvlJc w:val="left"/>
     </w:lvl>
-    <w:lvl w:ilvl="3" w:tplc="091CC1B4">
+    <w:lvl w:ilvl="3" w:tplc="5AF49D7A">
       <w:numFmt w:val="decimal"/>
       <w:lvlText w:val=""/>
       <w:lvlJc w:val="left"/>
     </w:lvl>
-    <w:lvl w:ilvl="4" w:tplc="A832F1BE">
+    <w:lvl w:ilvl="4" w:tplc="CA76CB46">
       <w:numFmt w:val="decimal"/>
       <w:lvlText w:val=""/>
       <w:lvlJc w:val="left"/>
     </w:lvl>
-    <w:lvl w:ilvl="5" w:tplc="A9941C4E">
+    <w:lvl w:ilvl="5" w:tplc="F872F2F0">
       <w:numFmt w:val="decimal"/>
       <w:lvlText w:val=""/>
       <w:lvlJc w:val="left"/>
     </w:lvl>
-    <w:lvl w:ilvl="6" w:tplc="625AA7B6">
+    <w:lvl w:ilvl="6" w:tplc="9BACC37E">
       <w:numFmt w:val="decimal"/>
       <w:lvlText w:val=""/>
       <w:lvlJc w:val="left"/>
     </w:lvl>
-    <w:lvl w:ilvl="7" w:tplc="72E677C4">
+    <w:lvl w:ilvl="7" w:tplc="4906DB7C">
       <w:numFmt w:val="decimal"/>
       <w:lvlText w:val=""/>
       <w:lvlJc w:val="left"/>
     </w:lvl>
-    <w:lvl w:ilvl="8" w:tplc="2564F07A">
+    <w:lvl w:ilvl="8" w:tplc="C6F89AE4">
       <w:numFmt w:val="decimal"/>
       <w:lvlText w:val=""/>
       <w:lvlJc w:val="left"/>
     </w:lvl>
   </w:abstractNum>
   <w:abstractNum w:abstractNumId="13" w15:restartNumberingAfterBreak="0">
-    <w:nsid w:val="7B693C55"/>
+    <w:nsid w:val="7F2F713A"/>
     <w:multiLevelType w:val="hybridMultilevel"/>
-    <w:tmpl w:val="89922DE8"/>
-    <w:lvl w:ilvl="0" w:tplc="7420846A">
+    <w:tmpl w:val="3544B8EA"/>
+    <w:lvl w:ilvl="0" w:tplc="707CBC8C">
       <w:start w:val="1"/>
-      <w:numFmt w:val="decimal"/>
-      <w:lvlText w:val="%1."/>
+      <w:numFmt w:val="bullet"/>
+      <w:lvlText w:val="•"/>
       <w:lvlJc w:val="left"/>
       <w:pPr>
-        <w:ind w:left="440" w:hanging="360"/>
+        <w:ind w:left="440" w:hanging="280"/>
       </w:pPr>
     </w:lvl>
-    <w:lvl w:ilvl="1" w:tplc="3998F854">
+    <w:lvl w:ilvl="1" w:tplc="BA4812E0">
       <w:numFmt w:val="decimal"/>
       <w:lvlText w:val=""/>
       <w:lvlJc w:val="left"/>
     </w:lvl>
-    <w:lvl w:ilvl="2" w:tplc="450A0DAC">
+    <w:lvl w:ilvl="2" w:tplc="8B92CF4C">
       <w:numFmt w:val="decimal"/>
       <w:lvlText w:val=""/>
       <w:lvlJc w:val="left"/>
     </w:lvl>
-    <w:lvl w:ilvl="3" w:tplc="04D8322E">
+    <w:lvl w:ilvl="3" w:tplc="15A84496">
       <w:numFmt w:val="decimal"/>
       <w:lvlText w:val=""/>
       <w:lvlJc w:val="left"/>
     </w:lvl>
-    <w:lvl w:ilvl="4" w:tplc="846EF520">
+    <w:lvl w:ilvl="4" w:tplc="84C89042">
       <w:numFmt w:val="decimal"/>
       <w:lvlText w:val=""/>
       <w:lvlJc w:val="left"/>
     </w:lvl>
-    <w:lvl w:ilvl="5" w:tplc="641880C8">
+    <w:lvl w:ilvl="5" w:tplc="9DC61CDC">
       <w:numFmt w:val="decimal"/>
       <w:lvlText w:val=""/>
       <w:lvlJc w:val="left"/>
     </w:lvl>
-    <w:lvl w:ilvl="6" w:tplc="1BAE2148">
+    <w:lvl w:ilvl="6" w:tplc="A35A3B82">
       <w:numFmt w:val="decimal"/>
       <w:lvlText w:val=""/>
       <w:lvlJc w:val="left"/>
     </w:lvl>
-    <w:lvl w:ilvl="7" w:tplc="33ACDF56">
+    <w:lvl w:ilvl="7" w:tplc="569E4486">
       <w:numFmt w:val="decimal"/>
       <w:lvlText w:val=""/>
       <w:lvlJc w:val="left"/>
     </w:lvl>
-    <w:lvl w:ilvl="8" w:tplc="AB86CDBA">
+    <w:lvl w:ilvl="8" w:tplc="38F8EB58">
       <w:numFmt w:val="decimal"/>
       <w:lvlText w:val=""/>
       <w:lvlJc w:val="left"/>
     </w:lvl>
   </w:abstractNum>
-  <w:num w:numId="1" w16cid:durableId="1668710323">
-    <w:abstractNumId w:val="6"/>
+  <w:num w:numId="1" w16cid:durableId="486171462">
+    <w:abstractNumId w:val="10"/>
     <w:lvlOverride w:ilvl="0">
       <w:startOverride w:val="1"/>
     </w:lvlOverride>
   </w:num>
-  <w:num w:numId="2" w16cid:durableId="893009244">
+  <w:num w:numId="2" w16cid:durableId="1034232761">
+    <w:abstractNumId w:val="9"/>
+    <w:lvlOverride w:ilvl="0">
+      <w:startOverride w:val="1"/>
+    </w:lvlOverride>
+  </w:num>
+  <w:num w:numId="3" w16cid:durableId="540479217">
+    <w:abstractNumId w:val="13"/>
+    <w:lvlOverride w:ilvl="0">
+      <w:startOverride w:val="1"/>
+    </w:lvlOverride>
+  </w:num>
+  <w:num w:numId="4" w16cid:durableId="956792187">
+    <w:abstractNumId w:val="1"/>
+    <w:lvlOverride w:ilvl="0">
+      <w:startOverride w:val="1"/>
+    </w:lvlOverride>
+  </w:num>
+  <w:num w:numId="5" w16cid:durableId="1763256446">
+    <w:abstractNumId w:val="5"/>
+    <w:lvlOverride w:ilvl="0">
+      <w:startOverride w:val="1"/>
+    </w:lvlOverride>
+  </w:num>
+  <w:num w:numId="6" w16cid:durableId="1261568215">
+    <w:abstractNumId w:val="2"/>
+    <w:lvlOverride w:ilvl="0">
+      <w:startOverride w:val="1"/>
+    </w:lvlOverride>
+  </w:num>
+  <w:num w:numId="7" w16cid:durableId="908853723">
+    <w:abstractNumId w:val="7"/>
+    <w:lvlOverride w:ilvl="0">
+      <w:startOverride w:val="1"/>
+    </w:lvlOverride>
+  </w:num>
+  <w:num w:numId="8" w16cid:durableId="950208698">
+    <w:abstractNumId w:val="11"/>
+    <w:lvlOverride w:ilvl="0">
+      <w:startOverride w:val="1"/>
+    </w:lvlOverride>
+  </w:num>
+  <w:num w:numId="9" w16cid:durableId="418327644">
+    <w:abstractNumId w:val="8"/>
+    <w:lvlOverride w:ilvl="0">
+      <w:startOverride w:val="1"/>
+    </w:lvlOverride>
+  </w:num>
+  <w:num w:numId="10" w16cid:durableId="2120637747">
+    <w:abstractNumId w:val="3"/>
+    <w:lvlOverride w:ilvl="0">
+      <w:startOverride w:val="1"/>
+    </w:lvlOverride>
+  </w:num>
+  <w:num w:numId="11" w16cid:durableId="1804617467">
     <w:abstractNumId w:val="12"/>
     <w:lvlOverride w:ilvl="0">
       <w:startOverride w:val="1"/>
     </w:lvlOverride>
   </w:num>
-  <w:num w:numId="3" w16cid:durableId="912592904">
-    <w:abstractNumId w:val="8"/>
+  <w:num w:numId="12" w16cid:durableId="1802111188">
+    <w:abstractNumId w:val="0"/>
     <w:lvlOverride w:ilvl="0">
       <w:startOverride w:val="1"/>
     </w:lvlOverride>
   </w:num>
-  <w:num w:numId="4" w16cid:durableId="928805001">
-    <w:abstractNumId w:val="11"/>
-    <w:lvlOverride w:ilvl="0">
-      <w:startOverride w:val="1"/>
-    </w:lvlOverride>
-  </w:num>
-  <w:num w:numId="5" w16cid:durableId="1044139276">
-    <w:abstractNumId w:val="10"/>
-    <w:lvlOverride w:ilvl="0">
-      <w:startOverride w:val="1"/>
-    </w:lvlOverride>
-  </w:num>
-  <w:num w:numId="6" w16cid:durableId="1835146522">
-    <w:abstractNumId w:val="7"/>
-    <w:lvlOverride w:ilvl="0">
-      <w:startOverride w:val="1"/>
-    </w:lvlOverride>
-  </w:num>
-  <w:num w:numId="7" w16cid:durableId="1737705936">
-    <w:abstractNumId w:val="13"/>
-    <w:lvlOverride w:ilvl="0">
-      <w:startOverride w:val="1"/>
-    </w:lvlOverride>
-  </w:num>
-  <w:num w:numId="8" w16cid:durableId="581447332">
-    <w:abstractNumId w:val="9"/>
-    <w:lvlOverride w:ilvl="0">
-      <w:startOverride w:val="1"/>
-    </w:lvlOverride>
-  </w:num>
-  <w:num w:numId="9" w16cid:durableId="609581434">
-    <w:abstractNumId w:val="1"/>
-    <w:lvlOverride w:ilvl="0">
-      <w:startOverride w:val="1"/>
-    </w:lvlOverride>
-  </w:num>
-  <w:num w:numId="10" w16cid:durableId="599336036">
+  <w:num w:numId="13" w16cid:durableId="1085297266">
     <w:abstractNumId w:val="4"/>
     <w:lvlOverride w:ilvl="0">
       <w:startOverride w:val="1"/>
     </w:lvlOverride>
   </w:num>
-  <w:num w:numId="11" w16cid:durableId="83304337">
-    <w:abstractNumId w:val="2"/>
-    <w:lvlOverride w:ilvl="0">
-      <w:startOverride w:val="1"/>
-    </w:lvlOverride>
-  </w:num>
-  <w:num w:numId="12" w16cid:durableId="839004866">
-    <w:abstractNumId w:val="3"/>
-    <w:lvlOverride w:ilvl="0">
-      <w:startOverride w:val="1"/>
-    </w:lvlOverride>
-  </w:num>
-  <w:num w:numId="13" w16cid:durableId="1579166874">
-    <w:abstractNumId w:val="0"/>
-    <w:lvlOverride w:ilvl="0">
-      <w:startOverride w:val="1"/>
-    </w:lvlOverride>
-  </w:num>
-  <w:num w:numId="14" w16cid:durableId="1082531946">
-    <w:abstractNumId w:val="5"/>
+  <w:num w:numId="14" w16cid:durableId="1860243126">
+    <w:abstractNumId w:val="6"/>
     <w:lvlOverride w:ilvl="0">
       <w:startOverride w:val="1"/>
     </w:lvlOverride>

</xml_diff>